<commit_message>
rewriting some stuff about agency
</commit_message>
<xml_diff>
--- a/_manuscript/proposal-2026-03.docx
+++ b/_manuscript/proposal-2026-03.docx
@@ -30,7 +30,7 @@
         <w:t xml:space="preserve"> </w:t>
       </w:r>
       <w:r>
-        <w:t xml:space="preserve">[26]</w:t>
+        <w:t xml:space="preserve">(Miller et al. 2023)</w:t>
       </w:r>
       <w:r>
         <w:t xml:space="preserve">, we are promised that AI will solve climate change</w:t>
@@ -39,7 +39,7 @@
         <w:t xml:space="preserve"> </w:t>
       </w:r>
       <w:r>
-        <w:t xml:space="preserve">[37]</w:t>
+        <w:t xml:space="preserve">(Woodcock 2024)</w:t>
       </w:r>
       <w:r>
         <w:t xml:space="preserve"> </w:t>
@@ -63,7 +63,7 @@
         <w:t xml:space="preserve"> </w:t>
       </w:r>
       <w:r>
-        <w:t xml:space="preserve">[23]</w:t>
+        <w:t xml:space="preserve">(Lin et al. 2024)</w:t>
       </w:r>
       <w:r>
         <w:t xml:space="preserve">.</w:t>
@@ -120,7 +120,7 @@
         <w:t xml:space="preserve"> </w:t>
       </w:r>
       <w:r>
-        <w:t xml:space="preserve">[38]</w:t>
+        <w:t xml:space="preserve">(Yang et al. 2025)</w:t>
       </w:r>
       <w:r>
         <w:t xml:space="preserve">. Because it is so new rules, regulations or benchmarks are not yet in place and it is</w:t>
@@ -135,7 +135,7 @@
         <w:t xml:space="preserve"> </w:t>
       </w:r>
       <w:r>
-        <w:t xml:space="preserve">[18]</w:t>
+        <w:t xml:space="preserve">(Kapoor et al. 2024)</w:t>
       </w:r>
       <w:r>
         <w:t xml:space="preserve">. The advances made in AI are hoped to work towards a goal of Artifical General Intelligence (AGI), bringing</w:t>
@@ -150,7 +150,7 @@
         <w:t xml:space="preserve"> </w:t>
       </w:r>
       <w:r>
-        <w:t xml:space="preserve">[1]</w:t>
+        <w:t xml:space="preserve">(Blili-Hamelin et al. 2025)</w:t>
       </w:r>
       <w:r>
         <w:t xml:space="preserve">.</w:t>
@@ -173,7 +173,7 @@
         <w:t xml:space="preserve"> </w:t>
       </w:r>
       <w:r>
-        <w:t xml:space="preserve">[12]</w:t>
+        <w:t xml:space="preserve">(Eder and Sjøvaag 2025)</w:t>
       </w:r>
       <w:r>
         <w:t xml:space="preserve"> </w:t>
@@ -191,7 +191,7 @@
         <w:t xml:space="preserve"> </w:t>
       </w:r>
       <w:r>
-        <w:t xml:space="preserve">[5, 36]</w:t>
+        <w:t xml:space="preserve">(Van Haeften et al. 2024; Chrisinger 2019)</w:t>
       </w:r>
       <w:r>
         <w:t xml:space="preserve"> </w:t>
@@ -209,7 +209,7 @@
         <w:t xml:space="preserve"> </w:t>
       </w:r>
       <w:r>
-        <w:t xml:space="preserve">[10]</w:t>
+        <w:t xml:space="preserve">(du Toit 2025)</w:t>
       </w:r>
       <w:r>
         <w:t xml:space="preserve"> </w:t>
@@ -221,7 +221,7 @@
         <w:t xml:space="preserve"> </w:t>
       </w:r>
       <w:r>
-        <w:t xml:space="preserve">[4, 40]</w:t>
+        <w:t xml:space="preserve">(Chen 2025; Yu 2025)</w:t>
       </w:r>
       <w:r>
         <w:t xml:space="preserve">. If AI automates or replaces human labor instead of augmenting it, it creates the risk of concentrating wealth and power, the</w:t>
@@ -240,7 +240,7 @@
         <w:t xml:space="preserve"> </w:t>
       </w:r>
       <w:r>
-        <w:t xml:space="preserve">[2]</w:t>
+        <w:t xml:space="preserve">(Brynjolfsson 2022)</w:t>
       </w:r>
       <w:r>
         <w:t xml:space="preserve">.</w:t>
@@ -257,7 +257,7 @@
         <w:t xml:space="preserve"> </w:t>
       </w:r>
       <w:r>
-        <w:t xml:space="preserve">[6]</w:t>
+        <w:t xml:space="preserve">(Crawford 2021, 49)</w:t>
       </w:r>
       <w:r>
         <w:t xml:space="preserve">, the security issues of models with jailbreak attempts</w:t>
@@ -266,13 +266,13 @@
         <w:t xml:space="preserve"> </w:t>
       </w:r>
       <w:r>
-        <w:t xml:space="preserve">[3]</w:t>
+        <w:t xml:space="preserve">Carlini et al. (2021)</w:t>
       </w:r>
       <w:r>
         <w:t xml:space="preserve">, nudging political preferences</w:t>
       </w:r>
       <w:r>
-        <w:t xml:space="preserve">[7]</w:t>
+        <w:t xml:space="preserve">(Cupać, Schopmans, and Tuncer-Ebetürk 2024)</w:t>
       </w:r>
       <w:r>
         <w:t xml:space="preserve">, reducing the quality of democracy decision-making and the erosion of trust in legitimate institutions</w:t>
@@ -281,7 +281,7 @@
         <w:t xml:space="preserve"> </w:t>
       </w:r>
       <w:r>
-        <w:t xml:space="preserve">[25]</w:t>
+        <w:t xml:space="preserve">(Miklian and Hoelscher, n.d.)</w:t>
       </w:r>
       <w:r>
         <w:t xml:space="preserve">.</w:t>
@@ -298,7 +298,7 @@
         <w:t xml:space="preserve"> </w:t>
       </w:r>
       <w:r>
-        <w:t xml:space="preserve">[8]</w:t>
+        <w:t xml:space="preserve">(Dai 2025)</w:t>
       </w:r>
       <w:r>
         <w:t xml:space="preserve">. How then do we avoid the Turing Trap, and increase agency for (young) humans instead of infringing upon it?</w:t>
@@ -325,7 +325,7 @@
         <w:t xml:space="preserve"> </w:t>
       </w:r>
       <w:r>
-        <w:t xml:space="preserve">[11, 39]</w:t>
+        <w:t xml:space="preserve">(Du, Yang, and Welleck 2025; Yao et al. 2025)</w:t>
       </w:r>
       <w:r>
         <w:t xml:space="preserve">, improved productivity in writing code</w:t>
@@ -334,7 +334,7 @@
         <w:t xml:space="preserve"> </w:t>
       </w:r>
       <w:r>
-        <w:t xml:space="preserve">[20]</w:t>
+        <w:t xml:space="preserve">(Kumar et al. 2025)</w:t>
       </w:r>
       <w:r>
         <w:t xml:space="preserve">, effects on policy</w:t>
@@ -343,7 +343,7 @@
         <w:t xml:space="preserve"> </w:t>
       </w:r>
       <w:r>
-        <w:t xml:space="preserve">[19, 21]</w:t>
+        <w:t xml:space="preserve">(Khanal, Zhang, and Taeihagh 2025; Leslie and Perini 2024)</w:t>
       </w:r>
       <w:r>
         <w:t xml:space="preserve">, impact on education</w:t>
@@ -352,7 +352,7 @@
         <w:t xml:space="preserve"> </w:t>
       </w:r>
       <w:r>
-        <w:t xml:space="preserve">[8, 14, 35]</w:t>
+        <w:t xml:space="preserve">(Dai 2025; Han, Peng, and Liu 2025; Udeh 2025)</w:t>
       </w:r>
       <w:r>
         <w:t xml:space="preserve"> </w:t>
@@ -364,7 +364,7 @@
         <w:t xml:space="preserve"> </w:t>
       </w:r>
       <w:r>
-        <w:t xml:space="preserve">[16]</w:t>
+        <w:t xml:space="preserve">(Hou et al. 2025)</w:t>
       </w:r>
       <w:r>
         <w:t xml:space="preserve">, and how it can improve self-advocacy</w:t>
@@ -373,7 +373,7 @@
         <w:t xml:space="preserve"> </w:t>
       </w:r>
       <w:r>
-        <w:t xml:space="preserve">[33]</w:t>
+        <w:t xml:space="preserve">(Register and Ko 2020)</w:t>
       </w:r>
       <w:r>
         <w:t xml:space="preserve">.</w:t>
@@ -390,7 +390,7 @@
         <w:t xml:space="preserve"> </w:t>
       </w:r>
       <w:r>
-        <w:t xml:space="preserve">[32, 34]</w:t>
+        <w:t xml:space="preserve">(Prados de la Escosura 2022; Sen 1999)</w:t>
       </w:r>
       <w:r>
         <w:t xml:space="preserve">. Agentic AI and AI goals in general, largely seem to focus on increasing abilities for models or replacing tedious tasks performed by humans. While research has been done about future projections of human agency in decision making</w:t>
@@ -399,7 +399,7 @@
         <w:t xml:space="preserve"> </w:t>
       </w:r>
       <w:r>
-        <w:t xml:space="preserve">[30]</w:t>
+        <w:t xml:space="preserve">(Pew Research Center, Anderson, and Rainie 2023)</w:t>
       </w:r>
       <w:r>
         <w:t xml:space="preserve"> </w:t>
@@ -411,7 +411,7 @@
         <w:t xml:space="preserve"> </w:t>
       </w:r>
       <w:r>
-        <w:t xml:space="preserve">[28]</w:t>
+        <w:t xml:space="preserve">(Mouta, Pinto-Llorente, and Torrecilla-Sánchez 2025)</w:t>
       </w:r>
       <w:r>
         <w:t xml:space="preserve"> </w:t>
@@ -431,7 +431,7 @@
         <w:t xml:space="preserve"> </w:t>
       </w:r>
       <w:r>
-        <w:t xml:space="preserve">[31]</w:t>
+        <w:t xml:space="preserve">(Pinski and Benlian 2024)</w:t>
       </w:r>
       <w:r>
         <w:t xml:space="preserve"> </w:t>
@@ -443,7 +443,7 @@
         <w:t xml:space="preserve"> </w:t>
       </w:r>
       <w:r>
-        <w:t xml:space="preserve">[9]</w:t>
+        <w:t xml:space="preserve">(Druga and Ko 2021)</w:t>
       </w:r>
       <w:r>
         <w:t xml:space="preserve"> </w:t>
@@ -455,7 +455,7 @@
         <w:t xml:space="preserve"> </w:t>
       </w:r>
       <w:r>
-        <w:t xml:space="preserve">[13]</w:t>
+        <w:t xml:space="preserve">(Guest et al. 2025)</w:t>
       </w:r>
       <w:r>
         <w:t xml:space="preserve">.</w:t>
@@ -506,7 +506,7 @@
         <w:t xml:space="preserve"> </w:t>
       </w:r>
       <w:r>
-        <w:t xml:space="preserve">[24]</w:t>
+        <w:t xml:space="preserve">(Mathur, n.d.)</w:t>
       </w:r>
     </w:p>
     <w:p>
@@ -520,7 +520,7 @@
         <w:t xml:space="preserve"> </w:t>
       </w:r>
       <w:r>
-        <w:t xml:space="preserve">[15, 27]</w:t>
+        <w:t xml:space="preserve">(Morrow 2014; Heyndels 2023)</w:t>
       </w:r>
       <w:r>
         <w:t xml:space="preserve">. Regulation and policy fueled by ideology (both benefiting the few or the many) has been the driver for the direction this advancement would take us</w:t>
@@ -529,7 +529,7 @@
         <w:t xml:space="preserve"> </w:t>
       </w:r>
       <w:r>
-        <w:t xml:space="preserve">[17]</w:t>
+        <w:t xml:space="preserve">(Johnson and Acemoglu 2023, 57)</w:t>
       </w:r>
       <w:r>
         <w:t xml:space="preserve">.</w:t>
@@ -636,7 +636,7 @@
     </w:p>
     <w:bookmarkEnd w:id="23"/>
     <w:bookmarkEnd w:id="24"/>
-    <w:bookmarkStart w:id="101" w:name="references"/>
+    <w:bookmarkStart w:id="95" w:name="references"/>
     <w:p>
       <w:pPr>
         <w:pStyle w:val="Heading2"/>
@@ -645,41 +645,38 @@
         <w:t xml:space="preserve">References</w:t>
       </w:r>
     </w:p>
-    <w:bookmarkStart w:id="100" w:name="refs"/>
+    <w:bookmarkStart w:id="94" w:name="refs"/>
     <w:bookmarkStart w:id="26" w:name="ref-blili-hamelinStopTreatingAGI2025"/>
     <w:p>
       <w:pPr>
         <w:pStyle w:val="Bibliography"/>
       </w:pPr>
       <w:r>
-        <w:t xml:space="preserve">1.</w:t>
-      </w:r>
-      <w:r>
-        <w:t xml:space="preserve"> </w:t>
-      </w:r>
-      <w:r>
-        <w:t xml:space="preserve">	</w:t>
-      </w:r>
-      <w:r>
-        <w:t xml:space="preserve">Blili-Hamelin, B. et al.: Stop treating</w:t>
-      </w:r>
-      <w:r>
-        <w:t xml:space="preserve"> </w:t>
-      </w:r>
-      <w:r>
-        <w:t xml:space="preserve">“</w:t>
+        <w:t xml:space="preserve">Blili-Hamelin, Borhane, Christopher Graziul, Leif Hancox-Li, Hananel Hazan, El-Mahdi El-Mhamdi, Avijit Ghosh, Katherine Heller, et al. 2025.</w:t>
+      </w:r>
+      <w:r>
+        <w:t xml:space="preserve"> </w:t>
+      </w:r>
+      <w:r>
+        <w:t xml:space="preserve">“Stop Treating</w:t>
+      </w:r>
+      <w:r>
+        <w:t xml:space="preserve"> </w:t>
+      </w:r>
+      <w:r>
+        <w:t xml:space="preserve">‘</w:t>
       </w:r>
       <w:r>
         <w:t xml:space="preserve">AGI</w:t>
       </w:r>
       <w:r>
-        <w:t xml:space="preserve">”</w:t>
-      </w:r>
-      <w:r>
-        <w:t xml:space="preserve"> </w:t>
-      </w:r>
-      <w:r>
-        <w:t xml:space="preserve">as the north-star goal of</w:t>
+        <w:t xml:space="preserve">’</w:t>
+      </w:r>
+      <w:r>
+        <w:t xml:space="preserve"> </w:t>
+      </w:r>
+      <w:r>
+        <w:t xml:space="preserve">as the North-Star Goal of</w:t>
       </w:r>
       <w:r>
         <w:t xml:space="preserve"> </w:t>
@@ -691,14 +688,23 @@
         <w:t xml:space="preserve"> </w:t>
       </w:r>
       <w:r>
-        <w:t xml:space="preserve">research, (2025). https://doi.org/</w:t>
+        <w:t xml:space="preserve">Research.”</w:t>
+      </w:r>
+      <w:r>
+        <w:t xml:space="preserve"> </w:t>
+      </w:r>
+      <w:r>
+        <w:t xml:space="preserve">arXiv.</w:t>
+      </w:r>
+      <w:r>
+        <w:t xml:space="preserve"> </w:t>
       </w:r>
       <w:hyperlink r:id="rId25">
         <w:r>
           <w:rPr>
             <w:rStyle w:val="Hyperlink"/>
           </w:rPr>
-          <w:t xml:space="preserve">10.48550/ARXIV.2502.03689</w:t>
+          <w:t xml:space="preserve">https://doi.org/10.48550/ARXIV.2502.03689</w:t>
         </w:r>
       </w:hyperlink>
       <w:r>
@@ -712,16 +718,13 @@
         <w:pStyle w:val="Bibliography"/>
       </w:pPr>
       <w:r>
-        <w:t xml:space="preserve">2.</w:t>
-      </w:r>
-      <w:r>
-        <w:t xml:space="preserve"> </w:t>
-      </w:r>
-      <w:r>
-        <w:t xml:space="preserve">	</w:t>
-      </w:r>
-      <w:r>
-        <w:t xml:space="preserve">Brynjolfsson, E.: The</w:t>
+        <w:t xml:space="preserve">Brynjolfsson, Erik. 2022.</w:t>
+      </w:r>
+      <w:r>
+        <w:t xml:space="preserve"> </w:t>
+      </w:r>
+      <w:r>
+        <w:t xml:space="preserve">“The</w:t>
       </w:r>
       <w:r>
         <w:t xml:space="preserve"> </w:t>
@@ -763,14 +766,33 @@
         <w:t xml:space="preserve">Human-Like Artificial Intelligence</w:t>
       </w:r>
       <w:r>
-        <w:t xml:space="preserve">. Daedalus. 151, 2, 272–287 (2022). https://doi.org/</w:t>
+        <w:t xml:space="preserve">.”</w:t>
+      </w:r>
+      <w:r>
+        <w:t xml:space="preserve"> </w:t>
+      </w:r>
+      <w:r>
+        <w:rPr>
+          <w:i/>
+          <w:iCs/>
+        </w:rPr>
+        <w:t xml:space="preserve">Daedalus</w:t>
+      </w:r>
+      <w:r>
+        <w:t xml:space="preserve"> </w:t>
+      </w:r>
+      <w:r>
+        <w:t xml:space="preserve">151 (2): 272–87.</w:t>
+      </w:r>
+      <w:r>
+        <w:t xml:space="preserve"> </w:t>
       </w:r>
       <w:hyperlink r:id="rId27">
         <w:r>
           <w:rPr>
             <w:rStyle w:val="Hyperlink"/>
           </w:rPr>
-          <w:t xml:space="preserve">10.1162/daed_a_01915</w:t>
+          <w:t xml:space="preserve">https://doi.org/10.1162/daed_a_01915</w:t>
         </w:r>
       </w:hyperlink>
       <w:r>
@@ -778,22 +800,19 @@
       </w:r>
     </w:p>
     <w:bookmarkEnd w:id="28"/>
-    <w:bookmarkStart w:id="31" w:name="ref-carliniExtractingTrainingData2021"/>
+    <w:bookmarkStart w:id="30" w:name="ref-carliniExtractingTrainingData2021"/>
     <w:p>
       <w:pPr>
         <w:pStyle w:val="Bibliography"/>
       </w:pPr>
       <w:r>
-        <w:t xml:space="preserve">3.</w:t>
-      </w:r>
-      <w:r>
-        <w:t xml:space="preserve"> </w:t>
-      </w:r>
-      <w:r>
-        <w:t xml:space="preserve">	</w:t>
-      </w:r>
-      <w:r>
-        <w:t xml:space="preserve">Carlini, N. et al.: Extracting</w:t>
+        <w:t xml:space="preserve">Carlini, Nicholas, Florian Tramer, Eric Wallace, Matthew Jagielski, Ariel Herbert-Voss, Katherine Lee, Adam Roberts, et al. 2021.</w:t>
+      </w:r>
+      <w:r>
+        <w:t xml:space="preserve"> </w:t>
+      </w:r>
+      <w:r>
+        <w:t xml:space="preserve">“Extracting</w:t>
       </w:r>
       <w:r>
         <w:t xml:space="preserve"> </w:t>
@@ -814,7 +833,13 @@
         <w:t xml:space="preserve">Large Language Models</w:t>
       </w:r>
       <w:r>
-        <w:t xml:space="preserve">,</w:t>
+        <w:t xml:space="preserve">.”</w:t>
+      </w:r>
+      <w:r>
+        <w:t xml:space="preserve"> </w:t>
+      </w:r>
+      <w:r>
+        <w:t xml:space="preserve">arXiv.</w:t>
       </w:r>
       <w:r>
         <w:t xml:space="preserve"> </w:t>
@@ -824,102 +849,228 @@
           <w:rPr>
             <w:rStyle w:val="Hyperlink"/>
           </w:rPr>
-          <w:t xml:space="preserve">https://arxiv.org/abs/2012.07805</w:t>
+          <w:t xml:space="preserve">https://doi.org/10.48550/arXiv.2012.07805</w:t>
         </w:r>
       </w:hyperlink>
       <w:r>
-        <w:t xml:space="preserve">, (2021). https://doi.org/</w:t>
-      </w:r>
-      <w:hyperlink r:id="rId30">
+        <w:t xml:space="preserve">.</w:t>
+      </w:r>
+    </w:p>
+    <w:bookmarkEnd w:id="30"/>
+    <w:bookmarkStart w:id="31" w:name="ref-chen2025exploring"/>
+    <w:p>
+      <w:pPr>
+        <w:pStyle w:val="Bibliography"/>
+      </w:pPr>
+      <w:r>
+        <w:t xml:space="preserve">Chen, Yu Hsin. 2025.</w:t>
+      </w:r>
+      <w:r>
+        <w:t xml:space="preserve"> </w:t>
+      </w:r>
+      <w:r>
+        <w:t xml:space="preserve">“Exploring the Influence of Generative Artificial Intelligence Anxiety on Problematic</w:t>
+      </w:r>
+      <w:r>
+        <w:t xml:space="preserve"> </w:t>
+      </w:r>
+      <w:r>
+        <w:t xml:space="preserve">ChatGPT</w:t>
+      </w:r>
+      <w:r>
+        <w:t xml:space="preserve"> </w:t>
+      </w:r>
+      <w:r>
+        <w:t xml:space="preserve">Use: The Fear of Missing Out and Personality Traits.”</w:t>
+      </w:r>
+      <w:r>
+        <w:t xml:space="preserve"> </w:t>
+      </w:r>
+      <w:r>
+        <w:rPr>
+          <w:i/>
+          <w:iCs/>
+        </w:rPr>
+        <w:t xml:space="preserve">Universal Access in the Information Society</w:t>
+      </w:r>
+      <w:r>
+        <w:t xml:space="preserve"> </w:t>
+      </w:r>
+      <w:r>
+        <w:t xml:space="preserve">24 (3): 2477–90.</w:t>
+      </w:r>
+    </w:p>
+    <w:bookmarkEnd w:id="31"/>
+    <w:bookmarkStart w:id="33" w:name="ref-chrisingerSolutionLiesEducation2019"/>
+    <w:p>
+      <w:pPr>
+        <w:pStyle w:val="Bibliography"/>
+      </w:pPr>
+      <w:r>
+        <w:t xml:space="preserve">Chrisinger, David. 2019.</w:t>
+      </w:r>
+      <w:r>
+        <w:t xml:space="preserve"> </w:t>
+      </w:r>
+      <w:r>
+        <w:t xml:space="preserve">“The Solution Lies in Education: Artificial Intelligence &amp; the Skills Gap.”</w:t>
+      </w:r>
+      <w:r>
+        <w:t xml:space="preserve"> </w:t>
+      </w:r>
+      <w:r>
+        <w:rPr>
+          <w:i/>
+          <w:iCs/>
+        </w:rPr>
+        <w:t xml:space="preserve">On the Horizon: The International Journal of Learning Futures</w:t>
+      </w:r>
+      <w:r>
+        <w:t xml:space="preserve"> </w:t>
+      </w:r>
+      <w:r>
+        <w:t xml:space="preserve">27 (1): 1–4.</w:t>
+      </w:r>
+      <w:r>
+        <w:t xml:space="preserve"> </w:t>
+      </w:r>
+      <w:hyperlink r:id="rId32">
         <w:r>
           <w:rPr>
             <w:rStyle w:val="Hyperlink"/>
           </w:rPr>
-          <w:t xml:space="preserve">10.48550/arXiv.2012.07805</w:t>
+          <w:t xml:space="preserve">https://doi.org/10.1108/OTH-03-2019-096</w:t>
         </w:r>
       </w:hyperlink>
       <w:r>
         <w:t xml:space="preserve">.</w:t>
       </w:r>
     </w:p>
-    <w:bookmarkEnd w:id="31"/>
-    <w:bookmarkStart w:id="32" w:name="ref-chen2025exploring"/>
+    <w:bookmarkEnd w:id="33"/>
+    <w:bookmarkStart w:id="34" w:name="ref-crawford2021atlas"/>
     <w:p>
       <w:pPr>
         <w:pStyle w:val="Bibliography"/>
       </w:pPr>
       <w:r>
-        <w:t xml:space="preserve">4.</w:t>
-      </w:r>
-      <w:r>
-        <w:t xml:space="preserve"> </w:t>
-      </w:r>
-      <w:r>
-        <w:t xml:space="preserve">	</w:t>
-      </w:r>
-      <w:r>
-        <w:t xml:space="preserve">Chen, Y.H.: Exploring the influence of generative artificial intelligence anxiety on problematic</w:t>
-      </w:r>
-      <w:r>
-        <w:t xml:space="preserve"> </w:t>
-      </w:r>
-      <w:r>
-        <w:t xml:space="preserve">ChatGPT</w:t>
-      </w:r>
-      <w:r>
-        <w:t xml:space="preserve"> </w:t>
-      </w:r>
-      <w:r>
-        <w:t xml:space="preserve">use: The fear of missing out and personality traits. Universal Access in the Information Society. 24, 3, 2477–2490 (2025).</w:t>
-      </w:r>
-    </w:p>
-    <w:bookmarkEnd w:id="32"/>
-    <w:bookmarkStart w:id="34" w:name="ref-chrisingerSolutionLiesEducation2019"/>
+        <w:t xml:space="preserve">Crawford, Kate. 2021.</w:t>
+      </w:r>
+      <w:r>
+        <w:t xml:space="preserve"> </w:t>
+      </w:r>
+      <w:r>
+        <w:rPr>
+          <w:i/>
+          <w:iCs/>
+        </w:rPr>
+        <w:t xml:space="preserve">The Atlas of</w:t>
+      </w:r>
+      <w:r>
+        <w:rPr>
+          <w:i/>
+          <w:iCs/>
+        </w:rPr>
+        <w:t xml:space="preserve"> </w:t>
+      </w:r>
+      <w:r>
+        <w:rPr>
+          <w:i/>
+          <w:iCs/>
+        </w:rPr>
+        <w:t xml:space="preserve">AI</w:t>
+      </w:r>
+      <w:r>
+        <w:rPr>
+          <w:i/>
+          <w:iCs/>
+        </w:rPr>
+        <w:t xml:space="preserve">:</w:t>
+      </w:r>
+      <w:r>
+        <w:rPr>
+          <w:i/>
+          <w:iCs/>
+        </w:rPr>
+        <w:t xml:space="preserve"> </w:t>
+      </w:r>
+      <w:r>
+        <w:rPr>
+          <w:i/>
+          <w:iCs/>
+        </w:rPr>
+        <w:t xml:space="preserve">Power</w:t>
+      </w:r>
+      <w:r>
+        <w:rPr>
+          <w:i/>
+          <w:iCs/>
+        </w:rPr>
+        <w:t xml:space="preserve">, Politics, and the Planetary Costs of Artificial Intelligence</w:t>
+      </w:r>
+      <w:r>
+        <w:t xml:space="preserve">. Yale University Press.</w:t>
+      </w:r>
+    </w:p>
+    <w:bookmarkEnd w:id="34"/>
+    <w:bookmarkStart w:id="36" w:name="X11753044df99c9f5661779529477c53c9dc0658"/>
     <w:p>
       <w:pPr>
         <w:pStyle w:val="Bibliography"/>
       </w:pPr>
       <w:r>
-        <w:t xml:space="preserve">5.</w:t>
-      </w:r>
-      <w:r>
-        <w:t xml:space="preserve"> </w:t>
-      </w:r>
-      <w:r>
-        <w:t xml:space="preserve">	</w:t>
-      </w:r>
-      <w:r>
-        <w:t xml:space="preserve">Chrisinger, D.: The solution lies in education: Artificial intelligence &amp; the skills gap. On the Horizon: The International Journal of Learning Futures. 27, 1, 1–4 (2019). https://doi.org/</w:t>
-      </w:r>
-      <w:hyperlink r:id="rId33">
+        <w:t xml:space="preserve">Cupać, Jelena, Hendrik Schopmans, and İrem Tuncer-Ebetürk. 2024.</w:t>
+      </w:r>
+      <w:r>
+        <w:t xml:space="preserve"> </w:t>
+      </w:r>
+      <w:r>
+        <w:t xml:space="preserve">“Democratization in the Age of Artificial Intelligence: Introduction to the Special Issue.”</w:t>
+      </w:r>
+      <w:r>
+        <w:t xml:space="preserve"> </w:t>
+      </w:r>
+      <w:r>
+        <w:rPr>
+          <w:i/>
+          <w:iCs/>
+        </w:rPr>
+        <w:t xml:space="preserve">Democratization</w:t>
+      </w:r>
+      <w:r>
+        <w:t xml:space="preserve"> </w:t>
+      </w:r>
+      <w:r>
+        <w:t xml:space="preserve">31 (5): 899–921.</w:t>
+      </w:r>
+      <w:r>
+        <w:t xml:space="preserve"> </w:t>
+      </w:r>
+      <w:hyperlink r:id="rId35">
         <w:r>
           <w:rPr>
             <w:rStyle w:val="Hyperlink"/>
           </w:rPr>
-          <w:t xml:space="preserve">10.1108/OTH-03-2019-096</w:t>
+          <w:t xml:space="preserve">https://doi.org/10.1080/13510347.2024.2338852</w:t>
         </w:r>
       </w:hyperlink>
       <w:r>
         <w:t xml:space="preserve">.</w:t>
       </w:r>
     </w:p>
-    <w:bookmarkEnd w:id="34"/>
-    <w:bookmarkStart w:id="35" w:name="ref-crawford2021atlas"/>
+    <w:bookmarkEnd w:id="36"/>
+    <w:bookmarkStart w:id="38" w:name="ref-daiWhyStudentsUse2025"/>
     <w:p>
       <w:pPr>
         <w:pStyle w:val="Bibliography"/>
       </w:pPr>
       <w:r>
-        <w:t xml:space="preserve">6.</w:t>
-      </w:r>
-      <w:r>
-        <w:t xml:space="preserve"> </w:t>
-      </w:r>
-      <w:r>
-        <w:t xml:space="preserve">	</w:t>
-      </w:r>
-      <w:r>
-        <w:t xml:space="preserve">Crawford, K.: The atlas of</w:t>
+        <w:t xml:space="preserve">Dai, Yun. 2025.</w:t>
+      </w:r>
+      <w:r>
+        <w:t xml:space="preserve"> </w:t>
+      </w:r>
+      <w:r>
+        <w:t xml:space="preserve">“Why Students Use or Not Use Generative</w:t>
       </w:r>
       <w:r>
         <w:t xml:space="preserve"> </w:t>
@@ -934,234 +1085,298 @@
         <w:t xml:space="preserve"> </w:t>
       </w:r>
       <w:r>
-        <w:t xml:space="preserve">Power</w:t>
-      </w:r>
-      <w:r>
-        <w:t xml:space="preserve">, politics, and the planetary costs of artificial intelligence. Yale University Press (2021).</w:t>
-      </w:r>
-    </w:p>
-    <w:bookmarkEnd w:id="35"/>
-    <w:bookmarkStart w:id="37" w:name="X11753044df99c9f5661779529477c53c9dc0658"/>
-    <w:p>
-      <w:pPr>
-        <w:pStyle w:val="Bibliography"/>
-      </w:pPr>
-      <w:r>
-        <w:t xml:space="preserve">7.</w:t>
-      </w:r>
-      <w:r>
-        <w:t xml:space="preserve"> </w:t>
-      </w:r>
-      <w:r>
-        <w:t xml:space="preserve">	</w:t>
-      </w:r>
-      <w:r>
-        <w:t xml:space="preserve">Cupać, J. et al.: Democratization in the age of artificial intelligence: Introduction to the special issue. Democratization. 31, 5, 899–921 (2024). https://doi.org/</w:t>
-      </w:r>
-      <w:hyperlink r:id="rId36">
+        <w:t xml:space="preserve">Student</w:t>
+      </w:r>
+      <w:r>
+        <w:t xml:space="preserve"> </w:t>
+      </w:r>
+      <w:r>
+        <w:t xml:space="preserve">Conceptions, Concerns, and Implications for Engineering Education.”</w:t>
+      </w:r>
+      <w:r>
+        <w:t xml:space="preserve"> </w:t>
+      </w:r>
+      <w:r>
+        <w:rPr>
+          <w:i/>
+          <w:iCs/>
+        </w:rPr>
+        <w:t xml:space="preserve">Digital Engineering</w:t>
+      </w:r>
+      <w:r>
+        <w:t xml:space="preserve"> </w:t>
+      </w:r>
+      <w:r>
+        <w:t xml:space="preserve">4 (March): 100019.</w:t>
+      </w:r>
+      <w:r>
+        <w:t xml:space="preserve"> </w:t>
+      </w:r>
+      <w:hyperlink r:id="rId37">
         <w:r>
           <w:rPr>
             <w:rStyle w:val="Hyperlink"/>
           </w:rPr>
-          <w:t xml:space="preserve">10.1080/13510347.2024.2338852</w:t>
+          <w:t xml:space="preserve">https://doi.org/10.1016/j.dte.2024.100019</w:t>
         </w:r>
       </w:hyperlink>
       <w:r>
         <w:t xml:space="preserve">.</w:t>
       </w:r>
     </w:p>
-    <w:bookmarkEnd w:id="37"/>
-    <w:bookmarkStart w:id="39" w:name="ref-daiWhyStudentsUse2025"/>
+    <w:bookmarkEnd w:id="38"/>
+    <w:bookmarkStart w:id="40" w:name="ref-drugaHowChildrensPerceptions2021"/>
     <w:p>
       <w:pPr>
         <w:pStyle w:val="Bibliography"/>
       </w:pPr>
       <w:r>
-        <w:t xml:space="preserve">8.</w:t>
-      </w:r>
-      <w:r>
-        <w:t xml:space="preserve"> </w:t>
-      </w:r>
-      <w:r>
-        <w:t xml:space="preserve">	</w:t>
-      </w:r>
-      <w:r>
-        <w:t xml:space="preserve">Dai, Y.: Why students use or not use generative</w:t>
-      </w:r>
-      <w:r>
-        <w:t xml:space="preserve"> </w:t>
-      </w:r>
-      <w:r>
-        <w:t xml:space="preserve">AI</w:t>
-      </w:r>
-      <w:r>
-        <w:t xml:space="preserve">:</w:t>
-      </w:r>
-      <w:r>
-        <w:t xml:space="preserve"> </w:t>
-      </w:r>
-      <w:r>
-        <w:t xml:space="preserve">Student</w:t>
-      </w:r>
-      <w:r>
-        <w:t xml:space="preserve"> </w:t>
-      </w:r>
-      <w:r>
-        <w:t xml:space="preserve">conceptions, concerns, and implications for engineering education. Digital Engineering. 4, 100019 (2025). https://doi.org/</w:t>
-      </w:r>
-      <w:hyperlink r:id="rId38">
+        <w:t xml:space="preserve">Druga, Stefania, and Amy J Ko. 2021.</w:t>
+      </w:r>
+      <w:r>
+        <w:t xml:space="preserve"> </w:t>
+      </w:r>
+      <w:r>
+        <w:t xml:space="preserve">“How Do Children’s Perceptions of Machine Intelligence Change When Training and Coding Smart Programs?”</w:t>
+      </w:r>
+      <w:r>
+        <w:t xml:space="preserve"> In</w:t>
+      </w:r>
+      <w:r>
+        <w:t xml:space="preserve"> </w:t>
+      </w:r>
+      <w:r>
+        <w:rPr>
+          <w:i/>
+          <w:iCs/>
+        </w:rPr>
+        <w:t xml:space="preserve">Interaction</w:t>
+      </w:r>
+      <w:r>
+        <w:rPr>
+          <w:i/>
+          <w:iCs/>
+        </w:rPr>
+        <w:t xml:space="preserve"> </w:t>
+      </w:r>
+      <w:r>
+        <w:rPr>
+          <w:i/>
+          <w:iCs/>
+        </w:rPr>
+        <w:t xml:space="preserve">Design</w:t>
+      </w:r>
+      <w:r>
+        <w:rPr>
+          <w:i/>
+          <w:iCs/>
+        </w:rPr>
+        <w:t xml:space="preserve"> </w:t>
+      </w:r>
+      <w:r>
+        <w:rPr>
+          <w:i/>
+          <w:iCs/>
+        </w:rPr>
+        <w:t xml:space="preserve">and</w:t>
+      </w:r>
+      <w:r>
+        <w:rPr>
+          <w:i/>
+          <w:iCs/>
+        </w:rPr>
+        <w:t xml:space="preserve"> </w:t>
+      </w:r>
+      <w:r>
+        <w:rPr>
+          <w:i/>
+          <w:iCs/>
+        </w:rPr>
+        <w:t xml:space="preserve">Children</w:t>
+      </w:r>
+      <w:r>
+        <w:t xml:space="preserve">, 49–61. Athens Greece: ACM.</w:t>
+      </w:r>
+      <w:r>
+        <w:t xml:space="preserve"> </w:t>
+      </w:r>
+      <w:hyperlink r:id="rId39">
         <w:r>
           <w:rPr>
             <w:rStyle w:val="Hyperlink"/>
           </w:rPr>
-          <w:t xml:space="preserve">10.1016/j.dte.2024.100019</w:t>
+          <w:t xml:space="preserve">https://doi.org/10.1145/3459990.3460712</w:t>
         </w:r>
       </w:hyperlink>
       <w:r>
         <w:t xml:space="preserve">.</w:t>
       </w:r>
     </w:p>
-    <w:bookmarkEnd w:id="39"/>
-    <w:bookmarkStart w:id="41" w:name="ref-drugaHowChildrensPerceptions2021"/>
+    <w:bookmarkEnd w:id="40"/>
+    <w:bookmarkStart w:id="41" w:name="ref-du2025you"/>
     <w:p>
       <w:pPr>
         <w:pStyle w:val="Bibliography"/>
       </w:pPr>
       <w:r>
-        <w:t xml:space="preserve">9.</w:t>
-      </w:r>
-      <w:r>
-        <w:t xml:space="preserve"> </w:t>
-      </w:r>
-      <w:r>
-        <w:t xml:space="preserve">	</w:t>
-      </w:r>
-      <w:r>
-        <w:t xml:space="preserve">Druga, S., Ko, A.J.: How do children’s perceptions of machine intelligence change when training and coding smart programs? In: Interaction</w:t>
-      </w:r>
-      <w:r>
-        <w:t xml:space="preserve"> </w:t>
-      </w:r>
-      <w:r>
-        <w:t xml:space="preserve">Design</w:t>
-      </w:r>
-      <w:r>
-        <w:t xml:space="preserve"> </w:t>
-      </w:r>
-      <w:r>
-        <w:t xml:space="preserve">and</w:t>
-      </w:r>
-      <w:r>
-        <w:t xml:space="preserve"> </w:t>
-      </w:r>
-      <w:r>
-        <w:t xml:space="preserve">Children</w:t>
-      </w:r>
-      <w:r>
-        <w:t xml:space="preserve">. pp. 49–61 ACM, Athens Greece (2021). https://doi.org/</w:t>
-      </w:r>
-      <w:hyperlink r:id="rId40">
+        <w:t xml:space="preserve">du Toit, Francois. 2025.</w:t>
+      </w:r>
+      <w:r>
+        <w:t xml:space="preserve"> </w:t>
+      </w:r>
+      <w:r>
+        <w:t xml:space="preserve">“You Are Not Falling Behind, but You Could Lose the Race.”</w:t>
+      </w:r>
+      <w:r>
+        <w:t xml:space="preserve"> </w:t>
+      </w:r>
+      <w:r>
+        <w:rPr>
+          <w:i/>
+          <w:iCs/>
+        </w:rPr>
+        <w:t xml:space="preserve">MoneyMarketing</w:t>
+      </w:r>
+      <w:r>
+        <w:t xml:space="preserve"> </w:t>
+      </w:r>
+      <w:r>
+        <w:t xml:space="preserve">2025 (6): 13–13.</w:t>
+      </w:r>
+    </w:p>
+    <w:bookmarkEnd w:id="41"/>
+    <w:bookmarkStart w:id="43" w:name="ref-duOptimizingTemperatureLanguage2025"/>
+    <w:p>
+      <w:pPr>
+        <w:pStyle w:val="Bibliography"/>
+      </w:pPr>
+      <w:r>
+        <w:t xml:space="preserve">Du, Weihua, Yiming Yang, and Sean Welleck. 2025.</w:t>
+      </w:r>
+      <w:r>
+        <w:t xml:space="preserve"> </w:t>
+      </w:r>
+      <w:r>
+        <w:t xml:space="preserve">“Optimizing</w:t>
+      </w:r>
+      <w:r>
+        <w:t xml:space="preserve"> </w:t>
+      </w:r>
+      <w:r>
+        <w:t xml:space="preserve">Temperature</w:t>
+      </w:r>
+      <w:r>
+        <w:t xml:space="preserve"> </w:t>
+      </w:r>
+      <w:r>
+        <w:t xml:space="preserve">for</w:t>
+      </w:r>
+      <w:r>
+        <w:t xml:space="preserve"> </w:t>
+      </w:r>
+      <w:r>
+        <w:t xml:space="preserve">Language Models</w:t>
+      </w:r>
+      <w:r>
+        <w:t xml:space="preserve"> </w:t>
+      </w:r>
+      <w:r>
+        <w:t xml:space="preserve">with</w:t>
+      </w:r>
+      <w:r>
+        <w:t xml:space="preserve"> </w:t>
+      </w:r>
+      <w:r>
+        <w:t xml:space="preserve">Multi-Sample Inference</w:t>
+      </w:r>
+      <w:r>
+        <w:t xml:space="preserve">.”</w:t>
+      </w:r>
+      <w:r>
+        <w:t xml:space="preserve"> </w:t>
+      </w:r>
+      <w:r>
+        <w:t xml:space="preserve">arXiv.</w:t>
+      </w:r>
+      <w:r>
+        <w:t xml:space="preserve"> </w:t>
+      </w:r>
+      <w:hyperlink r:id="rId42">
         <w:r>
           <w:rPr>
             <w:rStyle w:val="Hyperlink"/>
           </w:rPr>
-          <w:t xml:space="preserve">10.1145/3459990.3460712</w:t>
+          <w:t xml:space="preserve">https://doi.org/10.48550/arXiv.2502.05234</w:t>
         </w:r>
       </w:hyperlink>
       <w:r>
         <w:t xml:space="preserve">.</w:t>
       </w:r>
     </w:p>
-    <w:bookmarkEnd w:id="41"/>
-    <w:bookmarkStart w:id="42" w:name="ref-du2025you"/>
+    <w:bookmarkEnd w:id="43"/>
+    <w:bookmarkStart w:id="45" w:name="ref-ederFallingAdoptionCurve2025"/>
     <w:p>
       <w:pPr>
         <w:pStyle w:val="Bibliography"/>
       </w:pPr>
       <w:r>
-        <w:t xml:space="preserve">10.</w:t>
-      </w:r>
-      <w:r>
-        <w:t xml:space="preserve"> </w:t>
-      </w:r>
-      <w:r>
-        <w:t xml:space="preserve">	</w:t>
-      </w:r>
-      <w:r>
-        <w:t xml:space="preserve">du Toit, F.: You are not falling behind, but you could lose the race. MoneyMarketing. 2025, 6, 13–13 (2025).</w:t>
-      </w:r>
-    </w:p>
-    <w:bookmarkEnd w:id="42"/>
-    <w:bookmarkStart w:id="45" w:name="ref-duOptimizingTemperatureLanguage2025"/>
-    <w:p>
-      <w:pPr>
-        <w:pStyle w:val="Bibliography"/>
-      </w:pPr>
-      <w:r>
-        <w:t xml:space="preserve">11.</w:t>
-      </w:r>
-      <w:r>
-        <w:t xml:space="preserve"> </w:t>
-      </w:r>
-      <w:r>
-        <w:t xml:space="preserve">	</w:t>
-      </w:r>
-      <w:r>
-        <w:t xml:space="preserve">Du, W. et al.: Optimizing</w:t>
-      </w:r>
-      <w:r>
-        <w:t xml:space="preserve"> </w:t>
-      </w:r>
-      <w:r>
-        <w:t xml:space="preserve">Temperature</w:t>
-      </w:r>
-      <w:r>
-        <w:t xml:space="preserve"> </w:t>
-      </w:r>
-      <w:r>
-        <w:t xml:space="preserve">for</w:t>
-      </w:r>
-      <w:r>
-        <w:t xml:space="preserve"> </w:t>
-      </w:r>
-      <w:r>
-        <w:t xml:space="preserve">Language Models</w:t>
-      </w:r>
-      <w:r>
-        <w:t xml:space="preserve"> </w:t>
-      </w:r>
-      <w:r>
-        <w:t xml:space="preserve">with</w:t>
-      </w:r>
-      <w:r>
-        <w:t xml:space="preserve"> </w:t>
-      </w:r>
-      <w:r>
-        <w:t xml:space="preserve">Multi-Sample Inference</w:t>
-      </w:r>
-      <w:r>
-        <w:t xml:space="preserve">,</w:t>
-      </w:r>
-      <w:r>
-        <w:t xml:space="preserve"> </w:t>
-      </w:r>
-      <w:hyperlink r:id="rId43">
-        <w:r>
-          <w:rPr>
-            <w:rStyle w:val="Hyperlink"/>
-          </w:rPr>
-          <w:t xml:space="preserve">https://arxiv.org/abs/2502.05234</w:t>
-        </w:r>
-      </w:hyperlink>
-      <w:r>
-        <w:t xml:space="preserve">, (2025). https://doi.org/</w:t>
+        <w:t xml:space="preserve">Eder, Maximilian, and Helle Sjøvaag. 2025.</w:t>
+      </w:r>
+      <w:r>
+        <w:t xml:space="preserve"> </w:t>
+      </w:r>
+      <w:r>
+        <w:t xml:space="preserve">“Falling Behind the Adoption Curve:</w:t>
+      </w:r>
+      <w:r>
+        <w:t xml:space="preserve"> </w:t>
+      </w:r>
+      <w:r>
+        <w:t xml:space="preserve">Local</w:t>
+      </w:r>
+      <w:r>
+        <w:t xml:space="preserve"> </w:t>
+      </w:r>
+      <w:r>
+        <w:t xml:space="preserve">Journalism’s Struggle for Innovation in the</w:t>
+      </w:r>
+      <w:r>
+        <w:t xml:space="preserve"> </w:t>
+      </w:r>
+      <w:r>
+        <w:t xml:space="preserve">AI</w:t>
+      </w:r>
+      <w:r>
+        <w:t xml:space="preserve"> </w:t>
+      </w:r>
+      <w:r>
+        <w:t xml:space="preserve">Transformation.”</w:t>
+      </w:r>
+      <w:r>
+        <w:t xml:space="preserve"> </w:t>
+      </w:r>
+      <w:r>
+        <w:rPr>
+          <w:i/>
+          <w:iCs/>
+        </w:rPr>
+        <w:t xml:space="preserve">Journal of Media Business Studies</w:t>
+      </w:r>
+      <w:r>
+        <w:t xml:space="preserve"> </w:t>
+      </w:r>
+      <w:r>
+        <w:t xml:space="preserve">22 (4): 325–43.</w:t>
+      </w:r>
+      <w:r>
+        <w:t xml:space="preserve"> </w:t>
       </w:r>
       <w:hyperlink r:id="rId44">
         <w:r>
           <w:rPr>
             <w:rStyle w:val="Hyperlink"/>
           </w:rPr>
-          <w:t xml:space="preserve">10.48550/arXiv.2502.05234</w:t>
+          <w:t xml:space="preserve">https://doi.org/10.1080/16522354.2025.2473301</w:t>
         </w:r>
       </w:hyperlink>
       <w:r>
@@ -1169,53 +1384,74 @@
       </w:r>
     </w:p>
     <w:bookmarkEnd w:id="45"/>
-    <w:bookmarkStart w:id="47" w:name="ref-ederFallingAdoptionCurve2025"/>
+    <w:bookmarkStart w:id="47" w:name="ref-guestUncriticalAdoptionAI2025"/>
     <w:p>
       <w:pPr>
         <w:pStyle w:val="Bibliography"/>
       </w:pPr>
       <w:r>
-        <w:t xml:space="preserve">12.</w:t>
-      </w:r>
-      <w:r>
-        <w:t xml:space="preserve"> </w:t>
-      </w:r>
-      <w:r>
-        <w:t xml:space="preserve">	</w:t>
-      </w:r>
-      <w:r>
-        <w:t xml:space="preserve">Eder, M., Sjøvaag, H.: Falling behind the adoption curve:</w:t>
-      </w:r>
-      <w:r>
-        <w:t xml:space="preserve"> </w:t>
-      </w:r>
-      <w:r>
-        <w:t xml:space="preserve">Local</w:t>
-      </w:r>
-      <w:r>
-        <w:t xml:space="preserve"> </w:t>
-      </w:r>
-      <w:r>
-        <w:t xml:space="preserve">journalism’s struggle for innovation in the</w:t>
-      </w:r>
-      <w:r>
-        <w:t xml:space="preserve"> </w:t>
+        <w:t xml:space="preserve">Guest, Olivia, Marcela Suarez, Barbara Müller, Edwin van Meerkerk, Arnoud Oude Groote Beverborg, Ronald de Haan, Andrea Reyes Elizondo, et al. 2025.</w:t>
+      </w:r>
+      <w:r>
+        <w:t xml:space="preserve"> </w:t>
+      </w:r>
+      <w:r>
+        <w:t xml:space="preserve">“Against the</w:t>
+      </w:r>
+      <w:r>
+        <w:t xml:space="preserve"> </w:t>
+      </w:r>
+      <w:r>
+        <w:t xml:space="preserve">Uncritical Adoption</w:t>
+      </w:r>
+      <w:r>
+        <w:t xml:space="preserve"> </w:t>
+      </w:r>
+      <w:r>
+        <w:t xml:space="preserve">of ’</w:t>
       </w:r>
       <w:r>
         <w:t xml:space="preserve">AI</w:t>
       </w:r>
       <w:r>
-        <w:t xml:space="preserve"> </w:t>
-      </w:r>
-      <w:r>
-        <w:t xml:space="preserve">transformation. Journal of Media Business Studies. 22, 4, 325–343 (2025). https://doi.org/</w:t>
+        <w:t xml:space="preserve">’</w:t>
+      </w:r>
+      <w:r>
+        <w:t xml:space="preserve"> </w:t>
+      </w:r>
+      <w:r>
+        <w:t xml:space="preserve">Technologies</w:t>
+      </w:r>
+      <w:r>
+        <w:t xml:space="preserve"> </w:t>
+      </w:r>
+      <w:r>
+        <w:t xml:space="preserve">in</w:t>
+      </w:r>
+      <w:r>
+        <w:t xml:space="preserve"> </w:t>
+      </w:r>
+      <w:r>
+        <w:t xml:space="preserve">Academia</w:t>
+      </w:r>
+      <w:r>
+        <w:t xml:space="preserve">.”</w:t>
+      </w:r>
+      <w:r>
+        <w:t xml:space="preserve"> </w:t>
+      </w:r>
+      <w:r>
+        <w:t xml:space="preserve">Zenodo.</w:t>
+      </w:r>
+      <w:r>
+        <w:t xml:space="preserve"> </w:t>
       </w:r>
       <w:hyperlink r:id="rId46">
         <w:r>
           <w:rPr>
             <w:rStyle w:val="Hyperlink"/>
           </w:rPr>
-          <w:t xml:space="preserve">10.1080/16522354.2025.2473301</w:t>
+          <w:t xml:space="preserve">https://doi.org/10.5281/ZENODO.17065099</w:t>
         </w:r>
       </w:hyperlink>
       <w:r>
@@ -1223,68 +1459,69 @@
       </w:r>
     </w:p>
     <w:bookmarkEnd w:id="47"/>
-    <w:bookmarkStart w:id="49" w:name="ref-guestUncriticalAdoptionAI2025"/>
+    <w:bookmarkStart w:id="49" w:name="ref-hanImpactGenAILearning2025"/>
     <w:p>
       <w:pPr>
         <w:pStyle w:val="Bibliography"/>
       </w:pPr>
       <w:r>
-        <w:t xml:space="preserve">13.</w:t>
-      </w:r>
-      <w:r>
-        <w:t xml:space="preserve"> </w:t>
-      </w:r>
-      <w:r>
-        <w:t xml:space="preserve">	</w:t>
-      </w:r>
-      <w:r>
-        <w:t xml:space="preserve">Guest, O. et al.: Against the</w:t>
-      </w:r>
-      <w:r>
-        <w:t xml:space="preserve"> </w:t>
-      </w:r>
-      <w:r>
-        <w:t xml:space="preserve">Uncritical Adoption</w:t>
-      </w:r>
-      <w:r>
-        <w:t xml:space="preserve"> </w:t>
-      </w:r>
-      <w:r>
-        <w:t xml:space="preserve">of ’</w:t>
-      </w:r>
-      <w:r>
-        <w:t xml:space="preserve">AI</w:t>
-      </w:r>
-      <w:r>
-        <w:t xml:space="preserve">’</w:t>
-      </w:r>
-      <w:r>
-        <w:t xml:space="preserve"> </w:t>
-      </w:r>
-      <w:r>
-        <w:t xml:space="preserve">Technologies</w:t>
-      </w:r>
-      <w:r>
-        <w:t xml:space="preserve"> </w:t>
-      </w:r>
-      <w:r>
-        <w:t xml:space="preserve">in</w:t>
-      </w:r>
-      <w:r>
-        <w:t xml:space="preserve"> </w:t>
-      </w:r>
-      <w:r>
-        <w:t xml:space="preserve">Academia</w:t>
-      </w:r>
-      <w:r>
-        <w:t xml:space="preserve">, (2025). https://doi.org/</w:t>
+        <w:t xml:space="preserve">Han, Xiaoli, Hongchao Peng, and Mingzhuo Liu. 2025.</w:t>
+      </w:r>
+      <w:r>
+        <w:t xml:space="preserve"> </w:t>
+      </w:r>
+      <w:r>
+        <w:t xml:space="preserve">“The Impact of</w:t>
+      </w:r>
+      <w:r>
+        <w:t xml:space="preserve"> </w:t>
+      </w:r>
+      <w:r>
+        <w:t xml:space="preserve">GenAI</w:t>
+      </w:r>
+      <w:r>
+        <w:t xml:space="preserve"> </w:t>
+      </w:r>
+      <w:r>
+        <w:t xml:space="preserve">on Learning Outcomes:</w:t>
+      </w:r>
+      <w:r>
+        <w:t xml:space="preserve"> </w:t>
+      </w:r>
+      <w:r>
+        <w:t xml:space="preserve">A</w:t>
+      </w:r>
+      <w:r>
+        <w:t xml:space="preserve"> </w:t>
+      </w:r>
+      <w:r>
+        <w:t xml:space="preserve">Systematic Review and Meta-Analysis of Experimental Studies.”</w:t>
+      </w:r>
+      <w:r>
+        <w:t xml:space="preserve"> </w:t>
+      </w:r>
+      <w:r>
+        <w:rPr>
+          <w:i/>
+          <w:iCs/>
+        </w:rPr>
+        <w:t xml:space="preserve">Educational Research Review</w:t>
+      </w:r>
+      <w:r>
+        <w:t xml:space="preserve"> </w:t>
+      </w:r>
+      <w:r>
+        <w:t xml:space="preserve">48 (August): 100714.</w:t>
+      </w:r>
+      <w:r>
+        <w:t xml:space="preserve"> </w:t>
       </w:r>
       <w:hyperlink r:id="rId48">
         <w:r>
           <w:rPr>
             <w:rStyle w:val="Hyperlink"/>
           </w:rPr>
-          <w:t xml:space="preserve">10.5281/ZENODO.17065099</w:t>
+          <w:t xml:space="preserve">https://doi.org/10.1016/j.edurev.2025.100714</w:t>
         </w:r>
       </w:hyperlink>
       <w:r>
@@ -1292,53 +1529,54 @@
       </w:r>
     </w:p>
     <w:bookmarkEnd w:id="49"/>
-    <w:bookmarkStart w:id="51" w:name="ref-hanImpactGenAILearning2025"/>
+    <w:bookmarkStart w:id="51" w:name="ref-heyndelsTechnologyNeutrality2023"/>
     <w:p>
       <w:pPr>
         <w:pStyle w:val="Bibliography"/>
       </w:pPr>
       <w:r>
-        <w:t xml:space="preserve">14.</w:t>
-      </w:r>
-      <w:r>
-        <w:t xml:space="preserve"> </w:t>
-      </w:r>
-      <w:r>
-        <w:t xml:space="preserve">	</w:t>
-      </w:r>
-      <w:r>
-        <w:t xml:space="preserve">Han, X. et al.: The impact of</w:t>
-      </w:r>
-      <w:r>
-        <w:t xml:space="preserve"> </w:t>
-      </w:r>
-      <w:r>
-        <w:t xml:space="preserve">GenAI</w:t>
-      </w:r>
-      <w:r>
-        <w:t xml:space="preserve"> </w:t>
-      </w:r>
-      <w:r>
-        <w:t xml:space="preserve">on learning outcomes:</w:t>
-      </w:r>
-      <w:r>
-        <w:t xml:space="preserve"> </w:t>
-      </w:r>
-      <w:r>
-        <w:t xml:space="preserve">A</w:t>
-      </w:r>
-      <w:r>
-        <w:t xml:space="preserve"> </w:t>
-      </w:r>
-      <w:r>
-        <w:t xml:space="preserve">systematic review and meta-analysis of experimental studies. Educational Research Review. 48, 100714 (2025). https://doi.org/</w:t>
+        <w:t xml:space="preserve">Heyndels, Sybren. 2023.</w:t>
+      </w:r>
+      <w:r>
+        <w:t xml:space="preserve"> </w:t>
+      </w:r>
+      <w:r>
+        <w:t xml:space="preserve">“Technology and</w:t>
+      </w:r>
+      <w:r>
+        <w:t xml:space="preserve"> </w:t>
+      </w:r>
+      <w:r>
+        <w:t xml:space="preserve">Neutrality</w:t>
+      </w:r>
+      <w:r>
+        <w:t xml:space="preserve">.”</w:t>
+      </w:r>
+      <w:r>
+        <w:t xml:space="preserve"> </w:t>
+      </w:r>
+      <w:r>
+        <w:rPr>
+          <w:i/>
+          <w:iCs/>
+        </w:rPr>
+        <w:t xml:space="preserve">Philosophy &amp; Technology</w:t>
+      </w:r>
+      <w:r>
+        <w:t xml:space="preserve"> </w:t>
+      </w:r>
+      <w:r>
+        <w:t xml:space="preserve">36 (4): 75.</w:t>
+      </w:r>
+      <w:r>
+        <w:t xml:space="preserve"> </w:t>
       </w:r>
       <w:hyperlink r:id="rId50">
         <w:r>
           <w:rPr>
             <w:rStyle w:val="Hyperlink"/>
           </w:rPr>
-          <w:t xml:space="preserve">10.1016/j.edurev.2025.100714</w:t>
+          <w:t xml:space="preserve">https://doi.org/10.1007/s13347-023-00672-1</w:t>
         </w:r>
       </w:hyperlink>
       <w:r>
@@ -1346,38 +1584,204 @@
       </w:r>
     </w:p>
     <w:bookmarkEnd w:id="51"/>
-    <w:bookmarkStart w:id="53" w:name="ref-heyndelsTechnologyNeutrality2023"/>
+    <w:bookmarkStart w:id="53" w:name="ref-houAllRoadsLead2025"/>
     <w:p>
       <w:pPr>
         <w:pStyle w:val="Bibliography"/>
       </w:pPr>
       <w:r>
-        <w:t xml:space="preserve">15.</w:t>
-      </w:r>
-      <w:r>
-        <w:t xml:space="preserve"> </w:t>
-      </w:r>
-      <w:r>
-        <w:t xml:space="preserve">	</w:t>
-      </w:r>
-      <w:r>
-        <w:t xml:space="preserve">Heyndels, S.: Technology and</w:t>
-      </w:r>
-      <w:r>
-        <w:t xml:space="preserve"> </w:t>
-      </w:r>
-      <w:r>
-        <w:t xml:space="preserve">Neutrality</w:t>
-      </w:r>
-      <w:r>
-        <w:t xml:space="preserve">. Philosophy &amp; Technology. 36, 4, 75 (2023). https://doi.org/</w:t>
+        <w:t xml:space="preserve">Hou, Irene, Owen Man, Kate Hamilton, Srishty Muthusekaran, Jeffin Johnykutty, Leili Zadeh, and Stephen MacNeil. 2025.</w:t>
+      </w:r>
+      <w:r>
+        <w:t xml:space="preserve"> </w:t>
+      </w:r>
+      <w:r>
+        <w:t xml:space="preserve">“’</w:t>
+      </w:r>
+      <w:r>
+        <w:t xml:space="preserve">All Roads Lead</w:t>
+      </w:r>
+      <w:r>
+        <w:t xml:space="preserve"> </w:t>
+      </w:r>
+      <w:r>
+        <w:t xml:space="preserve">to</w:t>
+      </w:r>
+      <w:r>
+        <w:t xml:space="preserve"> </w:t>
+      </w:r>
+      <w:r>
+        <w:t xml:space="preserve">ChatGPT</w:t>
+      </w:r>
+      <w:r>
+        <w:t xml:space="preserve">’:</w:t>
+      </w:r>
+      <w:r>
+        <w:t xml:space="preserve"> </w:t>
+      </w:r>
+      <w:r>
+        <w:t xml:space="preserve">How Generative AI</w:t>
+      </w:r>
+      <w:r>
+        <w:t xml:space="preserve"> </w:t>
+      </w:r>
+      <w:r>
+        <w:t xml:space="preserve">Is</w:t>
+      </w:r>
+      <w:r>
+        <w:t xml:space="preserve"> </w:t>
+      </w:r>
+      <w:r>
+        <w:t xml:space="preserve">Eroding Social Interactions</w:t>
+      </w:r>
+      <w:r>
+        <w:t xml:space="preserve"> </w:t>
+      </w:r>
+      <w:r>
+        <w:t xml:space="preserve">and</w:t>
+      </w:r>
+      <w:r>
+        <w:t xml:space="preserve"> </w:t>
+      </w:r>
+      <w:r>
+        <w:t xml:space="preserve">Student Learning Communities</w:t>
+      </w:r>
+      <w:r>
+        <w:t xml:space="preserve">.”</w:t>
+      </w:r>
+      <w:r>
+        <w:t xml:space="preserve"> </w:t>
+      </w:r>
+      <w:r>
+        <w:t xml:space="preserve">In</w:t>
+      </w:r>
+      <w:r>
+        <w:t xml:space="preserve"> </w:t>
+      </w:r>
+      <w:r>
+        <w:rPr>
+          <w:i/>
+          <w:iCs/>
+        </w:rPr>
+        <w:t xml:space="preserve">Proceedings of the 30th</w:t>
+      </w:r>
+      <w:r>
+        <w:rPr>
+          <w:i/>
+          <w:iCs/>
+        </w:rPr>
+        <w:t xml:space="preserve"> </w:t>
+      </w:r>
+      <w:r>
+        <w:rPr>
+          <w:i/>
+          <w:iCs/>
+        </w:rPr>
+        <w:t xml:space="preserve">ACM Conference</w:t>
+      </w:r>
+      <w:r>
+        <w:rPr>
+          <w:i/>
+          <w:iCs/>
+        </w:rPr>
+        <w:t xml:space="preserve"> </w:t>
+      </w:r>
+      <w:r>
+        <w:rPr>
+          <w:i/>
+          <w:iCs/>
+        </w:rPr>
+        <w:t xml:space="preserve">on</w:t>
+      </w:r>
+      <w:r>
+        <w:rPr>
+          <w:i/>
+          <w:iCs/>
+        </w:rPr>
+        <w:t xml:space="preserve"> </w:t>
+      </w:r>
+      <w:r>
+        <w:rPr>
+          <w:i/>
+          <w:iCs/>
+        </w:rPr>
+        <w:t xml:space="preserve">Innovation</w:t>
+      </w:r>
+      <w:r>
+        <w:rPr>
+          <w:i/>
+          <w:iCs/>
+        </w:rPr>
+        <w:t xml:space="preserve"> </w:t>
+      </w:r>
+      <w:r>
+        <w:rPr>
+          <w:i/>
+          <w:iCs/>
+        </w:rPr>
+        <w:t xml:space="preserve">and</w:t>
+      </w:r>
+      <w:r>
+        <w:rPr>
+          <w:i/>
+          <w:iCs/>
+        </w:rPr>
+        <w:t xml:space="preserve"> </w:t>
+      </w:r>
+      <w:r>
+        <w:rPr>
+          <w:i/>
+          <w:iCs/>
+        </w:rPr>
+        <w:t xml:space="preserve">Technology</w:t>
+      </w:r>
+      <w:r>
+        <w:rPr>
+          <w:i/>
+          <w:iCs/>
+        </w:rPr>
+        <w:t xml:space="preserve"> </w:t>
+      </w:r>
+      <w:r>
+        <w:rPr>
+          <w:i/>
+          <w:iCs/>
+        </w:rPr>
+        <w:t xml:space="preserve">in</w:t>
+      </w:r>
+      <w:r>
+        <w:rPr>
+          <w:i/>
+          <w:iCs/>
+        </w:rPr>
+        <w:t xml:space="preserve"> </w:t>
+      </w:r>
+      <w:r>
+        <w:rPr>
+          <w:i/>
+          <w:iCs/>
+        </w:rPr>
+        <w:t xml:space="preserve">Computer Science Education V</w:t>
+      </w:r>
+      <w:r>
+        <w:rPr>
+          <w:i/>
+          <w:iCs/>
+        </w:rPr>
+        <w:t xml:space="preserve">. 1</w:t>
+      </w:r>
+      <w:r>
+        <w:t xml:space="preserve">, 79–85. Nijmegen Netherlands: ACM.</w:t>
+      </w:r>
+      <w:r>
+        <w:t xml:space="preserve"> </w:t>
       </w:r>
       <w:hyperlink r:id="rId52">
         <w:r>
           <w:rPr>
             <w:rStyle w:val="Hyperlink"/>
           </w:rPr>
-          <w:t xml:space="preserve">10.1007/s13347-023-00672-1</w:t>
+          <w:t xml:space="preserve">https://doi.org/10.1145/3724363.3729024</w:t>
         </w:r>
       </w:hyperlink>
       <w:r>
@@ -1385,213 +1789,206 @@
       </w:r>
     </w:p>
     <w:bookmarkEnd w:id="53"/>
-    <w:bookmarkStart w:id="55" w:name="ref-houAllRoadsLead2025"/>
+    <w:bookmarkStart w:id="54" w:name="ref-johnsonPowerProgressOur2023"/>
     <w:p>
       <w:pPr>
         <w:pStyle w:val="Bibliography"/>
       </w:pPr>
       <w:r>
-        <w:t xml:space="preserve">16.</w:t>
-      </w:r>
-      <w:r>
-        <w:t xml:space="preserve"> </w:t>
-      </w:r>
-      <w:r>
-        <w:t xml:space="preserve">	</w:t>
-      </w:r>
-      <w:r>
-        <w:t xml:space="preserve">Hou, I. et al.: ’</w:t>
-      </w:r>
-      <w:r>
-        <w:t xml:space="preserve">All Roads Lead</w:t>
-      </w:r>
-      <w:r>
-        <w:t xml:space="preserve"> </w:t>
-      </w:r>
-      <w:r>
-        <w:t xml:space="preserve">to</w:t>
-      </w:r>
-      <w:r>
-        <w:t xml:space="preserve"> </w:t>
-      </w:r>
-      <w:r>
-        <w:t xml:space="preserve">ChatGPT</w:t>
-      </w:r>
-      <w:r>
-        <w:t xml:space="preserve">’:</w:t>
-      </w:r>
-      <w:r>
-        <w:t xml:space="preserve"> </w:t>
-      </w:r>
-      <w:r>
-        <w:t xml:space="preserve">How Generative AI</w:t>
-      </w:r>
-      <w:r>
-        <w:t xml:space="preserve"> </w:t>
-      </w:r>
-      <w:r>
-        <w:t xml:space="preserve">is</w:t>
-      </w:r>
-      <w:r>
-        <w:t xml:space="preserve"> </w:t>
-      </w:r>
-      <w:r>
-        <w:t xml:space="preserve">Eroding Social Interactions</w:t>
-      </w:r>
-      <w:r>
-        <w:t xml:space="preserve"> </w:t>
-      </w:r>
-      <w:r>
+        <w:t xml:space="preserve">Johnson, Simon, and Daron Acemoglu. 2023.</w:t>
+      </w:r>
+      <w:r>
+        <w:t xml:space="preserve"> </w:t>
+      </w:r>
+      <w:r>
+        <w:rPr>
+          <w:i/>
+          <w:iCs/>
+        </w:rPr>
+        <w:t xml:space="preserve">Power and</w:t>
+      </w:r>
+      <w:r>
+        <w:rPr>
+          <w:i/>
+          <w:iCs/>
+        </w:rPr>
+        <w:t xml:space="preserve"> </w:t>
+      </w:r>
+      <w:r>
+        <w:rPr>
+          <w:i/>
+          <w:iCs/>
+        </w:rPr>
+        <w:t xml:space="preserve">Progress</w:t>
+      </w:r>
+      <w:r>
+        <w:rPr>
+          <w:i/>
+          <w:iCs/>
+        </w:rPr>
+        <w:t xml:space="preserve">:</w:t>
+      </w:r>
+      <w:r>
+        <w:rPr>
+          <w:i/>
+          <w:iCs/>
+        </w:rPr>
+        <w:t xml:space="preserve"> </w:t>
+      </w:r>
+      <w:r>
+        <w:rPr>
+          <w:i/>
+          <w:iCs/>
+        </w:rPr>
+        <w:t xml:space="preserve">Our Thousand-Year Struggle Over Technology</w:t>
+      </w:r>
+      <w:r>
+        <w:rPr>
+          <w:i/>
+          <w:iCs/>
+        </w:rPr>
+        <w:t xml:space="preserve"> </w:t>
+      </w:r>
+      <w:r>
+        <w:rPr>
+          <w:i/>
+          <w:iCs/>
+        </w:rPr>
         <w:t xml:space="preserve">and</w:t>
       </w:r>
       <w:r>
-        <w:t xml:space="preserve"> </w:t>
-      </w:r>
-      <w:r>
-        <w:t xml:space="preserve">Student Learning Communities</w:t>
-      </w:r>
-      <w:r>
-        <w:t xml:space="preserve">. In: Proceedings of the 30th</w:t>
-      </w:r>
-      <w:r>
-        <w:t xml:space="preserve"> </w:t>
-      </w:r>
-      <w:r>
-        <w:t xml:space="preserve">ACM Conference</w:t>
-      </w:r>
-      <w:r>
-        <w:t xml:space="preserve"> </w:t>
-      </w:r>
-      <w:r>
-        <w:t xml:space="preserve">on</w:t>
-      </w:r>
-      <w:r>
-        <w:t xml:space="preserve"> </w:t>
-      </w:r>
-      <w:r>
-        <w:t xml:space="preserve">Innovation</w:t>
-      </w:r>
-      <w:r>
-        <w:t xml:space="preserve"> </w:t>
-      </w:r>
-      <w:r>
-        <w:t xml:space="preserve">and</w:t>
-      </w:r>
-      <w:r>
-        <w:t xml:space="preserve"> </w:t>
-      </w:r>
-      <w:r>
-        <w:t xml:space="preserve">Technology</w:t>
-      </w:r>
-      <w:r>
-        <w:t xml:space="preserve"> </w:t>
-      </w:r>
-      <w:r>
-        <w:t xml:space="preserve">in</w:t>
-      </w:r>
-      <w:r>
-        <w:t xml:space="preserve"> </w:t>
-      </w:r>
-      <w:r>
-        <w:t xml:space="preserve">Computer Science Education V</w:t>
-      </w:r>
-      <w:r>
-        <w:t xml:space="preserve">. 1. pp. 79–85 ACM, Nijmegen Netherlands (2025). https://doi.org/</w:t>
-      </w:r>
-      <w:hyperlink r:id="rId54">
+        <w:rPr>
+          <w:i/>
+          <w:iCs/>
+        </w:rPr>
+        <w:t xml:space="preserve"> </w:t>
+      </w:r>
+      <w:r>
+        <w:rPr>
+          <w:i/>
+          <w:iCs/>
+        </w:rPr>
+        <w:t xml:space="preserve">Prosperity</w:t>
+      </w:r>
+      <w:r>
+        <w:t xml:space="preserve">. Hachette UK.</w:t>
+      </w:r>
+    </w:p>
+    <w:bookmarkEnd w:id="54"/>
+    <w:bookmarkStart w:id="56" w:name="ref-kapoorAIAgentsThat2024"/>
+    <w:p>
+      <w:pPr>
+        <w:pStyle w:val="Bibliography"/>
+      </w:pPr>
+      <w:r>
+        <w:t xml:space="preserve">Kapoor, Sayash, Benedikt Stroebl, Zachary S. Siegel, Nitya Nadgir, and Arvind Narayanan. 2024.</w:t>
+      </w:r>
+      <w:r>
+        <w:t xml:space="preserve"> </w:t>
+      </w:r>
+      <w:r>
+        <w:t xml:space="preserve">“</w:t>
+      </w:r>
+      <w:r>
+        <w:t xml:space="preserve">AI Agents That Matter</w:t>
+      </w:r>
+      <w:r>
+        <w:t xml:space="preserve">.”</w:t>
+      </w:r>
+      <w:r>
+        <w:t xml:space="preserve"> </w:t>
+      </w:r>
+      <w:r>
+        <w:t xml:space="preserve">arXiv.</w:t>
+      </w:r>
+      <w:r>
+        <w:t xml:space="preserve"> </w:t>
+      </w:r>
+      <w:hyperlink r:id="rId55">
         <w:r>
           <w:rPr>
             <w:rStyle w:val="Hyperlink"/>
           </w:rPr>
-          <w:t xml:space="preserve">10.1145/3724363.3729024</w:t>
+          <w:t xml:space="preserve">https://doi.org/10.48550/ARXIV.2407.01502</w:t>
         </w:r>
       </w:hyperlink>
       <w:r>
         <w:t xml:space="preserve">.</w:t>
       </w:r>
     </w:p>
-    <w:bookmarkEnd w:id="55"/>
-    <w:bookmarkStart w:id="56" w:name="ref-johnsonPowerProgressOur2023"/>
+    <w:bookmarkEnd w:id="56"/>
+    <w:bookmarkStart w:id="58" w:name="ref-khanalWhyHowPower2025"/>
     <w:p>
       <w:pPr>
         <w:pStyle w:val="Bibliography"/>
       </w:pPr>
       <w:r>
-        <w:t xml:space="preserve">17.</w:t>
-      </w:r>
-      <w:r>
-        <w:t xml:space="preserve"> </w:t>
-      </w:r>
-      <w:r>
-        <w:t xml:space="preserve">	</w:t>
-      </w:r>
-      <w:r>
-        <w:t xml:space="preserve">Johnson, S., Acemoglu, D.: Power and</w:t>
-      </w:r>
-      <w:r>
-        <w:t xml:space="preserve"> </w:t>
-      </w:r>
-      <w:r>
-        <w:t xml:space="preserve">Progress</w:t>
-      </w:r>
-      <w:r>
-        <w:t xml:space="preserve">:</w:t>
-      </w:r>
-      <w:r>
-        <w:t xml:space="preserve"> </w:t>
-      </w:r>
-      <w:r>
-        <w:t xml:space="preserve">Our Thousand-Year Struggle Over Technology</w:t>
-      </w:r>
-      <w:r>
-        <w:t xml:space="preserve"> </w:t>
-      </w:r>
-      <w:r>
-        <w:t xml:space="preserve">and</w:t>
-      </w:r>
-      <w:r>
-        <w:t xml:space="preserve"> </w:t>
-      </w:r>
-      <w:r>
-        <w:t xml:space="preserve">Prosperity</w:t>
-      </w:r>
-      <w:r>
-        <w:t xml:space="preserve">. Hachette UK (2023).</w:t>
-      </w:r>
-    </w:p>
-    <w:bookmarkEnd w:id="56"/>
-    <w:bookmarkStart w:id="58" w:name="ref-kapoorAIAgentsThat2024"/>
-    <w:p>
-      <w:pPr>
-        <w:pStyle w:val="Bibliography"/>
-      </w:pPr>
-      <w:r>
-        <w:t xml:space="preserve">18.</w:t>
-      </w:r>
-      <w:r>
-        <w:t xml:space="preserve"> </w:t>
-      </w:r>
-      <w:r>
-        <w:t xml:space="preserve">	</w:t>
-      </w:r>
-      <w:r>
-        <w:t xml:space="preserve">Kapoor, S. et al.:</w:t>
-      </w:r>
-      <w:r>
-        <w:t xml:space="preserve"> </w:t>
-      </w:r>
-      <w:r>
-        <w:t xml:space="preserve">AI Agents That Matter</w:t>
-      </w:r>
-      <w:r>
-        <w:t xml:space="preserve">, (2024). https://doi.org/</w:t>
+        <w:t xml:space="preserve">Khanal, Shaleen, Hongzhou Zhang, and Araz Taeihagh. 2025.</w:t>
+      </w:r>
+      <w:r>
+        <w:t xml:space="preserve"> </w:t>
+      </w:r>
+      <w:r>
+        <w:t xml:space="preserve">“Why and How Is the Power of</w:t>
+      </w:r>
+      <w:r>
+        <w:t xml:space="preserve"> </w:t>
+      </w:r>
+      <w:r>
+        <w:t xml:space="preserve">Big Tech</w:t>
+      </w:r>
+      <w:r>
+        <w:t xml:space="preserve"> </w:t>
+      </w:r>
+      <w:r>
+        <w:t xml:space="preserve">Increasing in the Policy Process?</w:t>
+      </w:r>
+      <w:r>
+        <w:t xml:space="preserve"> </w:t>
+      </w:r>
+      <w:r>
+        <w:t xml:space="preserve">The</w:t>
+      </w:r>
+      <w:r>
+        <w:t xml:space="preserve"> </w:t>
+      </w:r>
+      <w:r>
+        <w:t xml:space="preserve">Case of Generative</w:t>
+      </w:r>
+      <w:r>
+        <w:t xml:space="preserve"> </w:t>
+      </w:r>
+      <w:r>
+        <w:t xml:space="preserve">AI</w:t>
+      </w:r>
+      <w:r>
+        <w:t xml:space="preserve">.”</w:t>
+      </w:r>
+      <w:r>
+        <w:t xml:space="preserve"> </w:t>
+      </w:r>
+      <w:r>
+        <w:rPr>
+          <w:i/>
+          <w:iCs/>
+        </w:rPr>
+        <w:t xml:space="preserve">Policy and Society</w:t>
+      </w:r>
+      <w:r>
+        <w:t xml:space="preserve"> </w:t>
+      </w:r>
+      <w:r>
+        <w:t xml:space="preserve">44 (1): 52–69.</w:t>
+      </w:r>
+      <w:r>
+        <w:t xml:space="preserve"> </w:t>
       </w:r>
       <w:hyperlink r:id="rId57">
         <w:r>
           <w:rPr>
             <w:rStyle w:val="Hyperlink"/>
           </w:rPr>
-          <w:t xml:space="preserve">10.48550/ARXIV.2407.01502</w:t>
+          <w:t xml:space="preserve">https://doi.org/10.1093/polsoc/puae012</w:t>
         </w:r>
       </w:hyperlink>
       <w:r>
@@ -1599,62 +1996,74 @@
       </w:r>
     </w:p>
     <w:bookmarkEnd w:id="58"/>
-    <w:bookmarkStart w:id="60" w:name="ref-khanalWhyHowPower2025"/>
+    <w:bookmarkStart w:id="60" w:name="ref-kumarIntuitionEvidenceMeasuring2025"/>
     <w:p>
       <w:pPr>
         <w:pStyle w:val="Bibliography"/>
       </w:pPr>
       <w:r>
-        <w:t xml:space="preserve">19.</w:t>
-      </w:r>
-      <w:r>
-        <w:t xml:space="preserve"> </w:t>
-      </w:r>
-      <w:r>
-        <w:t xml:space="preserve">	</w:t>
-      </w:r>
-      <w:r>
-        <w:t xml:space="preserve">Khanal, S. et al.: Why and how is the power of</w:t>
-      </w:r>
-      <w:r>
-        <w:t xml:space="preserve"> </w:t>
-      </w:r>
-      <w:r>
-        <w:t xml:space="preserve">Big Tech</w:t>
-      </w:r>
-      <w:r>
-        <w:t xml:space="preserve"> </w:t>
-      </w:r>
-      <w:r>
-        <w:t xml:space="preserve">increasing in the policy process?</w:t>
-      </w:r>
-      <w:r>
-        <w:t xml:space="preserve"> </w:t>
-      </w:r>
-      <w:r>
-        <w:t xml:space="preserve">The</w:t>
-      </w:r>
-      <w:r>
-        <w:t xml:space="preserve"> </w:t>
-      </w:r>
-      <w:r>
-        <w:t xml:space="preserve">case of generative</w:t>
-      </w:r>
-      <w:r>
-        <w:t xml:space="preserve"> </w:t>
-      </w:r>
-      <w:r>
-        <w:t xml:space="preserve">AI</w:t>
-      </w:r>
-      <w:r>
-        <w:t xml:space="preserve">. Policy and Society. 44, 1, 52–69 (2025). https://doi.org/</w:t>
+        <w:t xml:space="preserve">Kumar, Anand, Vishal Khare, Deepak Sharma, Satyam Kumar, Vijay Saini, Anshul Yadav, Sachendra Jain, et al. 2025.</w:t>
+      </w:r>
+      <w:r>
+        <w:t xml:space="preserve"> </w:t>
+      </w:r>
+      <w:r>
+        <w:t xml:space="preserve">“Intuition to</w:t>
+      </w:r>
+      <w:r>
+        <w:t xml:space="preserve"> </w:t>
+      </w:r>
+      <w:r>
+        <w:t xml:space="preserve">Evidence</w:t>
+      </w:r>
+      <w:r>
+        <w:t xml:space="preserve">:</w:t>
+      </w:r>
+      <w:r>
+        <w:t xml:space="preserve"> </w:t>
+      </w:r>
+      <w:r>
+        <w:t xml:space="preserve">Measuring AI</w:t>
+      </w:r>
+      <w:r>
+        <w:t xml:space="preserve">’s</w:t>
+      </w:r>
+      <w:r>
+        <w:t xml:space="preserve"> </w:t>
+      </w:r>
+      <w:r>
+        <w:t xml:space="preserve">True Impact</w:t>
+      </w:r>
+      <w:r>
+        <w:t xml:space="preserve"> </w:t>
+      </w:r>
+      <w:r>
+        <w:t xml:space="preserve">on</w:t>
+      </w:r>
+      <w:r>
+        <w:t xml:space="preserve"> </w:t>
+      </w:r>
+      <w:r>
+        <w:t xml:space="preserve">Developer Productivity</w:t>
+      </w:r>
+      <w:r>
+        <w:t xml:space="preserve">.”</w:t>
+      </w:r>
+      <w:r>
+        <w:t xml:space="preserve"> </w:t>
+      </w:r>
+      <w:r>
+        <w:t xml:space="preserve">arXiv.</w:t>
+      </w:r>
+      <w:r>
+        <w:t xml:space="preserve"> </w:t>
       </w:r>
       <w:hyperlink r:id="rId59">
         <w:r>
           <w:rPr>
             <w:rStyle w:val="Hyperlink"/>
           </w:rPr>
-          <w:t xml:space="preserve">10.1093/polsoc/puae012</w:t>
+          <w:t xml:space="preserve">https://doi.org/10.48550/arXiv.2509.19708</w:t>
         </w:r>
       </w:hyperlink>
       <w:r>
@@ -1662,28 +2071,25 @@
       </w:r>
     </w:p>
     <w:bookmarkEnd w:id="60"/>
-    <w:bookmarkStart w:id="63" w:name="ref-kumarIntuitionEvidenceMeasuring2025"/>
+    <w:bookmarkStart w:id="62" w:name="ref-leslieFutureShockGenerative2024"/>
     <w:p>
       <w:pPr>
         <w:pStyle w:val="Bibliography"/>
       </w:pPr>
       <w:r>
-        <w:t xml:space="preserve">20.</w:t>
-      </w:r>
-      <w:r>
-        <w:t xml:space="preserve"> </w:t>
-      </w:r>
-      <w:r>
-        <w:t xml:space="preserve">	</w:t>
-      </w:r>
-      <w:r>
-        <w:t xml:space="preserve">Kumar, A. et al.: Intuition to</w:t>
-      </w:r>
-      <w:r>
-        <w:t xml:space="preserve"> </w:t>
-      </w:r>
-      <w:r>
-        <w:t xml:space="preserve">Evidence</w:t>
+        <w:t xml:space="preserve">Leslie, David, and Antonella Maia Perini. 2024.</w:t>
+      </w:r>
+      <w:r>
+        <w:t xml:space="preserve"> </w:t>
+      </w:r>
+      <w:r>
+        <w:t xml:space="preserve">“Future</w:t>
+      </w:r>
+      <w:r>
+        <w:t xml:space="preserve"> </w:t>
+      </w:r>
+      <w:r>
+        <w:t xml:space="preserve">Shock</w:t>
       </w:r>
       <w:r>
         <w:t xml:space="preserve">:</w:t>
@@ -1692,31 +2098,47 @@
         <w:t xml:space="preserve"> </w:t>
       </w:r>
       <w:r>
-        <w:t xml:space="preserve">Measuring AI</w:t>
-      </w:r>
-      <w:r>
-        <w:t xml:space="preserve">’s</w:t>
-      </w:r>
-      <w:r>
-        <w:t xml:space="preserve"> </w:t>
-      </w:r>
-      <w:r>
-        <w:t xml:space="preserve">True Impact</w:t>
-      </w:r>
-      <w:r>
-        <w:t xml:space="preserve"> </w:t>
-      </w:r>
-      <w:r>
-        <w:t xml:space="preserve">on</w:t>
-      </w:r>
-      <w:r>
-        <w:t xml:space="preserve"> </w:t>
-      </w:r>
-      <w:r>
-        <w:t xml:space="preserve">Developer Productivity</w:t>
-      </w:r>
-      <w:r>
-        <w:t xml:space="preserve">,</w:t>
+        <w:t xml:space="preserve">Generative AI</w:t>
+      </w:r>
+      <w:r>
+        <w:t xml:space="preserve"> </w:t>
+      </w:r>
+      <w:r>
+        <w:t xml:space="preserve">and the</w:t>
+      </w:r>
+      <w:r>
+        <w:t xml:space="preserve"> </w:t>
+      </w:r>
+      <w:r>
+        <w:t xml:space="preserve">International AI Policy</w:t>
+      </w:r>
+      <w:r>
+        <w:t xml:space="preserve"> </w:t>
+      </w:r>
+      <w:r>
+        <w:t xml:space="preserve">and</w:t>
+      </w:r>
+      <w:r>
+        <w:t xml:space="preserve"> </w:t>
+      </w:r>
+      <w:r>
+        <w:t xml:space="preserve">Governance Crisis</w:t>
+      </w:r>
+      <w:r>
+        <w:t xml:space="preserve">.”</w:t>
+      </w:r>
+      <w:r>
+        <w:t xml:space="preserve"> </w:t>
+      </w:r>
+      <w:r>
+        <w:rPr>
+          <w:i/>
+          <w:iCs/>
+        </w:rPr>
+        <w:t xml:space="preserve">Harvard Data Science Review</w:t>
+      </w:r>
+      <w:r>
+        <w:t xml:space="preserve">, no. Special Issue 5 (May).</w:t>
       </w:r>
       <w:r>
         <w:t xml:space="preserve"> </w:t>
@@ -1726,68 +2148,111 @@
           <w:rPr>
             <w:rStyle w:val="Hyperlink"/>
           </w:rPr>
-          <w:t xml:space="preserve">https://arxiv.org/abs/2509.19708</w:t>
+          <w:t xml:space="preserve">https://doi.org/10.1162/99608f92.88b4cc98</w:t>
         </w:r>
       </w:hyperlink>
       <w:r>
-        <w:t xml:space="preserve">, (2025). https://doi.org/</w:t>
-      </w:r>
-      <w:hyperlink r:id="rId62">
+        <w:t xml:space="preserve">.</w:t>
+      </w:r>
+    </w:p>
+    <w:bookmarkEnd w:id="62"/>
+    <w:bookmarkStart w:id="64" w:name="ref-liMultistepJailbreakingPrivacy2023"/>
+    <w:p>
+      <w:pPr>
+        <w:pStyle w:val="Bibliography"/>
+      </w:pPr>
+      <w:r>
+        <w:t xml:space="preserve">Li, Haoran, Dadi Guo, Wei Fan, Mingshi Xu, Jie Huang, Fanpu Meng, and Yangqiu Song. 2023.</w:t>
+      </w:r>
+      <w:r>
+        <w:t xml:space="preserve"> </w:t>
+      </w:r>
+      <w:r>
+        <w:t xml:space="preserve">“Multi-Step</w:t>
+      </w:r>
+      <w:r>
+        <w:t xml:space="preserve"> </w:t>
+      </w:r>
+      <w:r>
+        <w:t xml:space="preserve">Jailbreaking Privacy Attacks</w:t>
+      </w:r>
+      <w:r>
+        <w:t xml:space="preserve"> </w:t>
+      </w:r>
+      <w:r>
+        <w:t xml:space="preserve">on</w:t>
+      </w:r>
+      <w:r>
+        <w:t xml:space="preserve"> </w:t>
+      </w:r>
+      <w:r>
+        <w:t xml:space="preserve">ChatGPT</w:t>
+      </w:r>
+      <w:r>
+        <w:t xml:space="preserve">.”</w:t>
+      </w:r>
+      <w:r>
+        <w:t xml:space="preserve"> </w:t>
+      </w:r>
+      <w:r>
+        <w:t xml:space="preserve">arXiv.</w:t>
+      </w:r>
+      <w:r>
+        <w:t xml:space="preserve"> </w:t>
+      </w:r>
+      <w:hyperlink r:id="rId63">
         <w:r>
           <w:rPr>
             <w:rStyle w:val="Hyperlink"/>
           </w:rPr>
-          <w:t xml:space="preserve">10.48550/arXiv.2509.19708</w:t>
+          <w:t xml:space="preserve">https://doi.org/10.48550/arXiv.2304.05197</w:t>
         </w:r>
       </w:hyperlink>
       <w:r>
         <w:t xml:space="preserve">.</w:t>
       </w:r>
     </w:p>
-    <w:bookmarkEnd w:id="63"/>
-    <w:bookmarkStart w:id="65" w:name="ref-leslieFutureShockGenerative2024"/>
+    <w:bookmarkEnd w:id="64"/>
+    <w:bookmarkStart w:id="66" w:name="ref-linExplodingAIPower2024"/>
     <w:p>
       <w:pPr>
         <w:pStyle w:val="Bibliography"/>
       </w:pPr>
       <w:r>
-        <w:t xml:space="preserve">21.</w:t>
-      </w:r>
-      <w:r>
-        <w:t xml:space="preserve"> </w:t>
-      </w:r>
-      <w:r>
-        <w:t xml:space="preserve">	</w:t>
-      </w:r>
-      <w:r>
-        <w:t xml:space="preserve">Leslie, D., Perini, A.M.: Future</w:t>
-      </w:r>
-      <w:r>
-        <w:t xml:space="preserve"> </w:t>
-      </w:r>
-      <w:r>
-        <w:t xml:space="preserve">Shock</w:t>
-      </w:r>
-      <w:r>
-        <w:t xml:space="preserve">:</w:t>
-      </w:r>
-      <w:r>
-        <w:t xml:space="preserve"> </w:t>
-      </w:r>
-      <w:r>
-        <w:t xml:space="preserve">Generative AI</w:t>
-      </w:r>
-      <w:r>
-        <w:t xml:space="preserve"> </w:t>
-      </w:r>
-      <w:r>
-        <w:t xml:space="preserve">and the</w:t>
-      </w:r>
-      <w:r>
-        <w:t xml:space="preserve"> </w:t>
-      </w:r>
-      <w:r>
-        <w:t xml:space="preserve">International AI Policy</w:t>
+        <w:t xml:space="preserve">Lin, Liuzixuan, Rajini Wijayawardana, Varsha Rao, Hai Nguyen, Emmanuel Wedan Gnibga, and Andrew A. Chien. 2024.</w:t>
+      </w:r>
+      <w:r>
+        <w:t xml:space="preserve"> </w:t>
+      </w:r>
+      <w:r>
+        <w:t xml:space="preserve">“Exploding</w:t>
+      </w:r>
+      <w:r>
+        <w:t xml:space="preserve"> </w:t>
+      </w:r>
+      <w:r>
+        <w:t xml:space="preserve">AI Power Use</w:t>
+      </w:r>
+      <w:r>
+        <w:t xml:space="preserve">: An</w:t>
+      </w:r>
+      <w:r>
+        <w:t xml:space="preserve"> </w:t>
+      </w:r>
+      <w:r>
+        <w:t xml:space="preserve">Opportunity</w:t>
+      </w:r>
+      <w:r>
+        <w:t xml:space="preserve"> </w:t>
+      </w:r>
+      <w:r>
+        <w:t xml:space="preserve">to</w:t>
+      </w:r>
+      <w:r>
+        <w:t xml:space="preserve"> </w:t>
+      </w:r>
+      <w:r>
+        <w:t xml:space="preserve">Rethink Grid Planning</w:t>
       </w:r>
       <w:r>
         <w:t xml:space="preserve"> </w:t>
@@ -1799,187 +2264,265 @@
         <w:t xml:space="preserve"> </w:t>
       </w:r>
       <w:r>
-        <w:t xml:space="preserve">Governance Crisis</w:t>
-      </w:r>
-      <w:r>
-        <w:t xml:space="preserve">. Harvard Data Science Review. Special Issue 5, (2024). https://doi.org/</w:t>
-      </w:r>
-      <w:hyperlink r:id="rId64">
+        <w:t xml:space="preserve">Management</w:t>
+      </w:r>
+      <w:r>
+        <w:t xml:space="preserve">.”</w:t>
+      </w:r>
+      <w:r>
+        <w:t xml:space="preserve"> </w:t>
+      </w:r>
+      <w:r>
+        <w:t xml:space="preserve">In</w:t>
+      </w:r>
+      <w:r>
+        <w:t xml:space="preserve"> </w:t>
+      </w:r>
+      <w:r>
+        <w:rPr>
+          <w:i/>
+          <w:iCs/>
+        </w:rPr>
+        <w:t xml:space="preserve">The 15th</w:t>
+      </w:r>
+      <w:r>
+        <w:rPr>
+          <w:i/>
+          <w:iCs/>
+        </w:rPr>
+        <w:t xml:space="preserve"> </w:t>
+      </w:r>
+      <w:r>
+        <w:rPr>
+          <w:i/>
+          <w:iCs/>
+        </w:rPr>
+        <w:t xml:space="preserve">ACM International Conference</w:t>
+      </w:r>
+      <w:r>
+        <w:rPr>
+          <w:i/>
+          <w:iCs/>
+        </w:rPr>
+        <w:t xml:space="preserve"> </w:t>
+      </w:r>
+      <w:r>
+        <w:rPr>
+          <w:i/>
+          <w:iCs/>
+        </w:rPr>
+        <w:t xml:space="preserve">on</w:t>
+      </w:r>
+      <w:r>
+        <w:rPr>
+          <w:i/>
+          <w:iCs/>
+        </w:rPr>
+        <w:t xml:space="preserve"> </w:t>
+      </w:r>
+      <w:r>
+        <w:rPr>
+          <w:i/>
+          <w:iCs/>
+        </w:rPr>
+        <w:t xml:space="preserve">Future</w:t>
+      </w:r>
+      <w:r>
+        <w:rPr>
+          <w:i/>
+          <w:iCs/>
+        </w:rPr>
+        <w:t xml:space="preserve"> </w:t>
+      </w:r>
+      <w:r>
+        <w:rPr>
+          <w:i/>
+          <w:iCs/>
+        </w:rPr>
+        <w:t xml:space="preserve">and</w:t>
+      </w:r>
+      <w:r>
+        <w:rPr>
+          <w:i/>
+          <w:iCs/>
+        </w:rPr>
+        <w:t xml:space="preserve"> </w:t>
+      </w:r>
+      <w:r>
+        <w:rPr>
+          <w:i/>
+          <w:iCs/>
+        </w:rPr>
+        <w:t xml:space="preserve">Sustainable Energy Systems</w:t>
+      </w:r>
+      <w:r>
+        <w:t xml:space="preserve">, 434–41. Singapore Singapore: ACM.</w:t>
+      </w:r>
+      <w:r>
+        <w:t xml:space="preserve"> </w:t>
+      </w:r>
+      <w:hyperlink r:id="rId65">
         <w:r>
           <w:rPr>
             <w:rStyle w:val="Hyperlink"/>
           </w:rPr>
-          <w:t xml:space="preserve">10.1162/99608f92.88b4cc98</w:t>
+          <w:t xml:space="preserve">https://doi.org/10.1145/3632775.3661959</w:t>
         </w:r>
       </w:hyperlink>
       <w:r>
         <w:t xml:space="preserve">.</w:t>
       </w:r>
     </w:p>
-    <w:bookmarkEnd w:id="65"/>
-    <w:bookmarkStart w:id="68" w:name="ref-liMultistepJailbreakingPrivacy2023"/>
+    <w:bookmarkEnd w:id="66"/>
+    <w:bookmarkStart w:id="67" w:name="ref-mathurTechnologyFreedom"/>
     <w:p>
       <w:pPr>
         <w:pStyle w:val="Bibliography"/>
       </w:pPr>
       <w:r>
-        <w:t xml:space="preserve">22.</w:t>
-      </w:r>
-      <w:r>
-        <w:t xml:space="preserve"> </w:t>
-      </w:r>
-      <w:r>
-        <w:t xml:space="preserve">	</w:t>
-      </w:r>
-      <w:r>
-        <w:t xml:space="preserve">Li, H. et al.: Multi-step</w:t>
-      </w:r>
-      <w:r>
-        <w:t xml:space="preserve"> </w:t>
-      </w:r>
-      <w:r>
-        <w:t xml:space="preserve">Jailbreaking Privacy Attacks</w:t>
-      </w:r>
-      <w:r>
-        <w:t xml:space="preserve"> </w:t>
-      </w:r>
-      <w:r>
-        <w:t xml:space="preserve">on</w:t>
-      </w:r>
-      <w:r>
-        <w:t xml:space="preserve"> </w:t>
-      </w:r>
-      <w:r>
-        <w:t xml:space="preserve">ChatGPT</w:t>
-      </w:r>
-      <w:r>
-        <w:t xml:space="preserve">,</w:t>
-      </w:r>
-      <w:r>
-        <w:t xml:space="preserve"> </w:t>
-      </w:r>
-      <w:hyperlink r:id="rId66">
-        <w:r>
-          <w:rPr>
-            <w:rStyle w:val="Hyperlink"/>
-          </w:rPr>
-          <w:t xml:space="preserve">https://arxiv.org/abs/2304.05197</w:t>
-        </w:r>
-      </w:hyperlink>
-      <w:r>
-        <w:t xml:space="preserve">, (2023). https://doi.org/</w:t>
-      </w:r>
-      <w:hyperlink r:id="rId67">
-        <w:r>
-          <w:rPr>
-            <w:rStyle w:val="Hyperlink"/>
-          </w:rPr>
-          <w:t xml:space="preserve">10.48550/arXiv.2304.05197</w:t>
-        </w:r>
-      </w:hyperlink>
-      <w:r>
-        <w:t xml:space="preserve">.</w:t>
+        <w:t xml:space="preserve">Mathur, A B. n.d.</w:t>
+      </w:r>
+      <w:r>
+        <w:t xml:space="preserve"> </w:t>
+      </w:r>
+      <w:r>
+        <w:t xml:space="preserve">“Technology and</w:t>
+      </w:r>
+      <w:r>
+        <w:t xml:space="preserve"> </w:t>
+      </w:r>
+      <w:r>
+        <w:t xml:space="preserve">Freedom</w:t>
+      </w:r>
+      <w:r>
+        <w:t xml:space="preserve">.”</w:t>
+      </w:r>
+    </w:p>
+    <w:bookmarkEnd w:id="67"/>
+    <w:bookmarkStart w:id="68" w:name="ref-miklianNewDigitalDivide"/>
+    <w:p>
+      <w:pPr>
+        <w:pStyle w:val="Bibliography"/>
+      </w:pPr>
+      <w:r>
+        <w:t xml:space="preserve">Miklian, Jason, and Kristian Hoelscher. n.d.</w:t>
+      </w:r>
+      <w:r>
+        <w:t xml:space="preserve"> </w:t>
+      </w:r>
+      <w:r>
+        <w:t xml:space="preserve">“A New Digital Divide?</w:t>
+      </w:r>
+      <w:r>
+        <w:t xml:space="preserve"> </w:t>
+      </w:r>
+      <w:r>
+        <w:t xml:space="preserve">Coder</w:t>
+      </w:r>
+      <w:r>
+        <w:t xml:space="preserve"> </w:t>
+      </w:r>
+      <w:r>
+        <w:t xml:space="preserve">Worldviews, the</w:t>
+      </w:r>
+      <w:r>
+        <w:t xml:space="preserve"> </w:t>
+      </w:r>
+      <w:r>
+        <w:t xml:space="preserve">‘</w:t>
+      </w:r>
+      <w:r>
+        <w:t xml:space="preserve">Slop</w:t>
+      </w:r>
+      <w:r>
+        <w:t xml:space="preserve"> </w:t>
+      </w:r>
+      <w:r>
+        <w:t xml:space="preserve">Economy,’</w:t>
+      </w:r>
+      <w:r>
+        <w:t xml:space="preserve"> </w:t>
+      </w:r>
+      <w:r>
+        <w:t xml:space="preserve">and Democracy in the Age of</w:t>
+      </w:r>
+      <w:r>
+        <w:t xml:space="preserve"> </w:t>
+      </w:r>
+      <w:r>
+        <w:t xml:space="preserve">AI</w:t>
+      </w:r>
+      <w:r>
+        <w:t xml:space="preserve">.”</w:t>
       </w:r>
     </w:p>
     <w:bookmarkEnd w:id="68"/>
-    <w:bookmarkStart w:id="70" w:name="ref-linExplodingAIPower2024"/>
+    <w:bookmarkStart w:id="70" w:name="ref-millerAIHyperrealismWhy2023"/>
     <w:p>
       <w:pPr>
         <w:pStyle w:val="Bibliography"/>
       </w:pPr>
       <w:r>
-        <w:t xml:space="preserve">23.</w:t>
-      </w:r>
-      <w:r>
-        <w:t xml:space="preserve"> </w:t>
-      </w:r>
-      <w:r>
-        <w:t xml:space="preserve">	</w:t>
-      </w:r>
-      <w:r>
-        <w:t xml:space="preserve">Lin, L. et al.: Exploding</w:t>
-      </w:r>
-      <w:r>
-        <w:t xml:space="preserve"> </w:t>
-      </w:r>
-      <w:r>
-        <w:t xml:space="preserve">AI Power Use</w:t>
-      </w:r>
-      <w:r>
-        <w:t xml:space="preserve">: An</w:t>
-      </w:r>
-      <w:r>
-        <w:t xml:space="preserve"> </w:t>
-      </w:r>
-      <w:r>
-        <w:t xml:space="preserve">Opportunity</w:t>
-      </w:r>
-      <w:r>
-        <w:t xml:space="preserve"> </w:t>
-      </w:r>
-      <w:r>
-        <w:t xml:space="preserve">to</w:t>
-      </w:r>
-      <w:r>
-        <w:t xml:space="preserve"> </w:t>
-      </w:r>
-      <w:r>
-        <w:t xml:space="preserve">Rethink Grid Planning</w:t>
-      </w:r>
-      <w:r>
-        <w:t xml:space="preserve"> </w:t>
-      </w:r>
-      <w:r>
-        <w:t xml:space="preserve">and</w:t>
-      </w:r>
-      <w:r>
-        <w:t xml:space="preserve"> </w:t>
-      </w:r>
-      <w:r>
-        <w:t xml:space="preserve">Management</w:t>
-      </w:r>
-      <w:r>
-        <w:t xml:space="preserve">. In: The 15th</w:t>
-      </w:r>
-      <w:r>
-        <w:t xml:space="preserve"> </w:t>
-      </w:r>
-      <w:r>
-        <w:t xml:space="preserve">ACM International Conference</w:t>
-      </w:r>
-      <w:r>
-        <w:t xml:space="preserve"> </w:t>
-      </w:r>
-      <w:r>
-        <w:t xml:space="preserve">on</w:t>
-      </w:r>
-      <w:r>
-        <w:t xml:space="preserve"> </w:t>
-      </w:r>
-      <w:r>
-        <w:t xml:space="preserve">Future</w:t>
-      </w:r>
-      <w:r>
-        <w:t xml:space="preserve"> </w:t>
-      </w:r>
-      <w:r>
-        <w:t xml:space="preserve">and</w:t>
-      </w:r>
-      <w:r>
-        <w:t xml:space="preserve"> </w:t>
-      </w:r>
-      <w:r>
-        <w:t xml:space="preserve">Sustainable Energy Systems</w:t>
-      </w:r>
-      <w:r>
-        <w:t xml:space="preserve">. pp. 434–441 ACM, Singapore Singapore (2024). https://doi.org/</w:t>
+        <w:t xml:space="preserve">Miller, Elizabeth J., Ben A. Steward, Zak Witkower, Clare A. M. Sutherland, Eva G. Krumhuber, and Amy Dawel. 2023.</w:t>
+      </w:r>
+      <w:r>
+        <w:t xml:space="preserve"> </w:t>
+      </w:r>
+      <w:r>
+        <w:t xml:space="preserve">“</w:t>
+      </w:r>
+      <w:r>
+        <w:t xml:space="preserve">AI Hyperrealism</w:t>
+      </w:r>
+      <w:r>
+        <w:t xml:space="preserve">:</w:t>
+      </w:r>
+      <w:r>
+        <w:t xml:space="preserve"> </w:t>
+      </w:r>
+      <w:r>
+        <w:t xml:space="preserve">Why AI Faces Are Perceived</w:t>
+      </w:r>
+      <w:r>
+        <w:t xml:space="preserve"> </w:t>
+      </w:r>
+      <w:r>
+        <w:t xml:space="preserve">as</w:t>
+      </w:r>
+      <w:r>
+        <w:t xml:space="preserve"> </w:t>
+      </w:r>
+      <w:r>
+        <w:t xml:space="preserve">More Real Than Human Ones</w:t>
+      </w:r>
+      <w:r>
+        <w:t xml:space="preserve">.”</w:t>
+      </w:r>
+      <w:r>
+        <w:t xml:space="preserve"> </w:t>
+      </w:r>
+      <w:r>
+        <w:rPr>
+          <w:i/>
+          <w:iCs/>
+        </w:rPr>
+        <w:t xml:space="preserve">Psychological Science</w:t>
+      </w:r>
+      <w:r>
+        <w:t xml:space="preserve"> </w:t>
+      </w:r>
+      <w:r>
+        <w:t xml:space="preserve">34 (12): 1390–1403.</w:t>
+      </w:r>
+      <w:r>
+        <w:t xml:space="preserve"> </w:t>
       </w:r>
       <w:hyperlink r:id="rId69">
         <w:r>
           <w:rPr>
             <w:rStyle w:val="Hyperlink"/>
           </w:rPr>
-          <w:t xml:space="preserve">10.1145/3632775.3661959</w:t>
+          <w:t xml:space="preserve">https://doi.org/10.1177/09567976231207095</w:t>
         </w:r>
       </w:hyperlink>
       <w:r>
@@ -1987,62 +2530,101 @@
       </w:r>
     </w:p>
     <w:bookmarkEnd w:id="70"/>
-    <w:bookmarkStart w:id="71" w:name="ref-mathurTechnologyFreedom"/>
+    <w:bookmarkStart w:id="72" w:name="ref-morrowWhenTechnologiesMakes2014"/>
     <w:p>
       <w:pPr>
         <w:pStyle w:val="Bibliography"/>
       </w:pPr>
       <w:r>
-        <w:t xml:space="preserve">24.</w:t>
-      </w:r>
-      <w:r>
-        <w:t xml:space="preserve"> </w:t>
-      </w:r>
-      <w:r>
-        <w:t xml:space="preserve">	</w:t>
-      </w:r>
-      <w:r>
-        <w:t xml:space="preserve">Mathur, A.B.: Technology and</w:t>
-      </w:r>
-      <w:r>
-        <w:t xml:space="preserve"> </w:t>
-      </w:r>
-      <w:r>
-        <w:t xml:space="preserve">Freedom</w:t>
-      </w:r>
+        <w:t xml:space="preserve">Morrow, David R. 2014.</w:t>
+      </w:r>
+      <w:r>
+        <w:t xml:space="preserve"> </w:t>
+      </w:r>
+      <w:r>
+        <w:t xml:space="preserve">“When</w:t>
+      </w:r>
+      <w:r>
+        <w:t xml:space="preserve"> </w:t>
+      </w:r>
+      <w:r>
+        <w:t xml:space="preserve">Technologies Makes Good People Do Bad Things</w:t>
+      </w:r>
+      <w:r>
+        <w:t xml:space="preserve">:</w:t>
+      </w:r>
+      <w:r>
+        <w:t xml:space="preserve"> </w:t>
+      </w:r>
+      <w:r>
+        <w:t xml:space="preserve">Another Argument Against</w:t>
+      </w:r>
+      <w:r>
+        <w:t xml:space="preserve"> </w:t>
+      </w:r>
+      <w:r>
+        <w:t xml:space="preserve">the</w:t>
+      </w:r>
+      <w:r>
+        <w:t xml:space="preserve"> </w:t>
+      </w:r>
+      <w:r>
+        <w:t xml:space="preserve">Value-Neutrality</w:t>
+      </w:r>
+      <w:r>
+        <w:t xml:space="preserve"> </w:t>
+      </w:r>
+      <w:r>
+        <w:t xml:space="preserve">of</w:t>
+      </w:r>
+      <w:r>
+        <w:t xml:space="preserve"> </w:t>
+      </w:r>
+      <w:r>
+        <w:t xml:space="preserve">Technologies</w:t>
+      </w:r>
+      <w:r>
+        <w:t xml:space="preserve">.”</w:t>
+      </w:r>
+      <w:r>
+        <w:t xml:space="preserve"> </w:t>
+      </w:r>
+      <w:r>
+        <w:rPr>
+          <w:i/>
+          <w:iCs/>
+        </w:rPr>
+        <w:t xml:space="preserve">Science and Engineering Ethics</w:t>
+      </w:r>
+      <w:r>
+        <w:t xml:space="preserve"> </w:t>
+      </w:r>
+      <w:r>
+        <w:t xml:space="preserve">20 (2): 329–43.</w:t>
+      </w:r>
+      <w:r>
+        <w:t xml:space="preserve"> </w:t>
+      </w:r>
+      <w:hyperlink r:id="rId71">
+        <w:r>
+          <w:rPr>
+            <w:rStyle w:val="Hyperlink"/>
+          </w:rPr>
+          <w:t xml:space="preserve">https://doi.org/10.1007/s11948-013-9464-1</w:t>
+        </w:r>
+      </w:hyperlink>
       <w:r>
         <w:t xml:space="preserve">.</w:t>
       </w:r>
     </w:p>
-    <w:bookmarkEnd w:id="71"/>
-    <w:bookmarkStart w:id="72" w:name="ref-miklianNewDigitalDivide"/>
+    <w:bookmarkEnd w:id="72"/>
+    <w:bookmarkStart w:id="74" w:name="ref-moutaWhereAgencyMoving2025"/>
     <w:p>
       <w:pPr>
         <w:pStyle w:val="Bibliography"/>
       </w:pPr>
       <w:r>
-        <w:t xml:space="preserve">25.</w:t>
-      </w:r>
-      <w:r>
-        <w:t xml:space="preserve"> </w:t>
-      </w:r>
-      <w:r>
-        <w:t xml:space="preserve">	</w:t>
-      </w:r>
-      <w:r>
-        <w:t xml:space="preserve">Miklian, J., Hoelscher, K.: A new digital divide?</w:t>
-      </w:r>
-      <w:r>
-        <w:t xml:space="preserve"> </w:t>
-      </w:r>
-      <w:r>
-        <w:t xml:space="preserve">Coder</w:t>
-      </w:r>
-      <w:r>
-        <w:t xml:space="preserve"> </w:t>
-      </w:r>
-      <w:r>
-        <w:t xml:space="preserve">worldviews, the</w:t>
+        <w:t xml:space="preserve">Mouta, Ana, Ana María Pinto-Llorente, and Eva María Torrecilla-Sánchez. 2025.</w:t>
       </w:r>
       <w:r>
         <w:t xml:space="preserve"> </w:t>
@@ -2051,53 +2633,28 @@
         <w:t xml:space="preserve">“</w:t>
       </w:r>
       <w:r>
-        <w:t xml:space="preserve">Slop</w:t>
-      </w:r>
-      <w:r>
-        <w:t xml:space="preserve"> </w:t>
-      </w:r>
-      <w:r>
-        <w:t xml:space="preserve">economy,”</w:t>
-      </w:r>
-      <w:r>
-        <w:t xml:space="preserve"> </w:t>
-      </w:r>
-      <w:r>
-        <w:t xml:space="preserve">and democracy in the age of</w:t>
-      </w:r>
-      <w:r>
-        <w:t xml:space="preserve"> </w:t>
-      </w:r>
-      <w:r>
-        <w:t xml:space="preserve">AI</w:t>
-      </w:r>
-      <w:r>
-        <w:t xml:space="preserve">.</w:t>
-      </w:r>
-    </w:p>
-    <w:bookmarkEnd w:id="72"/>
-    <w:bookmarkStart w:id="74" w:name="ref-millerAIHyperrealismWhy2023"/>
-    <w:p>
-      <w:pPr>
-        <w:pStyle w:val="Bibliography"/>
-      </w:pPr>
-      <w:r>
-        <w:t xml:space="preserve">26.</w:t>
-      </w:r>
-      <w:r>
-        <w:t xml:space="preserve"> </w:t>
-      </w:r>
-      <w:r>
-        <w:t xml:space="preserve">	</w:t>
-      </w:r>
-      <w:r>
-        <w:t xml:space="preserve">Miller, E.J. et al.:</w:t>
-      </w:r>
-      <w:r>
-        <w:t xml:space="preserve"> </w:t>
-      </w:r>
-      <w:r>
-        <w:t xml:space="preserve">AI Hyperrealism</w:t>
+        <w:t xml:space="preserve">‘</w:t>
+      </w:r>
+      <w:r>
+        <w:t xml:space="preserve">Where</w:t>
+      </w:r>
+      <w:r>
+        <w:t xml:space="preserve"> </w:t>
+      </w:r>
+      <w:r>
+        <w:t xml:space="preserve">Is</w:t>
+      </w:r>
+      <w:r>
+        <w:t xml:space="preserve"> </w:t>
+      </w:r>
+      <w:r>
+        <w:t xml:space="preserve">Agency Moving</w:t>
+      </w:r>
+      <w:r>
+        <w:t xml:space="preserve"> </w:t>
+      </w:r>
+      <w:r>
+        <w:t xml:space="preserve">to?’</w:t>
       </w:r>
       <w:r>
         <w:t xml:space="preserve">:</w:t>
@@ -2106,29 +2663,84 @@
         <w:t xml:space="preserve"> </w:t>
       </w:r>
       <w:r>
-        <w:t xml:space="preserve">Why AI Faces Are Perceived</w:t>
-      </w:r>
-      <w:r>
-        <w:t xml:space="preserve"> </w:t>
-      </w:r>
-      <w:r>
-        <w:t xml:space="preserve">as</w:t>
-      </w:r>
-      <w:r>
-        <w:t xml:space="preserve"> </w:t>
-      </w:r>
-      <w:r>
-        <w:t xml:space="preserve">More Real Than Human Ones</w:t>
-      </w:r>
-      <w:r>
-        <w:t xml:space="preserve">. Psychological Science. 34, 12, 1390–1403 (2023). https://doi.org/</w:t>
+        <w:t xml:space="preserve">Exploring</w:t>
+      </w:r>
+      <w:r>
+        <w:t xml:space="preserve"> </w:t>
+      </w:r>
+      <w:r>
+        <w:t xml:space="preserve">the</w:t>
+      </w:r>
+      <w:r>
+        <w:t xml:space="preserve"> </w:t>
+      </w:r>
+      <w:r>
+        <w:t xml:space="preserve">Interplay</w:t>
+      </w:r>
+      <w:r>
+        <w:t xml:space="preserve"> </w:t>
+      </w:r>
+      <w:r>
+        <w:t xml:space="preserve">Between</w:t>
+      </w:r>
+      <w:r>
+        <w:t xml:space="preserve"> </w:t>
+      </w:r>
+      <w:r>
+        <w:t xml:space="preserve">AI Technologies</w:t>
+      </w:r>
+      <w:r>
+        <w:t xml:space="preserve"> </w:t>
+      </w:r>
+      <w:r>
+        <w:t xml:space="preserve">in</w:t>
+      </w:r>
+      <w:r>
+        <w:t xml:space="preserve"> </w:t>
+      </w:r>
+      <w:r>
+        <w:t xml:space="preserve">Education</w:t>
+      </w:r>
+      <w:r>
+        <w:t xml:space="preserve"> </w:t>
+      </w:r>
+      <w:r>
+        <w:t xml:space="preserve">and</w:t>
+      </w:r>
+      <w:r>
+        <w:t xml:space="preserve"> </w:t>
+      </w:r>
+      <w:r>
+        <w:t xml:space="preserve">Human Agency</w:t>
+      </w:r>
+      <w:r>
+        <w:t xml:space="preserve">.”</w:t>
+      </w:r>
+      <w:r>
+        <w:t xml:space="preserve"> </w:t>
+      </w:r>
+      <w:r>
+        <w:rPr>
+          <w:i/>
+          <w:iCs/>
+        </w:rPr>
+        <w:t xml:space="preserve">Digital Society</w:t>
+      </w:r>
+      <w:r>
+        <w:t xml:space="preserve"> </w:t>
+      </w:r>
+      <w:r>
+        <w:t xml:space="preserve">4 (2): 49.</w:t>
+      </w:r>
+      <w:r>
+        <w:t xml:space="preserve"> </w:t>
       </w:r>
       <w:hyperlink r:id="rId73">
         <w:r>
           <w:rPr>
             <w:rStyle w:val="Hyperlink"/>
           </w:rPr>
-          <w:t xml:space="preserve">10.1177/09567976231207095</w:t>
+          <w:t xml:space="preserve">https://doi.org/10.1007/s44206-025-00203-9</w:t>
         </w:r>
       </w:hyperlink>
       <w:r>
@@ -2136,28 +2748,25 @@
       </w:r>
     </w:p>
     <w:bookmarkEnd w:id="74"/>
-    <w:bookmarkStart w:id="76" w:name="ref-morrowWhenTechnologiesMakes2014"/>
+    <w:bookmarkStart w:id="76" w:name="ref-perezIgnorePreviousPrompt2022"/>
     <w:p>
       <w:pPr>
         <w:pStyle w:val="Bibliography"/>
       </w:pPr>
       <w:r>
-        <w:t xml:space="preserve">27.</w:t>
-      </w:r>
-      <w:r>
-        <w:t xml:space="preserve"> </w:t>
-      </w:r>
-      <w:r>
-        <w:t xml:space="preserve">	</w:t>
-      </w:r>
-      <w:r>
-        <w:t xml:space="preserve">Morrow, D.R.: When</w:t>
-      </w:r>
-      <w:r>
-        <w:t xml:space="preserve"> </w:t>
-      </w:r>
-      <w:r>
-        <w:t xml:space="preserve">Technologies Makes Good People Do Bad Things</w:t>
+        <w:t xml:space="preserve">Perez, Fábio, and Ian Ribeiro. 2022.</w:t>
+      </w:r>
+      <w:r>
+        <w:t xml:space="preserve"> </w:t>
+      </w:r>
+      <w:r>
+        <w:t xml:space="preserve">“Ignore</w:t>
+      </w:r>
+      <w:r>
+        <w:t xml:space="preserve"> </w:t>
+      </w:r>
+      <w:r>
+        <w:t xml:space="preserve">Previous Prompt</w:t>
       </w:r>
       <w:r>
         <w:t xml:space="preserve">:</w:t>
@@ -2166,41 +2775,26 @@
         <w:t xml:space="preserve"> </w:t>
       </w:r>
       <w:r>
-        <w:t xml:space="preserve">Another Argument Against</w:t>
-      </w:r>
-      <w:r>
-        <w:t xml:space="preserve"> </w:t>
-      </w:r>
-      <w:r>
-        <w:t xml:space="preserve">the</w:t>
-      </w:r>
-      <w:r>
-        <w:t xml:space="preserve"> </w:t>
-      </w:r>
-      <w:r>
-        <w:t xml:space="preserve">Value-Neutrality</w:t>
-      </w:r>
-      <w:r>
-        <w:t xml:space="preserve"> </w:t>
-      </w:r>
-      <w:r>
-        <w:t xml:space="preserve">of</w:t>
-      </w:r>
-      <w:r>
-        <w:t xml:space="preserve"> </w:t>
-      </w:r>
-      <w:r>
-        <w:t xml:space="preserve">Technologies</w:t>
-      </w:r>
-      <w:r>
-        <w:t xml:space="preserve">. Science and Engineering Ethics. 20, 2, 329–343 (2014). https://doi.org/</w:t>
+        <w:t xml:space="preserve">Attack Techniques For Language Models</w:t>
+      </w:r>
+      <w:r>
+        <w:t xml:space="preserve">.”</w:t>
+      </w:r>
+      <w:r>
+        <w:t xml:space="preserve"> </w:t>
+      </w:r>
+      <w:r>
+        <w:t xml:space="preserve">arXiv.</w:t>
+      </w:r>
+      <w:r>
+        <w:t xml:space="preserve"> </w:t>
       </w:r>
       <w:hyperlink r:id="rId75">
         <w:r>
           <w:rPr>
             <w:rStyle w:val="Hyperlink"/>
           </w:rPr>
-          <w:t xml:space="preserve">10.1007/s11948-013-9464-1</w:t>
+          <w:t xml:space="preserve">https://doi.org/10.48550/arXiv.2211.09527</w:t>
         </w:r>
       </w:hyperlink>
       <w:r>
@@ -2208,22 +2802,56 @@
       </w:r>
     </w:p>
     <w:bookmarkEnd w:id="76"/>
-    <w:bookmarkStart w:id="78" w:name="ref-moutaWhereAgencyMoving2025"/>
+    <w:bookmarkStart w:id="77" w:name="ref-pewFutureHuman2023"/>
     <w:p>
       <w:pPr>
         <w:pStyle w:val="Bibliography"/>
       </w:pPr>
       <w:r>
-        <w:t xml:space="preserve">28.</w:t>
-      </w:r>
-      <w:r>
-        <w:t xml:space="preserve"> </w:t>
-      </w:r>
-      <w:r>
-        <w:t xml:space="preserve">	</w:t>
-      </w:r>
-      <w:r>
-        <w:t xml:space="preserve">Mouta, A. et al.:</w:t>
+        <w:t xml:space="preserve">Pew Research Center, Janna Anderson, and Lee Rainie. 2023.</w:t>
+      </w:r>
+      <w:r>
+        <w:t xml:space="preserve"> </w:t>
+      </w:r>
+      <w:r>
+        <w:t xml:space="preserve">“The</w:t>
+      </w:r>
+      <w:r>
+        <w:t xml:space="preserve"> </w:t>
+      </w:r>
+      <w:r>
+        <w:t xml:space="preserve">Future</w:t>
+      </w:r>
+      <w:r>
+        <w:t xml:space="preserve"> </w:t>
+      </w:r>
+      <w:r>
+        <w:t xml:space="preserve">of</w:t>
+      </w:r>
+      <w:r>
+        <w:t xml:space="preserve"> </w:t>
+      </w:r>
+      <w:r>
+        <w:t xml:space="preserve">Human Agency</w:t>
+      </w:r>
+      <w:r>
+        <w:t xml:space="preserve">,”</w:t>
+      </w:r>
+      <w:r>
+        <w:t xml:space="preserve"> </w:t>
+      </w:r>
+      <w:r>
+        <w:t xml:space="preserve">February.</w:t>
+      </w:r>
+    </w:p>
+    <w:bookmarkEnd w:id="77"/>
+    <w:bookmarkStart w:id="79" w:name="ref-pinskiAILiteracyUsers2024"/>
+    <w:p>
+      <w:pPr>
+        <w:pStyle w:val="Bibliography"/>
+      </w:pPr>
+      <w:r>
+        <w:t xml:space="preserve">Pinski, Marc, and Alexander Benlian. 2024.</w:t>
       </w:r>
       <w:r>
         <w:t xml:space="preserve"> </w:t>
@@ -2232,183 +2860,340 @@
         <w:t xml:space="preserve">“</w:t>
       </w:r>
       <w:r>
-        <w:t xml:space="preserve">Where</w:t>
-      </w:r>
-      <w:r>
-        <w:t xml:space="preserve"> </w:t>
-      </w:r>
-      <w:r>
-        <w:t xml:space="preserve">is</w:t>
-      </w:r>
-      <w:r>
-        <w:t xml:space="preserve"> </w:t>
-      </w:r>
-      <w:r>
-        <w:t xml:space="preserve">Agency Moving</w:t>
-      </w:r>
-      <w:r>
-        <w:t xml:space="preserve"> </w:t>
-      </w:r>
-      <w:r>
-        <w:t xml:space="preserve">to?”</w:t>
-      </w:r>
-      <w:r>
-        <w:t xml:space="preserve">:</w:t>
-      </w:r>
-      <w:r>
-        <w:t xml:space="preserve"> </w:t>
-      </w:r>
-      <w:r>
-        <w:t xml:space="preserve">Exploring</w:t>
-      </w:r>
-      <w:r>
-        <w:t xml:space="preserve"> </w:t>
-      </w:r>
-      <w:r>
-        <w:t xml:space="preserve">the</w:t>
-      </w:r>
-      <w:r>
-        <w:t xml:space="preserve"> </w:t>
-      </w:r>
-      <w:r>
-        <w:t xml:space="preserve">Interplay</w:t>
-      </w:r>
-      <w:r>
-        <w:t xml:space="preserve"> </w:t>
-      </w:r>
-      <w:r>
-        <w:t xml:space="preserve">between</w:t>
-      </w:r>
-      <w:r>
-        <w:t xml:space="preserve"> </w:t>
-      </w:r>
-      <w:r>
-        <w:t xml:space="preserve">AI Technologies</w:t>
-      </w:r>
-      <w:r>
-        <w:t xml:space="preserve"> </w:t>
-      </w:r>
-      <w:r>
-        <w:t xml:space="preserve">in</w:t>
-      </w:r>
-      <w:r>
-        <w:t xml:space="preserve"> </w:t>
-      </w:r>
-      <w:r>
-        <w:t xml:space="preserve">Education</w:t>
-      </w:r>
-      <w:r>
-        <w:t xml:space="preserve"> </w:t>
-      </w:r>
-      <w:r>
-        <w:t xml:space="preserve">and</w:t>
-      </w:r>
-      <w:r>
-        <w:t xml:space="preserve"> </w:t>
-      </w:r>
-      <w:r>
-        <w:t xml:space="preserve">Human Agency</w:t>
-      </w:r>
-      <w:r>
-        <w:t xml:space="preserve">. Digital Society. 4, 2, 49 (2025). https://doi.org/</w:t>
-      </w:r>
-      <w:hyperlink r:id="rId77">
+        <w:t xml:space="preserve">AI</w:t>
+      </w:r>
+      <w:r>
+        <w:t xml:space="preserve"> </w:t>
+      </w:r>
+      <w:r>
+        <w:t xml:space="preserve">Literacy for Users –</w:t>
+      </w:r>
+      <w:r>
+        <w:t xml:space="preserve"> </w:t>
+      </w:r>
+      <w:r>
+        <w:t xml:space="preserve">A</w:t>
+      </w:r>
+      <w:r>
+        <w:t xml:space="preserve"> </w:t>
+      </w:r>
+      <w:r>
+        <w:t xml:space="preserve">Comprehensive Review and Future Research Directions of Learning Methods, Components, and Effects.”</w:t>
+      </w:r>
+      <w:r>
+        <w:t xml:space="preserve"> </w:t>
+      </w:r>
+      <w:r>
+        <w:rPr>
+          <w:i/>
+          <w:iCs/>
+        </w:rPr>
+        <w:t xml:space="preserve">Computers in Human Behavior: Artificial Humans</w:t>
+      </w:r>
+      <w:r>
+        <w:t xml:space="preserve"> </w:t>
+      </w:r>
+      <w:r>
+        <w:t xml:space="preserve">2 (1): 100062.</w:t>
+      </w:r>
+      <w:r>
+        <w:t xml:space="preserve"> </w:t>
+      </w:r>
+      <w:hyperlink r:id="rId78">
         <w:r>
           <w:rPr>
             <w:rStyle w:val="Hyperlink"/>
           </w:rPr>
-          <w:t xml:space="preserve">10.1007/s44206-025-00203-9</w:t>
+          <w:t xml:space="preserve">https://doi.org/10.1016/j.chbah.2024.100062</w:t>
         </w:r>
       </w:hyperlink>
       <w:r>
         <w:t xml:space="preserve">.</w:t>
       </w:r>
     </w:p>
-    <w:bookmarkEnd w:id="78"/>
-    <w:bookmarkStart w:id="81" w:name="ref-perezIgnorePreviousPrompt2022"/>
+    <w:bookmarkEnd w:id="79"/>
+    <w:bookmarkStart w:id="80" w:name="ref-PradosdelaEscosura_2022"/>
     <w:p>
       <w:pPr>
         <w:pStyle w:val="Bibliography"/>
       </w:pPr>
       <w:r>
-        <w:t xml:space="preserve">29.</w:t>
-      </w:r>
-      <w:r>
-        <w:t xml:space="preserve"> </w:t>
-      </w:r>
-      <w:r>
-        <w:t xml:space="preserve">	</w:t>
-      </w:r>
-      <w:r>
-        <w:t xml:space="preserve">Perez, F., Ribeiro, I.: Ignore</w:t>
-      </w:r>
-      <w:r>
-        <w:t xml:space="preserve"> </w:t>
-      </w:r>
-      <w:r>
-        <w:t xml:space="preserve">Previous Prompt</w:t>
-      </w:r>
-      <w:r>
-        <w:t xml:space="preserve">:</w:t>
-      </w:r>
-      <w:r>
-        <w:t xml:space="preserve"> </w:t>
-      </w:r>
-      <w:r>
-        <w:t xml:space="preserve">Attack Techniques For Language Models</w:t>
-      </w:r>
-      <w:r>
-        <w:t xml:space="preserve">,</w:t>
-      </w:r>
-      <w:r>
-        <w:t xml:space="preserve"> </w:t>
-      </w:r>
-      <w:hyperlink r:id="rId79">
+        <w:t xml:space="preserve">Prados de la Escosura, Leandro. 2022.</w:t>
+      </w:r>
+      <w:r>
+        <w:t xml:space="preserve"> </w:t>
+      </w:r>
+      <w:r>
+        <w:rPr>
+          <w:i/>
+          <w:iCs/>
+        </w:rPr>
+        <w:t xml:space="preserve">Human Development and the Path to Freedom: 1870 to the Present</w:t>
+      </w:r>
+      <w:r>
+        <w:t xml:space="preserve">. New Approaches to Economic and Social History. Cambridge: Cambridge University Press.</w:t>
+      </w:r>
+    </w:p>
+    <w:bookmarkEnd w:id="80"/>
+    <w:bookmarkStart w:id="82" w:name="ref-registerLearningMachineLearning2020"/>
+    <w:p>
+      <w:pPr>
+        <w:pStyle w:val="Bibliography"/>
+      </w:pPr>
+      <w:r>
+        <w:t xml:space="preserve">Register, Yim, and Amy J. Ko. 2020.</w:t>
+      </w:r>
+      <w:r>
+        <w:t xml:space="preserve"> </w:t>
+      </w:r>
+      <w:r>
+        <w:t xml:space="preserve">“Learning</w:t>
+      </w:r>
+      <w:r>
+        <w:t xml:space="preserve"> </w:t>
+      </w:r>
+      <w:r>
+        <w:t xml:space="preserve">Machine Learning</w:t>
+      </w:r>
+      <w:r>
+        <w:t xml:space="preserve"> </w:t>
+      </w:r>
+      <w:r>
+        <w:t xml:space="preserve">with</w:t>
+      </w:r>
+      <w:r>
+        <w:t xml:space="preserve"> </w:t>
+      </w:r>
+      <w:r>
+        <w:t xml:space="preserve">Personal Data Helps Stakeholders Ground Advocacy Arguments</w:t>
+      </w:r>
+      <w:r>
+        <w:t xml:space="preserve"> </w:t>
+      </w:r>
+      <w:r>
+        <w:t xml:space="preserve">in</w:t>
+      </w:r>
+      <w:r>
+        <w:t xml:space="preserve"> </w:t>
+      </w:r>
+      <w:r>
+        <w:t xml:space="preserve">Model Mechanics</w:t>
+      </w:r>
+      <w:r>
+        <w:t xml:space="preserve">.”</w:t>
+      </w:r>
+      <w:r>
+        <w:t xml:space="preserve"> </w:t>
+      </w:r>
+      <w:r>
+        <w:t xml:space="preserve">In</w:t>
+      </w:r>
+      <w:r>
+        <w:t xml:space="preserve"> </w:t>
+      </w:r>
+      <w:r>
+        <w:rPr>
+          <w:i/>
+          <w:iCs/>
+        </w:rPr>
+        <w:t xml:space="preserve">Proceedings of the 2020</w:t>
+      </w:r>
+      <w:r>
+        <w:rPr>
+          <w:i/>
+          <w:iCs/>
+        </w:rPr>
+        <w:t xml:space="preserve"> </w:t>
+      </w:r>
+      <w:r>
+        <w:rPr>
+          <w:i/>
+          <w:iCs/>
+        </w:rPr>
+        <w:t xml:space="preserve">ACM Conference</w:t>
+      </w:r>
+      <w:r>
+        <w:rPr>
+          <w:i/>
+          <w:iCs/>
+        </w:rPr>
+        <w:t xml:space="preserve"> </w:t>
+      </w:r>
+      <w:r>
+        <w:rPr>
+          <w:i/>
+          <w:iCs/>
+        </w:rPr>
+        <w:t xml:space="preserve">on</w:t>
+      </w:r>
+      <w:r>
+        <w:rPr>
+          <w:i/>
+          <w:iCs/>
+        </w:rPr>
+        <w:t xml:space="preserve"> </w:t>
+      </w:r>
+      <w:r>
+        <w:rPr>
+          <w:i/>
+          <w:iCs/>
+        </w:rPr>
+        <w:t xml:space="preserve">International Computing Education Research</w:t>
+      </w:r>
+      <w:r>
+        <w:t xml:space="preserve">, 67–78. Virtual Event New Zealand: ACM.</w:t>
+      </w:r>
+      <w:r>
+        <w:t xml:space="preserve"> </w:t>
+      </w:r>
+      <w:hyperlink r:id="rId81">
         <w:r>
           <w:rPr>
             <w:rStyle w:val="Hyperlink"/>
           </w:rPr>
-          <w:t xml:space="preserve">https://arxiv.org/abs/2211.09527</w:t>
+          <w:t xml:space="preserve">https://doi.org/10.1145/3372782.3406252</w:t>
         </w:r>
       </w:hyperlink>
       <w:r>
-        <w:t xml:space="preserve">, (2022). https://doi.org/</w:t>
-      </w:r>
-      <w:hyperlink r:id="rId80">
+        <w:t xml:space="preserve">.</w:t>
+      </w:r>
+    </w:p>
+    <w:bookmarkEnd w:id="82"/>
+    <w:bookmarkStart w:id="83" w:name="ref-senDevelopmentFreedom1999"/>
+    <w:p>
+      <w:pPr>
+        <w:pStyle w:val="Bibliography"/>
+      </w:pPr>
+      <w:r>
+        <w:t xml:space="preserve">Sen, Amartya. 1999.</w:t>
+      </w:r>
+      <w:r>
+        <w:t xml:space="preserve"> </w:t>
+      </w:r>
+      <w:r>
+        <w:rPr>
+          <w:i/>
+          <w:iCs/>
+        </w:rPr>
+        <w:t xml:space="preserve">Development as</w:t>
+      </w:r>
+      <w:r>
+        <w:rPr>
+          <w:i/>
+          <w:iCs/>
+        </w:rPr>
+        <w:t xml:space="preserve"> </w:t>
+      </w:r>
+      <w:r>
+        <w:rPr>
+          <w:i/>
+          <w:iCs/>
+        </w:rPr>
+        <w:t xml:space="preserve">Freedom</w:t>
+      </w:r>
+      <w:r>
+        <w:t xml:space="preserve">. Oxford University Press.</w:t>
+      </w:r>
+    </w:p>
+    <w:bookmarkEnd w:id="83"/>
+    <w:bookmarkStart w:id="85" w:name="ref-udehRoleGenerativeAI2025"/>
+    <w:p>
+      <w:pPr>
+        <w:pStyle w:val="Bibliography"/>
+      </w:pPr>
+      <w:r>
+        <w:t xml:space="preserve">Udeh, Chinemelum Goodness. 2025.</w:t>
+      </w:r>
+      <w:r>
+        <w:t xml:space="preserve"> </w:t>
+      </w:r>
+      <w:r>
+        <w:t xml:space="preserve">“The Role of Generative</w:t>
+      </w:r>
+      <w:r>
+        <w:t xml:space="preserve"> </w:t>
+      </w:r>
+      <w:r>
+        <w:t xml:space="preserve">AI</w:t>
+      </w:r>
+      <w:r>
+        <w:t xml:space="preserve"> </w:t>
+      </w:r>
+      <w:r>
+        <w:t xml:space="preserve">in Personalized Learning for Higher Education.”</w:t>
+      </w:r>
+      <w:r>
+        <w:t xml:space="preserve"> </w:t>
+      </w:r>
+      <w:r>
+        <w:rPr>
+          <w:i/>
+          <w:iCs/>
+        </w:rPr>
+        <w:t xml:space="preserve">World Journal of Advanced Engineering Technology and Sciences</w:t>
+      </w:r>
+      <w:r>
+        <w:t xml:space="preserve"> </w:t>
+      </w:r>
+      <w:r>
+        <w:t xml:space="preserve">14 (2): 205–7.</w:t>
+      </w:r>
+      <w:r>
+        <w:t xml:space="preserve"> </w:t>
+      </w:r>
+      <w:hyperlink r:id="rId84">
         <w:r>
           <w:rPr>
             <w:rStyle w:val="Hyperlink"/>
           </w:rPr>
-          <w:t xml:space="preserve">10.48550/arXiv.2211.09527</w:t>
+          <w:t xml:space="preserve">https://doi.org/10.30574/wjaets.2025.14.2.0077</w:t>
         </w:r>
       </w:hyperlink>
       <w:r>
         <w:t xml:space="preserve">.</w:t>
       </w:r>
     </w:p>
-    <w:bookmarkEnd w:id="81"/>
-    <w:bookmarkStart w:id="82" w:name="ref-pewFutureHuman2023"/>
+    <w:bookmarkEnd w:id="85"/>
+    <w:bookmarkStart w:id="87" w:name="ref-vanhaeftenBridgingAISkills2024"/>
     <w:p>
       <w:pPr>
         <w:pStyle w:val="Bibliography"/>
       </w:pPr>
       <w:r>
-        <w:t xml:space="preserve">30.</w:t>
-      </w:r>
-      <w:r>
-        <w:t xml:space="preserve"> </w:t>
-      </w:r>
-      <w:r>
-        <w:t xml:space="preserve">	</w:t>
-      </w:r>
-      <w:r>
-        <w:t xml:space="preserve">Pew Research Center et al.: The</w:t>
-      </w:r>
-      <w:r>
-        <w:t xml:space="preserve"> </w:t>
-      </w:r>
-      <w:r>
-        <w:t xml:space="preserve">Future</w:t>
+        <w:t xml:space="preserve">Van Haeften, Willemijn, Ran Zhang, Sabine Boesen - Mariani, Xander Lub, Pascal Ravesteijn, and Paul Aertsen. 2024.</w:t>
+      </w:r>
+      <w:r>
+        <w:t xml:space="preserve"> </w:t>
+      </w:r>
+      <w:r>
+        <w:t xml:space="preserve">“Bridging the</w:t>
+      </w:r>
+      <w:r>
+        <w:t xml:space="preserve"> </w:t>
+      </w:r>
+      <w:r>
+        <w:t xml:space="preserve">AI Skills Gap</w:t>
+      </w:r>
+      <w:r>
+        <w:t xml:space="preserve"> </w:t>
+      </w:r>
+      <w:r>
+        <w:t xml:space="preserve">in</w:t>
+      </w:r>
+      <w:r>
+        <w:t xml:space="preserve"> </w:t>
+      </w:r>
+      <w:r>
+        <w:t xml:space="preserve">Europe</w:t>
+      </w:r>
+      <w:r>
+        <w:t xml:space="preserve">:</w:t>
+      </w:r>
+      <w:r>
+        <w:t xml:space="preserve"> </w:t>
+      </w:r>
+      <w:r>
+        <w:t xml:space="preserve">A Detailed Analysis</w:t>
       </w:r>
       <w:r>
         <w:t xml:space="preserve"> </w:t>
@@ -2420,163 +3205,114 @@
         <w:t xml:space="preserve"> </w:t>
       </w:r>
       <w:r>
-        <w:t xml:space="preserve">Human Agency</w:t>
-      </w:r>
-      <w:r>
-        <w:t xml:space="preserve">. (2023).</w:t>
-      </w:r>
-    </w:p>
-    <w:bookmarkEnd w:id="82"/>
-    <w:bookmarkStart w:id="84" w:name="ref-pinskiAILiteracyUsers2024"/>
-    <w:p>
-      <w:pPr>
-        <w:pStyle w:val="Bibliography"/>
-      </w:pPr>
-      <w:r>
-        <w:t xml:space="preserve">31.</w:t>
-      </w:r>
-      <w:r>
-        <w:t xml:space="preserve"> </w:t>
-      </w:r>
-      <w:r>
-        <w:t xml:space="preserve">	</w:t>
-      </w:r>
-      <w:r>
-        <w:t xml:space="preserve">Pinski, M., Benlian, A.:</w:t>
-      </w:r>
-      <w:r>
-        <w:t xml:space="preserve"> </w:t>
-      </w:r>
-      <w:r>
-        <w:t xml:space="preserve">AI</w:t>
-      </w:r>
-      <w:r>
-        <w:t xml:space="preserve"> </w:t>
-      </w:r>
-      <w:r>
-        <w:t xml:space="preserve">literacy for users –</w:t>
-      </w:r>
-      <w:r>
-        <w:t xml:space="preserve"> </w:t>
-      </w:r>
-      <w:r>
-        <w:t xml:space="preserve">A</w:t>
-      </w:r>
-      <w:r>
-        <w:t xml:space="preserve"> </w:t>
-      </w:r>
-      <w:r>
-        <w:t xml:space="preserve">comprehensive review and future research directions of learning methods, components, and effects. Computers in Human Behavior: Artificial Humans. 2, 1, 100062 (2024). https://doi.org/</w:t>
-      </w:r>
-      <w:hyperlink r:id="rId83">
-        <w:r>
-          <w:rPr>
-            <w:rStyle w:val="Hyperlink"/>
-          </w:rPr>
-          <w:t xml:space="preserve">10.1016/j.chbah.2024.100062</w:t>
-        </w:r>
-      </w:hyperlink>
-      <w:r>
-        <w:t xml:space="preserve">.</w:t>
-      </w:r>
-    </w:p>
-    <w:bookmarkEnd w:id="84"/>
-    <w:bookmarkStart w:id="85" w:name="ref-PradosdelaEscosura_2022"/>
-    <w:p>
-      <w:pPr>
-        <w:pStyle w:val="Bibliography"/>
-      </w:pPr>
-      <w:r>
-        <w:t xml:space="preserve">32.</w:t>
-      </w:r>
-      <w:r>
-        <w:t xml:space="preserve"> </w:t>
-      </w:r>
-      <w:r>
-        <w:t xml:space="preserve">	</w:t>
-      </w:r>
-      <w:r>
-        <w:t xml:space="preserve">Prados de la Escosura, L.: Human development and the path to freedom: 1870 to the present. Cambridge University Press, Cambridge (2022).</w:t>
-      </w:r>
-    </w:p>
-    <w:bookmarkEnd w:id="85"/>
-    <w:bookmarkStart w:id="87" w:name="ref-registerLearningMachineLearning2020"/>
-    <w:p>
-      <w:pPr>
-        <w:pStyle w:val="Bibliography"/>
-      </w:pPr>
-      <w:r>
-        <w:t xml:space="preserve">33.</w:t>
-      </w:r>
-      <w:r>
-        <w:t xml:space="preserve"> </w:t>
-      </w:r>
-      <w:r>
-        <w:t xml:space="preserve">	</w:t>
-      </w:r>
-      <w:r>
-        <w:t xml:space="preserve">Register, Y., Ko, A.J.: Learning</w:t>
-      </w:r>
-      <w:r>
-        <w:t xml:space="preserve"> </w:t>
-      </w:r>
-      <w:r>
-        <w:t xml:space="preserve">Machine Learning</w:t>
-      </w:r>
-      <w:r>
-        <w:t xml:space="preserve"> </w:t>
-      </w:r>
-      <w:r>
-        <w:t xml:space="preserve">with</w:t>
-      </w:r>
-      <w:r>
-        <w:t xml:space="preserve"> </w:t>
-      </w:r>
-      <w:r>
-        <w:t xml:space="preserve">Personal Data Helps Stakeholders Ground Advocacy Arguments</w:t>
-      </w:r>
-      <w:r>
-        <w:t xml:space="preserve"> </w:t>
-      </w:r>
-      <w:r>
-        <w:t xml:space="preserve">in</w:t>
-      </w:r>
-      <w:r>
-        <w:t xml:space="preserve"> </w:t>
-      </w:r>
-      <w:r>
-        <w:t xml:space="preserve">Model Mechanics</w:t>
-      </w:r>
-      <w:r>
-        <w:t xml:space="preserve">. In: Proceedings of the 2020</w:t>
-      </w:r>
-      <w:r>
-        <w:t xml:space="preserve"> </w:t>
-      </w:r>
-      <w:r>
-        <w:t xml:space="preserve">ACM Conference</w:t>
-      </w:r>
-      <w:r>
-        <w:t xml:space="preserve"> </w:t>
-      </w:r>
-      <w:r>
-        <w:t xml:space="preserve">on</w:t>
-      </w:r>
-      <w:r>
-        <w:t xml:space="preserve"> </w:t>
-      </w:r>
-      <w:r>
-        <w:t xml:space="preserve">International Computing Education Research</w:t>
-      </w:r>
-      <w:r>
-        <w:t xml:space="preserve">. pp. 67–78 ACM, Virtual Event New Zealand (2020). https://doi.org/</w:t>
+        <w:t xml:space="preserve">AI Skills</w:t>
+      </w:r>
+      <w:r>
+        <w:t xml:space="preserve"> </w:t>
+      </w:r>
+      <w:r>
+        <w:t xml:space="preserve">and</w:t>
+      </w:r>
+      <w:r>
+        <w:t xml:space="preserve"> </w:t>
+      </w:r>
+      <w:r>
+        <w:t xml:space="preserve">Roles</w:t>
+      </w:r>
+      <w:r>
+        <w:t xml:space="preserve">.”</w:t>
+      </w:r>
+      <w:r>
+        <w:t xml:space="preserve"> </w:t>
+      </w:r>
+      <w:r>
+        <w:t xml:space="preserve">In</w:t>
+      </w:r>
+      <w:r>
+        <w:t xml:space="preserve"> </w:t>
+      </w:r>
+      <w:r>
+        <w:rPr>
+          <w:i/>
+          <w:iCs/>
+        </w:rPr>
+        <w:t xml:space="preserve">Resilience</w:t>
+      </w:r>
+      <w:r>
+        <w:rPr>
+          <w:i/>
+          <w:iCs/>
+        </w:rPr>
+        <w:t xml:space="preserve"> </w:t>
+      </w:r>
+      <w:r>
+        <w:rPr>
+          <w:i/>
+          <w:iCs/>
+        </w:rPr>
+        <w:t xml:space="preserve">Through Digital Innovation</w:t>
+      </w:r>
+      <w:r>
+        <w:rPr>
+          <w:i/>
+          <w:iCs/>
+        </w:rPr>
+        <w:t xml:space="preserve">:</w:t>
+      </w:r>
+      <w:r>
+        <w:rPr>
+          <w:i/>
+          <w:iCs/>
+        </w:rPr>
+        <w:t xml:space="preserve"> </w:t>
+      </w:r>
+      <w:r>
+        <w:rPr>
+          <w:i/>
+          <w:iCs/>
+        </w:rPr>
+        <w:t xml:space="preserve">Enabling</w:t>
+      </w:r>
+      <w:r>
+        <w:rPr>
+          <w:i/>
+          <w:iCs/>
+        </w:rPr>
+        <w:t xml:space="preserve"> </w:t>
+      </w:r>
+      <w:r>
+        <w:rPr>
+          <w:i/>
+          <w:iCs/>
+        </w:rPr>
+        <w:t xml:space="preserve">the</w:t>
+      </w:r>
+      <w:r>
+        <w:rPr>
+          <w:i/>
+          <w:iCs/>
+        </w:rPr>
+        <w:t xml:space="preserve"> </w:t>
+      </w:r>
+      <w:r>
+        <w:rPr>
+          <w:i/>
+          <w:iCs/>
+        </w:rPr>
+        <w:t xml:space="preserve">Twin Transition</w:t>
+      </w:r>
+      <w:r>
+        <w:t xml:space="preserve">, 385–402. University of Maribor Press.</w:t>
+      </w:r>
+      <w:r>
+        <w:t xml:space="preserve"> </w:t>
       </w:r>
       <w:hyperlink r:id="rId86">
         <w:r>
           <w:rPr>
             <w:rStyle w:val="Hyperlink"/>
           </w:rPr>
-          <w:t xml:space="preserve">10.1145/3372782.3406252</w:t>
+          <w:t xml:space="preserve">https://doi.org/10.18690/um.fov.4.2024.22</w:t>
         </w:r>
       </w:hyperlink>
       <w:r>
@@ -2584,69 +3320,105 @@
       </w:r>
     </w:p>
     <w:bookmarkEnd w:id="87"/>
-    <w:bookmarkStart w:id="88" w:name="ref-senDevelopmentFreedom1999"/>
+    <w:bookmarkStart w:id="88" w:name="ref-PrioritisingAIClimate2024"/>
     <w:p>
       <w:pPr>
         <w:pStyle w:val="Bibliography"/>
       </w:pPr>
       <w:r>
-        <w:t xml:space="preserve">34.</w:t>
-      </w:r>
-      <w:r>
-        <w:t xml:space="preserve"> </w:t>
-      </w:r>
-      <w:r>
-        <w:t xml:space="preserve">	</w:t>
-      </w:r>
-      <w:r>
-        <w:t xml:space="preserve">Sen, A.: Development as</w:t>
-      </w:r>
-      <w:r>
-        <w:t xml:space="preserve"> </w:t>
-      </w:r>
-      <w:r>
-        <w:t xml:space="preserve">Freedom</w:t>
-      </w:r>
-      <w:r>
-        <w:t xml:space="preserve">. Oxford University Press (1999).</w:t>
+        <w:t xml:space="preserve">Woodcock, Neil. 2024.</w:t>
+      </w:r>
+      <w:r>
+        <w:t xml:space="preserve"> </w:t>
+      </w:r>
+      <w:r>
+        <w:t xml:space="preserve">“Prioritising</w:t>
+      </w:r>
+      <w:r>
+        <w:t xml:space="preserve"> </w:t>
+      </w:r>
+      <w:r>
+        <w:t xml:space="preserve">AI</w:t>
+      </w:r>
+      <w:r>
+        <w:t xml:space="preserve"> </w:t>
+      </w:r>
+      <w:r>
+        <w:t xml:space="preserve">over Climate Change Would Be Catastrophic.”</w:t>
       </w:r>
     </w:p>
     <w:bookmarkEnd w:id="88"/>
-    <w:bookmarkStart w:id="90" w:name="ref-udehRoleGenerativeAI2025"/>
+    <w:bookmarkStart w:id="90" w:name="ref-yangAgenticWebWeaving2025"/>
     <w:p>
       <w:pPr>
         <w:pStyle w:val="Bibliography"/>
       </w:pPr>
       <w:r>
-        <w:t xml:space="preserve">35.</w:t>
-      </w:r>
-      <w:r>
-        <w:t xml:space="preserve"> </w:t>
-      </w:r>
-      <w:r>
-        <w:t xml:space="preserve">	</w:t>
-      </w:r>
-      <w:r>
-        <w:t xml:space="preserve">Udeh, C.G.: The role of generative</w:t>
-      </w:r>
-      <w:r>
-        <w:t xml:space="preserve"> </w:t>
-      </w:r>
-      <w:r>
-        <w:t xml:space="preserve">AI</w:t>
-      </w:r>
-      <w:r>
-        <w:t xml:space="preserve"> </w:t>
-      </w:r>
-      <w:r>
-        <w:t xml:space="preserve">in personalized learning for higher education. World Journal of Advanced Engineering Technology and Sciences. 14, 2, 205–207 (2025). https://doi.org/</w:t>
+        <w:t xml:space="preserve">Yang, Yingxuan, Mulei Ma, Yuxuan Huang, Huacan Chai, Chenyu Gong, Haoran Geng, Yuanjian Zhou, et al. 2025.</w:t>
+      </w:r>
+      <w:r>
+        <w:t xml:space="preserve"> </w:t>
+      </w:r>
+      <w:r>
+        <w:t xml:space="preserve">“Agentic</w:t>
+      </w:r>
+      <w:r>
+        <w:t xml:space="preserve"> </w:t>
+      </w:r>
+      <w:r>
+        <w:t xml:space="preserve">Web</w:t>
+      </w:r>
+      <w:r>
+        <w:t xml:space="preserve">:</w:t>
+      </w:r>
+      <w:r>
+        <w:t xml:space="preserve"> </w:t>
+      </w:r>
+      <w:r>
+        <w:t xml:space="preserve">Weaving</w:t>
+      </w:r>
+      <w:r>
+        <w:t xml:space="preserve"> </w:t>
+      </w:r>
+      <w:r>
+        <w:t xml:space="preserve">the</w:t>
+      </w:r>
+      <w:r>
+        <w:t xml:space="preserve"> </w:t>
+      </w:r>
+      <w:r>
+        <w:t xml:space="preserve">Next Web</w:t>
+      </w:r>
+      <w:r>
+        <w:t xml:space="preserve"> </w:t>
+      </w:r>
+      <w:r>
+        <w:t xml:space="preserve">with</w:t>
+      </w:r>
+      <w:r>
+        <w:t xml:space="preserve"> </w:t>
+      </w:r>
+      <w:r>
+        <w:t xml:space="preserve">AI Agents</w:t>
+      </w:r>
+      <w:r>
+        <w:t xml:space="preserve">.”</w:t>
+      </w:r>
+      <w:r>
+        <w:t xml:space="preserve"> </w:t>
+      </w:r>
+      <w:r>
+        <w:t xml:space="preserve">arXiv.</w:t>
+      </w:r>
+      <w:r>
+        <w:t xml:space="preserve"> </w:t>
       </w:r>
       <w:hyperlink r:id="rId89">
         <w:r>
           <w:rPr>
             <w:rStyle w:val="Hyperlink"/>
           </w:rPr>
-          <w:t xml:space="preserve">10.30574/wjaets.2025.14.2.0077</w:t>
+          <w:t xml:space="preserve">https://doi.org/10.48550/arXiv.2507.21206</w:t>
         </w:r>
       </w:hyperlink>
       <w:r>
@@ -2654,40 +3426,22 @@
       </w:r>
     </w:p>
     <w:bookmarkEnd w:id="90"/>
-    <w:bookmarkStart w:id="92" w:name="ref-vanhaeftenBridgingAISkills2024"/>
+    <w:bookmarkStart w:id="91" w:name="ref-yaoCAReDiOEnhancingCultural2025"/>
     <w:p>
       <w:pPr>
         <w:pStyle w:val="Bibliography"/>
       </w:pPr>
       <w:r>
-        <w:t xml:space="preserve">36.</w:t>
-      </w:r>
-      <w:r>
-        <w:t xml:space="preserve"> </w:t>
-      </w:r>
-      <w:r>
-        <w:t xml:space="preserve">	</w:t>
-      </w:r>
-      <w:r>
-        <w:t xml:space="preserve">Van Haeften, W. et al.: Bridging the</w:t>
-      </w:r>
-      <w:r>
-        <w:t xml:space="preserve"> </w:t>
-      </w:r>
-      <w:r>
-        <w:t xml:space="preserve">AI Skills Gap</w:t>
-      </w:r>
-      <w:r>
-        <w:t xml:space="preserve"> </w:t>
-      </w:r>
-      <w:r>
-        <w:t xml:space="preserve">in</w:t>
-      </w:r>
-      <w:r>
-        <w:t xml:space="preserve"> </w:t>
-      </w:r>
-      <w:r>
-        <w:t xml:space="preserve">Europe</w:t>
+        <w:t xml:space="preserve">Yao, Jing, Xiaoyuan Yi, Jindong Wang, Zhicheng Dou, and Xing Xie. 2025.</w:t>
+      </w:r>
+      <w:r>
+        <w:t xml:space="preserve"> </w:t>
+      </w:r>
+      <w:r>
+        <w:t xml:space="preserve">“</w:t>
+      </w:r>
+      <w:r>
+        <w:t xml:space="preserve">CAReDiO</w:t>
       </w:r>
       <w:r>
         <w:t xml:space="preserve">:</w:t>
@@ -2696,7 +3450,7 @@
         <w:t xml:space="preserve"> </w:t>
       </w:r>
       <w:r>
-        <w:t xml:space="preserve">A Detailed Analysis</w:t>
+        <w:t xml:space="preserve">Enhancing Cultural Alignment</w:t>
       </w:r>
       <w:r>
         <w:t xml:space="preserve"> </w:t>
@@ -2708,7 +3462,19 @@
         <w:t xml:space="preserve"> </w:t>
       </w:r>
       <w:r>
-        <w:t xml:space="preserve">AI Skills</w:t>
+        <w:t xml:space="preserve">LLM</w:t>
+      </w:r>
+      <w:r>
+        <w:t xml:space="preserve"> </w:t>
+      </w:r>
+      <w:r>
+        <w:t xml:space="preserve">via</w:t>
+      </w:r>
+      <w:r>
+        <w:t xml:space="preserve"> </w:t>
+      </w:r>
+      <w:r>
+        <w:t xml:space="preserve">Representativeness</w:t>
       </w:r>
       <w:r>
         <w:t xml:space="preserve"> </w:t>
@@ -2720,16 +3486,38 @@
         <w:t xml:space="preserve"> </w:t>
       </w:r>
       <w:r>
-        <w:t xml:space="preserve">Roles</w:t>
-      </w:r>
-      <w:r>
-        <w:t xml:space="preserve">. In: Resilience</w:t>
-      </w:r>
-      <w:r>
-        <w:t xml:space="preserve"> </w:t>
-      </w:r>
-      <w:r>
-        <w:t xml:space="preserve">Through Digital Innovation</w:t>
+        <w:t xml:space="preserve">Distinctiveness Guided Data Optimization</w:t>
+      </w:r>
+      <w:r>
+        <w:t xml:space="preserve">,”</w:t>
+      </w:r>
+      <w:r>
+        <w:t xml:space="preserve"> </w:t>
+      </w:r>
+      <w:r>
+        <w:t xml:space="preserve">October.</w:t>
+      </w:r>
+    </w:p>
+    <w:bookmarkEnd w:id="91"/>
+    <w:bookmarkStart w:id="93" w:name="ref-yuFearMissingOut2025"/>
+    <w:p>
+      <w:pPr>
+        <w:pStyle w:val="Bibliography"/>
+      </w:pPr>
+      <w:r>
+        <w:t xml:space="preserve">Yu, Chi-Lin. 2025.</w:t>
+      </w:r>
+      <w:r>
+        <w:t xml:space="preserve"> </w:t>
+      </w:r>
+      <w:r>
+        <w:t xml:space="preserve">“Fear of Missing Out on</w:t>
+      </w:r>
+      <w:r>
+        <w:t xml:space="preserve"> </w:t>
+      </w:r>
+      <w:r>
+        <w:t xml:space="preserve">AI</w:t>
       </w:r>
       <w:r>
         <w:t xml:space="preserve">:</w:t>
@@ -2738,279 +3526,48 @@
         <w:t xml:space="preserve"> </w:t>
       </w:r>
       <w:r>
-        <w:t xml:space="preserve">Enabling</w:t>
-      </w:r>
-      <w:r>
-        <w:t xml:space="preserve"> </w:t>
-      </w:r>
-      <w:r>
-        <w:t xml:space="preserve">the</w:t>
-      </w:r>
-      <w:r>
-        <w:t xml:space="preserve"> </w:t>
-      </w:r>
-      <w:r>
-        <w:t xml:space="preserve">Twin Transition</w:t>
-      </w:r>
-      <w:r>
-        <w:t xml:space="preserve">. pp. 385–402 University of Maribor Press (2024). https://doi.org/</w:t>
-      </w:r>
-      <w:hyperlink r:id="rId91">
+        <w:t xml:space="preserve">A</w:t>
+      </w:r>
+      <w:r>
+        <w:t xml:space="preserve"> </w:t>
+      </w:r>
+      <w:r>
+        <w:t xml:space="preserve">Psychological Cost of Technological Revolution.”</w:t>
+      </w:r>
+      <w:r>
+        <w:t xml:space="preserve"> </w:t>
+      </w:r>
+      <w:r>
+        <w:rPr>
+          <w:i/>
+          <w:iCs/>
+        </w:rPr>
+        <w:t xml:space="preserve">Telematics and Informatics Reports</w:t>
+      </w:r>
+      <w:r>
+        <w:t xml:space="preserve"> </w:t>
+      </w:r>
+      <w:r>
+        <w:t xml:space="preserve">20 (December): 100277.</w:t>
+      </w:r>
+      <w:r>
+        <w:t xml:space="preserve"> </w:t>
+      </w:r>
+      <w:hyperlink r:id="rId92">
         <w:r>
           <w:rPr>
             <w:rStyle w:val="Hyperlink"/>
           </w:rPr>
-          <w:t xml:space="preserve">10.18690/um.fov.4.2024.22</w:t>
+          <w:t xml:space="preserve">https://doi.org/10.1016/j.teler.2025.100277</w:t>
         </w:r>
       </w:hyperlink>
       <w:r>
         <w:t xml:space="preserve">.</w:t>
       </w:r>
     </w:p>
-    <w:bookmarkEnd w:id="92"/>
-    <w:bookmarkStart w:id="93" w:name="ref-PrioritisingAIClimate2024"/>
-    <w:p>
-      <w:pPr>
-        <w:pStyle w:val="Bibliography"/>
-      </w:pPr>
-      <w:r>
-        <w:t xml:space="preserve">37.</w:t>
-      </w:r>
-      <w:r>
-        <w:t xml:space="preserve"> </w:t>
-      </w:r>
-      <w:r>
-        <w:t xml:space="preserve">	</w:t>
-      </w:r>
-      <w:r>
-        <w:t xml:space="preserve">Woodcock, N.: Prioritising</w:t>
-      </w:r>
-      <w:r>
-        <w:t xml:space="preserve"> </w:t>
-      </w:r>
-      <w:r>
-        <w:t xml:space="preserve">AI</w:t>
-      </w:r>
-      <w:r>
-        <w:t xml:space="preserve"> </w:t>
-      </w:r>
-      <w:r>
-        <w:t xml:space="preserve">over climate change would be catastrophic, (2024).</w:t>
-      </w:r>
-    </w:p>
     <w:bookmarkEnd w:id="93"/>
-    <w:bookmarkStart w:id="96" w:name="ref-yangAgenticWebWeaving2025"/>
-    <w:p>
-      <w:pPr>
-        <w:pStyle w:val="Bibliography"/>
-      </w:pPr>
-      <w:r>
-        <w:t xml:space="preserve">38.</w:t>
-      </w:r>
-      <w:r>
-        <w:t xml:space="preserve"> </w:t>
-      </w:r>
-      <w:r>
-        <w:t xml:space="preserve">	</w:t>
-      </w:r>
-      <w:r>
-        <w:t xml:space="preserve">Yang, Y. et al.: Agentic</w:t>
-      </w:r>
-      <w:r>
-        <w:t xml:space="preserve"> </w:t>
-      </w:r>
-      <w:r>
-        <w:t xml:space="preserve">Web</w:t>
-      </w:r>
-      <w:r>
-        <w:t xml:space="preserve">:</w:t>
-      </w:r>
-      <w:r>
-        <w:t xml:space="preserve"> </w:t>
-      </w:r>
-      <w:r>
-        <w:t xml:space="preserve">Weaving</w:t>
-      </w:r>
-      <w:r>
-        <w:t xml:space="preserve"> </w:t>
-      </w:r>
-      <w:r>
-        <w:t xml:space="preserve">the</w:t>
-      </w:r>
-      <w:r>
-        <w:t xml:space="preserve"> </w:t>
-      </w:r>
-      <w:r>
-        <w:t xml:space="preserve">Next Web</w:t>
-      </w:r>
-      <w:r>
-        <w:t xml:space="preserve"> </w:t>
-      </w:r>
-      <w:r>
-        <w:t xml:space="preserve">with</w:t>
-      </w:r>
-      <w:r>
-        <w:t xml:space="preserve"> </w:t>
-      </w:r>
-      <w:r>
-        <w:t xml:space="preserve">AI Agents</w:t>
-      </w:r>
-      <w:r>
-        <w:t xml:space="preserve">,</w:t>
-      </w:r>
-      <w:r>
-        <w:t xml:space="preserve"> </w:t>
-      </w:r>
-      <w:hyperlink r:id="rId94">
-        <w:r>
-          <w:rPr>
-            <w:rStyle w:val="Hyperlink"/>
-          </w:rPr>
-          <w:t xml:space="preserve">https://arxiv.org/abs/2507.21206</w:t>
-        </w:r>
-      </w:hyperlink>
-      <w:r>
-        <w:t xml:space="preserve">, (2025). https://doi.org/</w:t>
-      </w:r>
-      <w:hyperlink r:id="rId95">
-        <w:r>
-          <w:rPr>
-            <w:rStyle w:val="Hyperlink"/>
-          </w:rPr>
-          <w:t xml:space="preserve">10.48550/arXiv.2507.21206</w:t>
-        </w:r>
-      </w:hyperlink>
-      <w:r>
-        <w:t xml:space="preserve">.</w:t>
-      </w:r>
-    </w:p>
-    <w:bookmarkEnd w:id="96"/>
-    <w:bookmarkStart w:id="97" w:name="ref-yaoCAReDiOEnhancingCultural2025"/>
-    <w:p>
-      <w:pPr>
-        <w:pStyle w:val="Bibliography"/>
-      </w:pPr>
-      <w:r>
-        <w:t xml:space="preserve">39.</w:t>
-      </w:r>
-      <w:r>
-        <w:t xml:space="preserve"> </w:t>
-      </w:r>
-      <w:r>
-        <w:t xml:space="preserve">	</w:t>
-      </w:r>
-      <w:r>
-        <w:t xml:space="preserve">Yao, J. et al.:</w:t>
-      </w:r>
-      <w:r>
-        <w:t xml:space="preserve"> </w:t>
-      </w:r>
-      <w:r>
-        <w:t xml:space="preserve">CAReDiO</w:t>
-      </w:r>
-      <w:r>
-        <w:t xml:space="preserve">:</w:t>
-      </w:r>
-      <w:r>
-        <w:t xml:space="preserve"> </w:t>
-      </w:r>
-      <w:r>
-        <w:t xml:space="preserve">Enhancing Cultural Alignment</w:t>
-      </w:r>
-      <w:r>
-        <w:t xml:space="preserve"> </w:t>
-      </w:r>
-      <w:r>
-        <w:t xml:space="preserve">of</w:t>
-      </w:r>
-      <w:r>
-        <w:t xml:space="preserve"> </w:t>
-      </w:r>
-      <w:r>
-        <w:t xml:space="preserve">LLM</w:t>
-      </w:r>
-      <w:r>
-        <w:t xml:space="preserve"> </w:t>
-      </w:r>
-      <w:r>
-        <w:t xml:space="preserve">via</w:t>
-      </w:r>
-      <w:r>
-        <w:t xml:space="preserve"> </w:t>
-      </w:r>
-      <w:r>
-        <w:t xml:space="preserve">Representativeness</w:t>
-      </w:r>
-      <w:r>
-        <w:t xml:space="preserve"> </w:t>
-      </w:r>
-      <w:r>
-        <w:t xml:space="preserve">and</w:t>
-      </w:r>
-      <w:r>
-        <w:t xml:space="preserve"> </w:t>
-      </w:r>
-      <w:r>
-        <w:t xml:space="preserve">Distinctiveness Guided Data Optimization</w:t>
-      </w:r>
-      <w:r>
-        <w:t xml:space="preserve">. (2025).</w:t>
-      </w:r>
-    </w:p>
-    <w:bookmarkEnd w:id="97"/>
-    <w:bookmarkStart w:id="99" w:name="ref-yuFearMissingOut2025"/>
-    <w:p>
-      <w:pPr>
-        <w:pStyle w:val="Bibliography"/>
-      </w:pPr>
-      <w:r>
-        <w:t xml:space="preserve">40.</w:t>
-      </w:r>
-      <w:r>
-        <w:t xml:space="preserve"> </w:t>
-      </w:r>
-      <w:r>
-        <w:t xml:space="preserve">	</w:t>
-      </w:r>
-      <w:r>
-        <w:t xml:space="preserve">Yu, C.-L.: Fear of missing out on</w:t>
-      </w:r>
-      <w:r>
-        <w:t xml:space="preserve"> </w:t>
-      </w:r>
-      <w:r>
-        <w:t xml:space="preserve">AI</w:t>
-      </w:r>
-      <w:r>
-        <w:t xml:space="preserve">:</w:t>
-      </w:r>
-      <w:r>
-        <w:t xml:space="preserve"> </w:t>
-      </w:r>
-      <w:r>
-        <w:t xml:space="preserve">A</w:t>
-      </w:r>
-      <w:r>
-        <w:t xml:space="preserve"> </w:t>
-      </w:r>
-      <w:r>
-        <w:t xml:space="preserve">psychological cost of technological revolution. Telematics and Informatics Reports. 20, 100277 (2025). https://doi.org/</w:t>
-      </w:r>
-      <w:hyperlink r:id="rId98">
-        <w:r>
-          <w:rPr>
-            <w:rStyle w:val="Hyperlink"/>
-          </w:rPr>
-          <w:t xml:space="preserve">10.1016/j.teler.2025.100277</w:t>
-        </w:r>
-      </w:hyperlink>
-      <w:r>
-        <w:t xml:space="preserve">.</w:t>
-      </w:r>
-    </w:p>
-    <w:bookmarkEnd w:id="99"/>
-    <w:bookmarkEnd w:id="100"/>
-    <w:bookmarkEnd w:id="101"/>
+    <w:bookmarkEnd w:id="94"/>
+    <w:bookmarkEnd w:id="95"/>
     <w:sectPr>
       <w:footnotePr>
         <w:numRestart w:val="eachSect"/>

</xml_diff>

<commit_message>
sense of agency hegel
</commit_message>
<xml_diff>
--- a/_manuscript/proposal-2026-03.docx
+++ b/_manuscript/proposal-2026-03.docx
@@ -24,29 +24,39 @@
         <w:pStyle w:val="FirstParagraph"/>
       </w:pPr>
       <w:r>
-        <w:t xml:space="preserve">Over the last decade Artificial Intelligence (AI) has been attributed a</w:t>
-      </w:r>
-      <w:r>
-        <w:t xml:space="preserve"> </w:t>
-      </w:r>
-      <w:r>
-        <w:rPr>
-          <w:i/>
-          <w:iCs/>
-        </w:rPr>
-        <w:t xml:space="preserve">sense of agency</w:t>
-      </w:r>
-      <w:r>
-        <w:t xml:space="preserve"> </w:t>
-      </w:r>
-      <w:r>
-        <w:t xml:space="preserve">(SoA)</w:t>
-      </w:r>
-      <w:r>
-        <w:t xml:space="preserve">(Legaspi, He, and Toyoizumi 2019)</w:t>
-      </w:r>
-      <w:r>
-        <w:t xml:space="preserve">. Even more so with the emerging paradigm Agentic AI, which is different to previous forms of AI such as large language models (LLMs), because it can operate (semi-)autonomously and pursue complex goals with little human intervention</w:t>
+        <w:t xml:space="preserve">Over the last decade the question whether Artificial Intelligence (AI) itself exhibits agency has been debated</w:t>
+      </w:r>
+      <w:r>
+        <w:t xml:space="preserve"> </w:t>
+      </w:r>
+      <w:r>
+        <w:t xml:space="preserve">(Legaspi, He, and Toyoizumi 2019; Swanepoel 2021)</w:t>
+      </w:r>
+      <w:r>
+        <w:t xml:space="preserve">. If yes, then perhaps not agency</w:t>
+      </w:r>
+      <w:r>
+        <w:t xml:space="preserve"> </w:t>
+      </w:r>
+      <w:r>
+        <w:t xml:space="preserve">“arising from beliefs, desires and reasons”</w:t>
+      </w:r>
+      <w:r>
+        <w:t xml:space="preserve"> </w:t>
+      </w:r>
+      <w:r>
+        <w:t xml:space="preserve">(Dattathrani and De’ 2023)</w:t>
+      </w:r>
+      <w:r>
+        <w:t xml:space="preserve">.</w:t>
+      </w:r>
+    </w:p>
+    <w:p>
+      <w:pPr>
+        <w:pStyle w:val="BodyText"/>
+      </w:pPr>
+      <w:r>
+        <w:t xml:space="preserve">This distinction between human and technological agency becomes more blurred with the emerging paradigm of Agentic AI , which is different to previous forms of AI such as large language models (LLMs), because it can operate (semi-)autonomously and pursue complex goals with little human intervention</w:t>
       </w:r>
       <w:r>
         <w:t xml:space="preserve"> </w:t>
@@ -55,7 +65,15 @@
         <w:t xml:space="preserve">(Acharya, Kuppan, and Divya 2025)</w:t>
       </w:r>
       <w:r>
-        <w:t xml:space="preserve">. This questions the nature of our human future and of our human agency</w:t>
+        <w:t xml:space="preserve">.</w:t>
+      </w:r>
+    </w:p>
+    <w:p>
+      <w:pPr>
+        <w:pStyle w:val="BodyText"/>
+      </w:pPr>
+      <w:r>
+        <w:t xml:space="preserve">This questions the nature of our human future and of our human agency</w:t>
       </w:r>
       <w:r>
         <w:t xml:space="preserve"> </w:t>
@@ -82,7 +100,7 @@
         <w:t xml:space="preserve">Giddens (1984)</w:t>
       </w:r>
       <w:r>
-        <w:t xml:space="preserve">’ definition human agency is the capability to</w:t>
+        <w:t xml:space="preserve">’ structuralist definition of human agency, placed within society, it is the capability to</w:t>
       </w:r>
       <w:r>
         <w:t xml:space="preserve"> </w:t>
@@ -91,7 +109,7 @@
         <w:t xml:space="preserve">“make a difference”</w:t>
       </w:r>
       <w:r>
-        <w:t xml:space="preserve">, in other words to have and be able to exercise power over a situation.</w:t>
+        <w:t xml:space="preserve">, in other words to have and be able to exercise power over a situation in certain context.</w:t>
       </w:r>
     </w:p>
     <w:p>
@@ -268,7 +286,21 @@
         <w:t xml:space="preserve">(Prados de la Escosura 2022; Sen 1999)</w:t>
       </w:r>
       <w:r>
-        <w:t xml:space="preserve">. Agentic AI and AI goals in general, largely seem to focus on increasing abilities for models or replacing tedious tasks performed by humans. While research has been done about future projections of human agency in conjunction with AI in decision making</w:t>
+        <w:t xml:space="preserve">.</w:t>
+      </w:r>
+      <w:r>
+        <w:t xml:space="preserve"> </w:t>
+      </w:r>
+      <w:r>
+        <w:t xml:space="preserve">The role technology plays in society and the way it interacts with our human agency has been a topic of much debate [], with</w:t>
+      </w:r>
+    </w:p>
+    <w:p>
+      <w:pPr>
+        <w:pStyle w:val="BodyText"/>
+      </w:pPr>
+      <w:r>
+        <w:t xml:space="preserve">Agentic AI and AI goals in general, largely seem to focus on increasing abilities for models or replacing tedious tasks performed by humans. While research has been done about future projections of human agency in conjunction with AI in decision making</w:t>
       </w:r>
       <w:r>
         <w:t xml:space="preserve"> </w:t>
@@ -292,7 +324,7 @@
         <w:t xml:space="preserve"> </w:t>
       </w:r>
       <w:r>
-        <w:t xml:space="preserve">it does not deal with how to increase human agency for humans now.</w:t>
+        <w:t xml:space="preserve">it does not deal with how to increase human agency for humans now. Or what the effect is of Agentic AI on Sense of Agency (SoA).</w:t>
       </w:r>
     </w:p>
     <w:p>
@@ -341,6 +373,29 @@
       </w:r>
       <w:r>
         <w:t xml:space="preserve">.</w:t>
+      </w:r>
+    </w:p>
+    <w:p>
+      <w:pPr>
+        <w:pStyle w:val="BodyText"/>
+      </w:pPr>
+      <w:r>
+        <w:t xml:space="preserve">The way Agentic AI or AI in general is influencing agency in adolescents has not been studied, apart from the influence it has on critical thinking</w:t>
+      </w:r>
+      <w:r>
+        <w:t xml:space="preserve"> </w:t>
+      </w:r>
+      <w:r>
+        <w:t xml:space="preserve">(Suriano et al. 2025)</w:t>
+      </w:r>
+      <w:r>
+        <w:t xml:space="preserve">, and why and how they use it for studying</w:t>
+      </w:r>
+      <w:r>
+        <w:t xml:space="preserve"> </w:t>
+      </w:r>
+      <w:r>
+        <w:t xml:space="preserve">(Dai 2025; Silvennoinen, Aksovaara, and Alanko-Turunen 2025; Suonpää, Heikkilä, and Dimkar 2024)</w:t>
       </w:r>
     </w:p>
     <w:bookmarkEnd w:id="21"/>
@@ -477,7 +532,16 @@
         </w:numPr>
       </w:pPr>
       <w:r>
-        <w:t xml:space="preserve">How do adolescents rate their sense of agency?</w:t>
+        <w:t xml:space="preserve">How do adolescents rate their sense of agency on the Scale of Sense of Agency</w:t>
+      </w:r>
+      <w:r>
+        <w:t xml:space="preserve"> </w:t>
+      </w:r>
+      <w:r>
+        <w:t xml:space="preserve">(Tapal, Oren, and Eitam 2017)</w:t>
+      </w:r>
+      <w:r>
+        <w:t xml:space="preserve">?</w:t>
       </w:r>
     </w:p>
     <w:p>
@@ -550,7 +614,19 @@
         <w:t xml:space="preserve"> </w:t>
       </w:r>
       <w:r>
-        <w:t xml:space="preserve">describes the rationaliy of technology as ideological. The ideology that technological progress is inevitable and oppressive is in direct opposition to the hegemony of Silicon Valley that believes in Innovation at all costs, which</w:t>
+        <w:t xml:space="preserve">describes the rationality of technology as ideological. His ideology that technological progress is inevitable and oppressive</w:t>
+      </w:r>
+      <w:r>
+        <w:t xml:space="preserve"> </w:t>
+      </w:r>
+      <w:r>
+        <w:t xml:space="preserve">(Habermas 1971 pp.)</w:t>
+      </w:r>
+      <w:r>
+        <w:t xml:space="preserve"> </w:t>
+      </w:r>
+      <w:r>
+        <w:t xml:space="preserve">is in direct opposition to the hegemony of Silicon Valley that believes in Innovation at all costs, which</w:t>
       </w:r>
       <w:r>
         <w:t xml:space="preserve"> </w:t>
@@ -613,7 +689,7 @@
         <w:t xml:space="preserve"> </w:t>
       </w:r>
       <w:r>
-        <w:t xml:space="preserve">p. 122;], where there might be roles one fits instead of actually performing an action by one’s own beliefss.</w:t>
+        <w:t xml:space="preserve">p. 122;], where there might be roles one fits instead of actually performing an action by one’s own beliefs.</w:t>
       </w:r>
       <w:r>
         <w:t xml:space="preserve"> </w:t>
@@ -643,7 +719,7 @@
         <w:t xml:space="preserve"> </w:t>
       </w:r>
       <w:r>
-        <w:t xml:space="preserve">emphasise different dimensions. Where Giddens focuses on the social structure,</w:t>
+        <w:t xml:space="preserve">emphasise different dimensions. Where Giddens focuses on the social structure and its society:</w:t>
       </w:r>
       <w:r>
         <w:t xml:space="preserve"> </w:t>
@@ -688,7 +764,7 @@
       <w:r>
         <w:drawing>
           <wp:inline>
-            <wp:extent cx="5334000" cy="3856789"/>
+            <wp:extent cx="5334000" cy="4371758"/>
             <wp:effectExtent b="0" l="0" r="0" t="0"/>
             <wp:docPr descr="" title="" id="26" name="Picture"/>
             <a:graphic>
@@ -709,7 +785,7 @@
                   <pic:spPr bwMode="auto">
                     <a:xfrm>
                       <a:off x="0" y="0"/>
-                      <a:ext cx="5334000" cy="3856789"/>
+                      <a:ext cx="5334000" cy="4371758"/>
                     </a:xfrm>
                     <a:prstGeom prst="rect">
                       <a:avLst/>
@@ -760,7 +836,7 @@
       </w:hyperlink>
     </w:p>
     <w:bookmarkEnd w:id="29"/>
-    <w:bookmarkStart w:id="75" w:name="references"/>
+    <w:bookmarkStart w:id="89" w:name="references"/>
     <w:p>
       <w:pPr>
         <w:pStyle w:val="Heading2"/>
@@ -769,7 +845,7 @@
         <w:t xml:space="preserve">References</w:t>
       </w:r>
     </w:p>
-    <w:bookmarkStart w:id="74" w:name="refs"/>
+    <w:bookmarkStart w:id="88" w:name="refs"/>
     <w:bookmarkStart w:id="31" w:name="ref-acharyaAgentic2025"/>
     <w:p>
       <w:pPr>
@@ -1182,12 +1258,191 @@
       </w:r>
     </w:p>
     <w:bookmarkEnd w:id="40"/>
-    <w:bookmarkStart w:id="42" w:name="ref-davidsonIntending1978"/>
+    <w:bookmarkStart w:id="42" w:name="ref-daiWhyStudentsUse2025"/>
     <w:p>
       <w:pPr>
         <w:pStyle w:val="Bibliography"/>
       </w:pPr>
       <w:r>
+        <w:t xml:space="preserve">Dai, Yun. 2025.</w:t>
+      </w:r>
+      <w:r>
+        <w:t xml:space="preserve"> </w:t>
+      </w:r>
+      <w:r>
+        <w:t xml:space="preserve">“Why Students Use or Not Use Generative</w:t>
+      </w:r>
+      <w:r>
+        <w:t xml:space="preserve"> </w:t>
+      </w:r>
+      <w:r>
+        <w:t xml:space="preserve">AI</w:t>
+      </w:r>
+      <w:r>
+        <w:t xml:space="preserve">:</w:t>
+      </w:r>
+      <w:r>
+        <w:t xml:space="preserve"> </w:t>
+      </w:r>
+      <w:r>
+        <w:t xml:space="preserve">Student</w:t>
+      </w:r>
+      <w:r>
+        <w:t xml:space="preserve"> </w:t>
+      </w:r>
+      <w:r>
+        <w:t xml:space="preserve">Conceptions, Concerns, and Implications for Engineering Education.”</w:t>
+      </w:r>
+      <w:r>
+        <w:t xml:space="preserve"> </w:t>
+      </w:r>
+      <w:r>
+        <w:rPr>
+          <w:i/>
+          <w:iCs/>
+        </w:rPr>
+        <w:t xml:space="preserve">Digital Engineering</w:t>
+      </w:r>
+      <w:r>
+        <w:t xml:space="preserve"> </w:t>
+      </w:r>
+      <w:r>
+        <w:t xml:space="preserve">4 (March): 100019.</w:t>
+      </w:r>
+      <w:r>
+        <w:t xml:space="preserve"> </w:t>
+      </w:r>
+      <w:hyperlink r:id="rId41">
+        <w:r>
+          <w:rPr>
+            <w:rStyle w:val="Hyperlink"/>
+          </w:rPr>
+          <w:t xml:space="preserve">https://doi.org/10.1016/j.dte.2024.100019</w:t>
+        </w:r>
+      </w:hyperlink>
+      <w:r>
+        <w:t xml:space="preserve">.</w:t>
+      </w:r>
+    </w:p>
+    <w:bookmarkEnd w:id="42"/>
+    <w:bookmarkStart w:id="44" w:name="ref-dattathraniConceptAgencyEra2023"/>
+    <w:p>
+      <w:pPr>
+        <w:pStyle w:val="Bibliography"/>
+      </w:pPr>
+      <w:r>
+        <w:t xml:space="preserve">Dattathrani, Sai, and Rahul De’. 2023.</w:t>
+      </w:r>
+      <w:r>
+        <w:t xml:space="preserve"> </w:t>
+      </w:r>
+      <w:r>
+        <w:t xml:space="preserve">“The</w:t>
+      </w:r>
+      <w:r>
+        <w:t xml:space="preserve"> </w:t>
+      </w:r>
+      <w:r>
+        <w:t xml:space="preserve">Concept</w:t>
+      </w:r>
+      <w:r>
+        <w:t xml:space="preserve"> </w:t>
+      </w:r>
+      <w:r>
+        <w:t xml:space="preserve">of</w:t>
+      </w:r>
+      <w:r>
+        <w:t xml:space="preserve"> </w:t>
+      </w:r>
+      <w:r>
+        <w:t xml:space="preserve">Agency</w:t>
+      </w:r>
+      <w:r>
+        <w:t xml:space="preserve"> </w:t>
+      </w:r>
+      <w:r>
+        <w:t xml:space="preserve">in the</w:t>
+      </w:r>
+      <w:r>
+        <w:t xml:space="preserve"> </w:t>
+      </w:r>
+      <w:r>
+        <w:t xml:space="preserve">Era</w:t>
+      </w:r>
+      <w:r>
+        <w:t xml:space="preserve"> </w:t>
+      </w:r>
+      <w:r>
+        <w:t xml:space="preserve">of</w:t>
+      </w:r>
+      <w:r>
+        <w:t xml:space="preserve"> </w:t>
+      </w:r>
+      <w:r>
+        <w:t xml:space="preserve">Artificial Intelligence</w:t>
+      </w:r>
+      <w:r>
+        <w:t xml:space="preserve">:</w:t>
+      </w:r>
+      <w:r>
+        <w:t xml:space="preserve"> </w:t>
+      </w:r>
+      <w:r>
+        <w:t xml:space="preserve">Dimensions</w:t>
+      </w:r>
+      <w:r>
+        <w:t xml:space="preserve"> </w:t>
+      </w:r>
+      <w:r>
+        <w:t xml:space="preserve">and</w:t>
+      </w:r>
+      <w:r>
+        <w:t xml:space="preserve"> </w:t>
+      </w:r>
+      <w:r>
+        <w:t xml:space="preserve">Degrees</w:t>
+      </w:r>
+      <w:r>
+        <w:t xml:space="preserve">.”</w:t>
+      </w:r>
+      <w:r>
+        <w:t xml:space="preserve"> </w:t>
+      </w:r>
+      <w:r>
+        <w:rPr>
+          <w:i/>
+          <w:iCs/>
+        </w:rPr>
+        <w:t xml:space="preserve">Information Systems Frontiers</w:t>
+      </w:r>
+      <w:r>
+        <w:t xml:space="preserve"> </w:t>
+      </w:r>
+      <w:r>
+        <w:t xml:space="preserve">25 (1): 29–54.</w:t>
+      </w:r>
+      <w:r>
+        <w:t xml:space="preserve"> </w:t>
+      </w:r>
+      <w:hyperlink r:id="rId43">
+        <w:r>
+          <w:rPr>
+            <w:rStyle w:val="Hyperlink"/>
+          </w:rPr>
+          <w:t xml:space="preserve">https://doi.org/10.1007/s10796-022-10336-8</w:t>
+        </w:r>
+      </w:hyperlink>
+      <w:r>
+        <w:t xml:space="preserve">.</w:t>
+      </w:r>
+    </w:p>
+    <w:bookmarkEnd w:id="44"/>
+    <w:bookmarkStart w:id="46" w:name="ref-davidsonIntending1978"/>
+    <w:p>
+      <w:pPr>
+        <w:pStyle w:val="Bibliography"/>
+      </w:pPr>
+      <w:r>
         <w:t xml:space="preserve">Davidson, Donald. 1978.</w:t>
       </w:r>
       <w:r>
@@ -1323,7 +1578,7 @@
       <w:r>
         <w:t xml:space="preserve"> </w:t>
       </w:r>
-      <w:hyperlink r:id="rId41">
+      <w:hyperlink r:id="rId45">
         <w:r>
           <w:rPr>
             <w:rStyle w:val="Hyperlink"/>
@@ -1335,8 +1590,8 @@
         <w:t xml:space="preserve">.</w:t>
       </w:r>
     </w:p>
-    <w:bookmarkEnd w:id="42"/>
-    <w:bookmarkStart w:id="44" w:name="ref-drugaHowChildrensPerceptions2021"/>
+    <w:bookmarkEnd w:id="46"/>
+    <w:bookmarkStart w:id="48" w:name="ref-drugaHowChildrensPerceptions2021"/>
     <w:p>
       <w:pPr>
         <w:pStyle w:val="Bibliography"/>
@@ -1411,7 +1666,7 @@
       <w:r>
         <w:t xml:space="preserve"> </w:t>
       </w:r>
-      <w:hyperlink r:id="rId43">
+      <w:hyperlink r:id="rId47">
         <w:r>
           <w:rPr>
             <w:rStyle w:val="Hyperlink"/>
@@ -1423,8 +1678,8 @@
         <w:t xml:space="preserve">.</w:t>
       </w:r>
     </w:p>
-    <w:bookmarkEnd w:id="44"/>
-    <w:bookmarkStart w:id="45" w:name="ref-epsteinSiliconValleysObsession2024"/>
+    <w:bookmarkEnd w:id="48"/>
+    <w:bookmarkStart w:id="49" w:name="ref-epsteinSiliconValleysObsession2024"/>
     <w:p>
       <w:pPr>
         <w:pStyle w:val="Bibliography"/>
@@ -1482,8 +1737,8 @@
         <w:t xml:space="preserve">.</w:t>
       </w:r>
     </w:p>
-    <w:bookmarkEnd w:id="45"/>
-    <w:bookmarkStart w:id="46" w:name="ref-giddens1984constitution"/>
+    <w:bookmarkEnd w:id="49"/>
+    <w:bookmarkStart w:id="50" w:name="ref-giddens1984constitution"/>
     <w:p>
       <w:pPr>
         <w:pStyle w:val="Bibliography"/>
@@ -1533,8 +1788,8 @@
         <w:t xml:space="preserve">. Univ of California Press.</w:t>
       </w:r>
     </w:p>
-    <w:bookmarkEnd w:id="46"/>
-    <w:bookmarkStart w:id="47" w:name="ref-habermas1971technology"/>
+    <w:bookmarkEnd w:id="50"/>
+    <w:bookmarkStart w:id="51" w:name="ref-habermas1971technology"/>
     <w:p>
       <w:pPr>
         <w:pStyle w:val="Bibliography"/>
@@ -1574,8 +1829,8 @@
         <w:t xml:space="preserve">4.</w:t>
       </w:r>
     </w:p>
-    <w:bookmarkEnd w:id="47"/>
-    <w:bookmarkStart w:id="49" w:name="ref-heyndelsTechnologyNeutrality2023"/>
+    <w:bookmarkEnd w:id="51"/>
+    <w:bookmarkStart w:id="53" w:name="ref-heyndelsTechnologyNeutrality2023"/>
     <w:p>
       <w:pPr>
         <w:pStyle w:val="Bibliography"/>
@@ -1617,7 +1872,7 @@
       <w:r>
         <w:t xml:space="preserve"> </w:t>
       </w:r>
-      <w:hyperlink r:id="rId48">
+      <w:hyperlink r:id="rId52">
         <w:r>
           <w:rPr>
             <w:rStyle w:val="Hyperlink"/>
@@ -1629,8 +1884,8 @@
         <w:t xml:space="preserve">.</w:t>
       </w:r>
     </w:p>
-    <w:bookmarkEnd w:id="49"/>
-    <w:bookmarkStart w:id="50" w:name="ref-johnsonPowerProgressOur2023"/>
+    <w:bookmarkEnd w:id="53"/>
+    <w:bookmarkStart w:id="54" w:name="ref-johnsonPowerProgressOur2023"/>
     <w:p>
       <w:pPr>
         <w:pStyle w:val="Bibliography"/>
@@ -1715,8 +1970,8 @@
         <w:t xml:space="preserve">. Hachette UK.</w:t>
       </w:r>
     </w:p>
-    <w:bookmarkEnd w:id="50"/>
-    <w:bookmarkStart w:id="51" w:name="ref-kemp2025Digital2025Global2025"/>
+    <w:bookmarkEnd w:id="54"/>
+    <w:bookmarkStart w:id="55" w:name="ref-kemp2025Digital2025Global2025"/>
     <w:p>
       <w:pPr>
         <w:pStyle w:val="Bibliography"/>
@@ -1753,8 +2008,8 @@
         <w:t xml:space="preserve">. https://datareportal.com/reports/digital-2025-global-overview-report; Data Reportal.</w:t>
       </w:r>
     </w:p>
-    <w:bookmarkEnd w:id="51"/>
-    <w:bookmarkStart w:id="53" w:name="ref-legaspiSyntheticAgencySense2019"/>
+    <w:bookmarkEnd w:id="55"/>
+    <w:bookmarkStart w:id="57" w:name="ref-legaspiSyntheticAgencySense2019"/>
     <w:p>
       <w:pPr>
         <w:pStyle w:val="Bibliography"/>
@@ -1793,7 +2048,7 @@
       <w:r>
         <w:t xml:space="preserve"> </w:t>
       </w:r>
-      <w:hyperlink r:id="rId52">
+      <w:hyperlink r:id="rId56">
         <w:r>
           <w:rPr>
             <w:rStyle w:val="Hyperlink"/>
@@ -1805,8 +2060,8 @@
         <w:t xml:space="preserve">.</w:t>
       </w:r>
     </w:p>
-    <w:bookmarkEnd w:id="53"/>
-    <w:bookmarkStart w:id="54" w:name="ref-mathurTechnologyFreedom"/>
+    <w:bookmarkEnd w:id="57"/>
+    <w:bookmarkStart w:id="58" w:name="ref-mathurTechnologyFreedom"/>
     <w:p>
       <w:pPr>
         <w:pStyle w:val="Bibliography"/>
@@ -1830,8 +2085,8 @@
         <w:t xml:space="preserve">.”</w:t>
       </w:r>
     </w:p>
-    <w:bookmarkEnd w:id="54"/>
-    <w:bookmarkStart w:id="56" w:name="ref-morrowWhenTechnologiesMakes2014"/>
+    <w:bookmarkEnd w:id="58"/>
+    <w:bookmarkStart w:id="60" w:name="ref-morrowWhenTechnologiesMakes2014"/>
     <w:p>
       <w:pPr>
         <w:pStyle w:val="Bibliography"/>
@@ -1906,7 +2161,7 @@
       <w:r>
         <w:t xml:space="preserve"> </w:t>
       </w:r>
-      <w:hyperlink r:id="rId55">
+      <w:hyperlink r:id="rId59">
         <w:r>
           <w:rPr>
             <w:rStyle w:val="Hyperlink"/>
@@ -1918,8 +2173,8 @@
         <w:t xml:space="preserve">.</w:t>
       </w:r>
     </w:p>
-    <w:bookmarkEnd w:id="56"/>
-    <w:bookmarkStart w:id="58" w:name="ref-moutaWhereAgencyMoving2025"/>
+    <w:bookmarkEnd w:id="60"/>
+    <w:bookmarkStart w:id="62" w:name="ref-moutaWhereAgencyMoving2025"/>
     <w:p>
       <w:pPr>
         <w:pStyle w:val="Bibliography"/>
@@ -2036,7 +2291,7 @@
       <w:r>
         <w:t xml:space="preserve"> </w:t>
       </w:r>
-      <w:hyperlink r:id="rId57">
+      <w:hyperlink r:id="rId61">
         <w:r>
           <w:rPr>
             <w:rStyle w:val="Hyperlink"/>
@@ -2048,8 +2303,8 @@
         <w:t xml:space="preserve">.</w:t>
       </w:r>
     </w:p>
-    <w:bookmarkEnd w:id="58"/>
-    <w:bookmarkStart w:id="59" w:name="ref-pewFutureHuman2023"/>
+    <w:bookmarkEnd w:id="62"/>
+    <w:bookmarkStart w:id="63" w:name="ref-pewFutureHuman2023"/>
     <w:p>
       <w:pPr>
         <w:pStyle w:val="Bibliography"/>
@@ -2091,8 +2346,8 @@
         <w:t xml:space="preserve">February.</w:t>
       </w:r>
     </w:p>
-    <w:bookmarkEnd w:id="59"/>
-    <w:bookmarkStart w:id="61" w:name="ref-pinskiAILiteracyUsers2024"/>
+    <w:bookmarkEnd w:id="63"/>
+    <w:bookmarkStart w:id="65" w:name="ref-pinskiAILiteracyUsers2024"/>
     <w:p>
       <w:pPr>
         <w:pStyle w:val="Bibliography"/>
@@ -2146,7 +2401,7 @@
       <w:r>
         <w:t xml:space="preserve"> </w:t>
       </w:r>
-      <w:hyperlink r:id="rId60">
+      <w:hyperlink r:id="rId64">
         <w:r>
           <w:rPr>
             <w:rStyle w:val="Hyperlink"/>
@@ -2158,8 +2413,8 @@
         <w:t xml:space="preserve">.</w:t>
       </w:r>
     </w:p>
-    <w:bookmarkEnd w:id="61"/>
-    <w:bookmarkStart w:id="62" w:name="ref-Pippin_2008"/>
+    <w:bookmarkEnd w:id="65"/>
+    <w:bookmarkStart w:id="66" w:name="ref-Pippin_2008"/>
     <w:p>
       <w:pPr>
         <w:pStyle w:val="Bibliography"/>
@@ -2221,8 +2476,8 @@
         <w:t xml:space="preserve">, 239–72. Cambridge: Cambridge University Press.</w:t>
       </w:r>
     </w:p>
-    <w:bookmarkEnd w:id="62"/>
-    <w:bookmarkStart w:id="64" w:name="ref-poncerojoDigitalNativesAI2025"/>
+    <w:bookmarkEnd w:id="66"/>
+    <w:bookmarkStart w:id="68" w:name="ref-poncerojoDigitalNativesAI2025"/>
     <w:p>
       <w:pPr>
         <w:pStyle w:val="Bibliography"/>
@@ -2321,7 +2576,7 @@
       <w:r>
         <w:t xml:space="preserve"> </w:t>
       </w:r>
-      <w:hyperlink r:id="rId63">
+      <w:hyperlink r:id="rId67">
         <w:r>
           <w:rPr>
             <w:rStyle w:val="Hyperlink"/>
@@ -2333,8 +2588,8 @@
         <w:t xml:space="preserve">.</w:t>
       </w:r>
     </w:p>
-    <w:bookmarkEnd w:id="64"/>
-    <w:bookmarkStart w:id="65" w:name="ref-PradosdelaEscosura_2022"/>
+    <w:bookmarkEnd w:id="68"/>
+    <w:bookmarkStart w:id="69" w:name="ref-PradosdelaEscosura_2022"/>
     <w:p>
       <w:pPr>
         <w:pStyle w:val="Bibliography"/>
@@ -2356,8 +2611,8 @@
         <w:t xml:space="preserve">. New Approaches to Economic and Social History. Cambridge: Cambridge University Press.</w:t>
       </w:r>
     </w:p>
-    <w:bookmarkEnd w:id="65"/>
-    <w:bookmarkStart w:id="67" w:name="Xa078f9945c7a1cf901e6fb808b094b6ffe71948"/>
+    <w:bookmarkEnd w:id="69"/>
+    <w:bookmarkStart w:id="71" w:name="Xa078f9945c7a1cf901e6fb808b094b6ffe71948"/>
     <w:p>
       <w:pPr>
         <w:pStyle w:val="Bibliography"/>
@@ -2434,7 +2689,7 @@
       <w:r>
         <w:t xml:space="preserve"> </w:t>
       </w:r>
-      <w:hyperlink r:id="rId66">
+      <w:hyperlink r:id="rId70">
         <w:r>
           <w:rPr>
             <w:rStyle w:val="Hyperlink"/>
@@ -2446,8 +2701,8 @@
         <w:t xml:space="preserve">.</w:t>
       </w:r>
     </w:p>
-    <w:bookmarkEnd w:id="67"/>
-    <w:bookmarkStart w:id="68" w:name="ref-senDevelopmentFreedom1999"/>
+    <w:bookmarkEnd w:id="71"/>
+    <w:bookmarkStart w:id="72" w:name="ref-senDevelopmentFreedom1999"/>
     <w:p>
       <w:pPr>
         <w:pStyle w:val="Bibliography"/>
@@ -2483,13 +2738,551 @@
         <w:t xml:space="preserve">. Oxford University Press.</w:t>
       </w:r>
     </w:p>
-    <w:bookmarkEnd w:id="68"/>
-    <w:bookmarkStart w:id="69" w:name="ref-WorldPopulationProspects"/>
+    <w:bookmarkEnd w:id="72"/>
+    <w:bookmarkStart w:id="74" w:name="ref-silvennoinenStudentsUsageGenAI2025"/>
     <w:p>
       <w:pPr>
         <w:pStyle w:val="Bibliography"/>
       </w:pPr>
       <w:r>
+        <w:t xml:space="preserve">Silvennoinen, Minna, Satu Aksovaara, and Merja Alanko-Turunen. 2025.</w:t>
+      </w:r>
+      <w:r>
+        <w:t xml:space="preserve"> </w:t>
+      </w:r>
+      <w:r>
+        <w:t xml:space="preserve">“Students’</w:t>
+      </w:r>
+      <w:r>
+        <w:t xml:space="preserve"> </w:t>
+      </w:r>
+      <w:r>
+        <w:t xml:space="preserve">Usage</w:t>
+      </w:r>
+      <w:r>
+        <w:t xml:space="preserve"> </w:t>
+      </w:r>
+      <w:r>
+        <w:t xml:space="preserve">of</w:t>
+      </w:r>
+      <w:r>
+        <w:t xml:space="preserve"> </w:t>
+      </w:r>
+      <w:r>
+        <w:t xml:space="preserve">GenAI</w:t>
+      </w:r>
+      <w:r>
+        <w:t xml:space="preserve"> </w:t>
+      </w:r>
+      <w:r>
+        <w:t xml:space="preserve">in</w:t>
+      </w:r>
+      <w:r>
+        <w:t xml:space="preserve"> </w:t>
+      </w:r>
+      <w:r>
+        <w:t xml:space="preserve">Universities</w:t>
+      </w:r>
+      <w:r>
+        <w:t xml:space="preserve"> </w:t>
+      </w:r>
+      <w:r>
+        <w:t xml:space="preserve">of</w:t>
+      </w:r>
+      <w:r>
+        <w:t xml:space="preserve"> </w:t>
+      </w:r>
+      <w:r>
+        <w:t xml:space="preserve">Applied Sciences</w:t>
+      </w:r>
+      <w:r>
+        <w:t xml:space="preserve">:</w:t>
+      </w:r>
+      <w:r>
+        <w:t xml:space="preserve"> </w:t>
+      </w:r>
+      <w:r>
+        <w:t xml:space="preserve">Experiences</w:t>
+      </w:r>
+      <w:r>
+        <w:t xml:space="preserve"> </w:t>
+      </w:r>
+      <w:r>
+        <w:t xml:space="preserve">and</w:t>
+      </w:r>
+      <w:r>
+        <w:t xml:space="preserve"> </w:t>
+      </w:r>
+      <w:r>
+        <w:t xml:space="preserve">Development Needs</w:t>
+      </w:r>
+      <w:r>
+        <w:t xml:space="preserve"> </w:t>
+      </w:r>
+      <w:r>
+        <w:t xml:space="preserve">for</w:t>
+      </w:r>
+      <w:r>
+        <w:t xml:space="preserve"> </w:t>
+      </w:r>
+      <w:r>
+        <w:t xml:space="preserve">Guidance</w:t>
+      </w:r>
+      <w:r>
+        <w:t xml:space="preserve"> </w:t>
+      </w:r>
+      <w:r>
+        <w:t xml:space="preserve">and</w:t>
+      </w:r>
+      <w:r>
+        <w:t xml:space="preserve"> </w:t>
+      </w:r>
+      <w:r>
+        <w:t xml:space="preserve">Support</w:t>
+      </w:r>
+      <w:r>
+        <w:t xml:space="preserve">.”</w:t>
+      </w:r>
+      <w:r>
+        <w:t xml:space="preserve"> </w:t>
+      </w:r>
+      <w:r>
+        <w:t xml:space="preserve">In</w:t>
+      </w:r>
+      <w:r>
+        <w:t xml:space="preserve"> </w:t>
+      </w:r>
+      <w:r>
+        <w:rPr>
+          <w:i/>
+          <w:iCs/>
+        </w:rPr>
+        <w:t xml:space="preserve">38th</w:t>
+      </w:r>
+      <w:r>
+        <w:rPr>
+          <w:i/>
+          <w:iCs/>
+        </w:rPr>
+        <w:t xml:space="preserve"> </w:t>
+      </w:r>
+      <w:r>
+        <w:rPr>
+          <w:i/>
+          <w:iCs/>
+        </w:rPr>
+        <w:t xml:space="preserve">Bled eConference</w:t>
+      </w:r>
+      <w:r>
+        <w:rPr>
+          <w:i/>
+          <w:iCs/>
+        </w:rPr>
+        <w:t xml:space="preserve">:</w:t>
+      </w:r>
+      <w:r>
+        <w:rPr>
+          <w:i/>
+          <w:iCs/>
+        </w:rPr>
+        <w:t xml:space="preserve"> </w:t>
+      </w:r>
+      <w:r>
+        <w:rPr>
+          <w:i/>
+          <w:iCs/>
+        </w:rPr>
+        <w:t xml:space="preserve">Empowering Transformation</w:t>
+      </w:r>
+      <w:r>
+        <w:rPr>
+          <w:i/>
+          <w:iCs/>
+        </w:rPr>
+        <w:t xml:space="preserve">:</w:t>
+      </w:r>
+      <w:r>
+        <w:rPr>
+          <w:i/>
+          <w:iCs/>
+        </w:rPr>
+        <w:t xml:space="preserve"> </w:t>
+      </w:r>
+      <w:r>
+        <w:rPr>
+          <w:i/>
+          <w:iCs/>
+        </w:rPr>
+        <w:t xml:space="preserve">Shaping Digital Futures</w:t>
+      </w:r>
+      <w:r>
+        <w:rPr>
+          <w:i/>
+          <w:iCs/>
+        </w:rPr>
+        <w:t xml:space="preserve"> </w:t>
+      </w:r>
+      <w:r>
+        <w:rPr>
+          <w:i/>
+          <w:iCs/>
+        </w:rPr>
+        <w:t xml:space="preserve">for</w:t>
+      </w:r>
+      <w:r>
+        <w:rPr>
+          <w:i/>
+          <w:iCs/>
+        </w:rPr>
+        <w:t xml:space="preserve"> </w:t>
+      </w:r>
+      <w:r>
+        <w:rPr>
+          <w:i/>
+          <w:iCs/>
+        </w:rPr>
+        <w:t xml:space="preserve">All</w:t>
+      </w:r>
+      <w:r>
+        <w:rPr>
+          <w:i/>
+          <w:iCs/>
+        </w:rPr>
+        <w:t xml:space="preserve">:</w:t>
+      </w:r>
+      <w:r>
+        <w:rPr>
+          <w:i/>
+          <w:iCs/>
+        </w:rPr>
+        <w:t xml:space="preserve"> </w:t>
+      </w:r>
+      <w:r>
+        <w:rPr>
+          <w:i/>
+          <w:iCs/>
+        </w:rPr>
+        <w:t xml:space="preserve">Conference Proceedings</w:t>
+      </w:r>
+      <w:r>
+        <w:t xml:space="preserve">, 467–82. University of Maribor Press.</w:t>
+      </w:r>
+      <w:r>
+        <w:t xml:space="preserve"> </w:t>
+      </w:r>
+      <w:hyperlink r:id="rId73">
+        <w:r>
+          <w:rPr>
+            <w:rStyle w:val="Hyperlink"/>
+          </w:rPr>
+          <w:t xml:space="preserve">https://doi.org/10.18690/um.fov.4.2025.29</w:t>
+        </w:r>
+      </w:hyperlink>
+      <w:r>
+        <w:t xml:space="preserve">.</w:t>
+      </w:r>
+    </w:p>
+    <w:bookmarkEnd w:id="74"/>
+    <w:bookmarkStart w:id="76" w:name="Xb49160b6b427715e673f52809fd3577a1560369"/>
+    <w:p>
+      <w:pPr>
+        <w:pStyle w:val="Bibliography"/>
+      </w:pPr>
+      <w:r>
+        <w:t xml:space="preserve">Suonpää, Maija, Jutta Heikkilä, and Ana Dimkar. 2024.</w:t>
+      </w:r>
+      <w:r>
+        <w:t xml:space="preserve"> </w:t>
+      </w:r>
+      <w:r>
+        <w:t xml:space="preserve">“Students’</w:t>
+      </w:r>
+      <w:r>
+        <w:t xml:space="preserve"> </w:t>
+      </w:r>
+      <w:r>
+        <w:t xml:space="preserve">Perceptions Of Generative Ai Usage And Risks In A Finnish Higher Education Institution</w:t>
+      </w:r>
+      <w:r>
+        <w:t xml:space="preserve">.”</w:t>
+      </w:r>
+      <w:r>
+        <w:t xml:space="preserve"> </w:t>
+      </w:r>
+      <w:r>
+        <w:t xml:space="preserve">In</w:t>
+      </w:r>
+      <w:r>
+        <w:t xml:space="preserve"> </w:t>
+      </w:r>
+      <w:r>
+        <w:rPr>
+          <w:i/>
+          <w:iCs/>
+        </w:rPr>
+        <w:t xml:space="preserve">18th</w:t>
+      </w:r>
+      <w:r>
+        <w:rPr>
+          <w:i/>
+          <w:iCs/>
+        </w:rPr>
+        <w:t xml:space="preserve"> </w:t>
+      </w:r>
+      <w:r>
+        <w:rPr>
+          <w:i/>
+          <w:iCs/>
+        </w:rPr>
+        <w:t xml:space="preserve">International Technology</w:t>
+      </w:r>
+      <w:r>
+        <w:rPr>
+          <w:i/>
+          <w:iCs/>
+        </w:rPr>
+        <w:t xml:space="preserve">,</w:t>
+      </w:r>
+      <w:r>
+        <w:rPr>
+          <w:i/>
+          <w:iCs/>
+        </w:rPr>
+        <w:t xml:space="preserve"> </w:t>
+      </w:r>
+      <w:r>
+        <w:rPr>
+          <w:i/>
+          <w:iCs/>
+        </w:rPr>
+        <w:t xml:space="preserve">Education</w:t>
+      </w:r>
+      <w:r>
+        <w:rPr>
+          <w:i/>
+          <w:iCs/>
+        </w:rPr>
+        <w:t xml:space="preserve"> </w:t>
+      </w:r>
+      <w:r>
+        <w:rPr>
+          <w:i/>
+          <w:iCs/>
+        </w:rPr>
+        <w:t xml:space="preserve">and</w:t>
+      </w:r>
+      <w:r>
+        <w:rPr>
+          <w:i/>
+          <w:iCs/>
+        </w:rPr>
+        <w:t xml:space="preserve"> </w:t>
+      </w:r>
+      <w:r>
+        <w:rPr>
+          <w:i/>
+          <w:iCs/>
+        </w:rPr>
+        <w:t xml:space="preserve">Development Conference</w:t>
+      </w:r>
+      <w:r>
+        <w:t xml:space="preserve">, 3071–77. Valencia, Spain.</w:t>
+      </w:r>
+      <w:r>
+        <w:t xml:space="preserve"> </w:t>
+      </w:r>
+      <w:hyperlink r:id="rId75">
+        <w:r>
+          <w:rPr>
+            <w:rStyle w:val="Hyperlink"/>
+          </w:rPr>
+          <w:t xml:space="preserve">https://doi.org/10.21125/inted.2024.0825</w:t>
+        </w:r>
+      </w:hyperlink>
+      <w:r>
+        <w:t xml:space="preserve">.</w:t>
+      </w:r>
+    </w:p>
+    <w:bookmarkEnd w:id="76"/>
+    <w:bookmarkStart w:id="78" w:name="ref-surianoStudentInteractionChatGPT2025"/>
+    <w:p>
+      <w:pPr>
+        <w:pStyle w:val="Bibliography"/>
+      </w:pPr>
+      <w:r>
+        <w:t xml:space="preserve">Suriano, Rossella, Alessio Plebe, Alessandro Acciai, and Rosa Angela Fabio. 2025.</w:t>
+      </w:r>
+      <w:r>
+        <w:t xml:space="preserve"> </w:t>
+      </w:r>
+      <w:r>
+        <w:t xml:space="preserve">“Student Interaction with</w:t>
+      </w:r>
+      <w:r>
+        <w:t xml:space="preserve"> </w:t>
+      </w:r>
+      <w:r>
+        <w:t xml:space="preserve">ChatGPT</w:t>
+      </w:r>
+      <w:r>
+        <w:t xml:space="preserve"> </w:t>
+      </w:r>
+      <w:r>
+        <w:t xml:space="preserve">Can Promote Complex Critical Thinking Skills.”</w:t>
+      </w:r>
+      <w:r>
+        <w:t xml:space="preserve"> </w:t>
+      </w:r>
+      <w:r>
+        <w:rPr>
+          <w:i/>
+          <w:iCs/>
+        </w:rPr>
+        <w:t xml:space="preserve">Learning and Instruction</w:t>
+      </w:r>
+      <w:r>
+        <w:t xml:space="preserve"> </w:t>
+      </w:r>
+      <w:r>
+        <w:t xml:space="preserve">95 (February): 102011.</w:t>
+      </w:r>
+      <w:r>
+        <w:t xml:space="preserve"> </w:t>
+      </w:r>
+      <w:hyperlink r:id="rId77">
+        <w:r>
+          <w:rPr>
+            <w:rStyle w:val="Hyperlink"/>
+          </w:rPr>
+          <w:t xml:space="preserve">https://doi.org/10.1016/j.learninstruc.2024.102011</w:t>
+        </w:r>
+      </w:hyperlink>
+      <w:r>
+        <w:t xml:space="preserve">.</w:t>
+      </w:r>
+    </w:p>
+    <w:bookmarkEnd w:id="78"/>
+    <w:bookmarkStart w:id="80" w:name="X9f31790f1dfe4114e532f4fc6242802d28adc49"/>
+    <w:p>
+      <w:pPr>
+        <w:pStyle w:val="Bibliography"/>
+      </w:pPr>
+      <w:r>
+        <w:t xml:space="preserve">Swanepoel, Danielle. 2021.</w:t>
+      </w:r>
+      <w:r>
+        <w:t xml:space="preserve"> </w:t>
+      </w:r>
+      <w:r>
+        <w:t xml:space="preserve">“Does</w:t>
+      </w:r>
+      <w:r>
+        <w:t xml:space="preserve"> </w:t>
+      </w:r>
+      <w:r>
+        <w:t xml:space="preserve">Artificial Intelligence Have Agency</w:t>
+      </w:r>
+      <w:r>
+        <w:t xml:space="preserve">?”</w:t>
+      </w:r>
+      <w:r>
+        <w:t xml:space="preserve"> In</w:t>
+      </w:r>
+      <w:r>
+        <w:t xml:space="preserve"> </w:t>
+      </w:r>
+      <w:r>
+        <w:rPr>
+          <w:i/>
+          <w:iCs/>
+        </w:rPr>
+        <w:t xml:space="preserve">The</w:t>
+      </w:r>
+      <w:r>
+        <w:rPr>
+          <w:i/>
+          <w:iCs/>
+        </w:rPr>
+        <w:t xml:space="preserve"> </w:t>
+      </w:r>
+      <w:r>
+        <w:rPr>
+          <w:i/>
+          <w:iCs/>
+        </w:rPr>
+        <w:t xml:space="preserve">Mind-Technology Problem</w:t>
+      </w:r>
+      <w:r>
+        <w:t xml:space="preserve">, edited by Robert W. Clowes, Klaus Gärtner, and Inês Hipólito, 18:83–104. Cham: Springer International Publishing.</w:t>
+      </w:r>
+      <w:r>
+        <w:t xml:space="preserve"> </w:t>
+      </w:r>
+      <w:hyperlink r:id="rId79">
+        <w:r>
+          <w:rPr>
+            <w:rStyle w:val="Hyperlink"/>
+          </w:rPr>
+          <w:t xml:space="preserve">https://doi.org/10.1007/978-3-030-72644-7_4</w:t>
+        </w:r>
+      </w:hyperlink>
+      <w:r>
+        <w:t xml:space="preserve">.</w:t>
+      </w:r>
+    </w:p>
+    <w:bookmarkEnd w:id="80"/>
+    <w:bookmarkStart w:id="82" w:name="ref-tapalsenseofagencyscale2017"/>
+    <w:p>
+      <w:pPr>
+        <w:pStyle w:val="Bibliography"/>
+      </w:pPr>
+      <w:r>
+        <w:t xml:space="preserve">Tapal, Adam, Ela Oren, and Baruch Eitam. 2017.</w:t>
+      </w:r>
+      <w:r>
+        <w:t xml:space="preserve"> </w:t>
+      </w:r>
+      <w:r>
+        <w:t xml:space="preserve">“The Sense of Agency Scale: A Measure of Consciously Perceived Control over One’s Mind, Body, and the Immediate Environment.”</w:t>
+      </w:r>
+      <w:r>
+        <w:t xml:space="preserve"> </w:t>
+      </w:r>
+      <w:r>
+        <w:rPr>
+          <w:i/>
+          <w:iCs/>
+        </w:rPr>
+        <w:t xml:space="preserve">Frontiers in Psychology</w:t>
+      </w:r>
+      <w:r>
+        <w:t xml:space="preserve"> </w:t>
+      </w:r>
+      <w:r>
+        <w:t xml:space="preserve">8 (September): 1552.</w:t>
+      </w:r>
+      <w:r>
+        <w:t xml:space="preserve"> </w:t>
+      </w:r>
+      <w:hyperlink r:id="rId81">
+        <w:r>
+          <w:rPr>
+            <w:rStyle w:val="Hyperlink"/>
+          </w:rPr>
+          <w:t xml:space="preserve">https://doi.org/10.3389/fpsyg.2017.01552</w:t>
+        </w:r>
+      </w:hyperlink>
+      <w:r>
+        <w:t xml:space="preserve">.</w:t>
+      </w:r>
+    </w:p>
+    <w:bookmarkEnd w:id="82"/>
+    <w:bookmarkStart w:id="83" w:name="ref-WorldPopulationProspects"/>
+    <w:p>
+      <w:pPr>
+        <w:pStyle w:val="Bibliography"/>
+      </w:pPr>
+      <w:r>
         <w:t xml:space="preserve">United Nations. 2024.</w:t>
       </w:r>
       <w:r>
@@ -2514,8 +3307,8 @@
         <w:t xml:space="preserve">https://population.un.org/wpp/graphs?loc=900&amp;type=Probabilistic%20Projections&amp;category=Population&amp;subcategory=Age%200-24; United Nations.</w:t>
       </w:r>
     </w:p>
-    <w:bookmarkEnd w:id="69"/>
-    <w:bookmarkStart w:id="71" w:name="ref-vossWhyWeDont2023"/>
+    <w:bookmarkEnd w:id="83"/>
+    <w:bookmarkStart w:id="85" w:name="ref-vossWhyWeDont2023"/>
     <w:p>
       <w:pPr>
         <w:pStyle w:val="Bibliography"/>
@@ -2556,7 +3349,7 @@
       <w:r>
         <w:t xml:space="preserve"> </w:t>
       </w:r>
-      <w:hyperlink r:id="rId70">
+      <w:hyperlink r:id="rId84">
         <w:r>
           <w:rPr>
             <w:rStyle w:val="Hyperlink"/>
@@ -2568,8 +3361,8 @@
         <w:t xml:space="preserve">.</w:t>
       </w:r>
     </w:p>
-    <w:bookmarkEnd w:id="71"/>
-    <w:bookmarkStart w:id="73" w:name="ref-winnerCultInnovationIts2018"/>
+    <w:bookmarkEnd w:id="85"/>
+    <w:bookmarkStart w:id="87" w:name="ref-winnerCultInnovationIts2018"/>
     <w:p>
       <w:pPr>
         <w:pStyle w:val="Bibliography"/>
@@ -2752,7 +3545,7 @@
       <w:r>
         <w:t xml:space="preserve"> </w:t>
       </w:r>
-      <w:hyperlink r:id="rId72">
+      <w:hyperlink r:id="rId86">
         <w:r>
           <w:rPr>
             <w:rStyle w:val="Hyperlink"/>
@@ -2764,9 +3557,9 @@
         <w:t xml:space="preserve">.</w:t>
       </w:r>
     </w:p>
-    <w:bookmarkEnd w:id="73"/>
-    <w:bookmarkEnd w:id="74"/>
-    <w:bookmarkEnd w:id="75"/>
+    <w:bookmarkEnd w:id="87"/>
+    <w:bookmarkEnd w:id="88"/>
+    <w:bookmarkEnd w:id="89"/>
     <w:sectPr>
       <w:footnotePr>
         <w:numRestart w:val="eachSect"/>

</xml_diff>